<commit_message>
Add tourism perspective to Nepal blueprint
Co-Authored-By: Claude Sonnet 5.5 <noreply@anthropic.com>
Claude-Session: https://claude.ai/code/session_0111sQgAXXkFSZgwaRVLyatu
</commit_message>
<xml_diff>
--- a/Starbucks_Nepal_Blueprint.docx
+++ b/Starbucks_Nepal_Blueprint.docx
@@ -15,7 +15,7 @@
           <w:sz w:val="40"/>
           <w:szCs w:val="40"/>
         </w:rPr>
-        <w:t xml:space="preserve">Blueprint v2: Starbucks Expansion into Nepal</w:t>
+        <w:t xml:space="preserve">Blueprint v3: Starbucks Expansion into Nepal (with tourism perspective)</w:t>
       </w:r>
     </w:p>
     <w:p>
@@ -316,6 +316,98 @@
                 <w:sz w:val="19"/>
                 <w:szCs w:val="19"/>
               </w:rPr>
+              <w:t xml:space="preserve">Demand logic</w:t>
+            </w:r>
+          </w:p>
+        </w:tc>
+        <w:tc>
+          <w:tcPr>
+            <w:tcW w:type="dxa" w:w="3500"/>
+            <w:tcBorders>
+              <w:top w:val="single" w:color="999999" w:sz="4"/>
+              <w:left w:val="single" w:color="999999" w:sz="4"/>
+              <w:bottom w:val="single" w:color="999999" w:sz="4"/>
+              <w:right w:val="single" w:color="999999" w:sz="4"/>
+            </w:tcBorders>
+            <w:tcMar>
+              <w:top w:type="dxa" w:w="60"/>
+              <w:left w:type="dxa" w:w="90"/>
+              <w:bottom w:type="dxa" w:w="60"/>
+              <w:right w:type="dxa" w:w="90"/>
+            </w:tcMar>
+          </w:tcPr>
+          <w:p>
+            <w:r>
+              <w:rPr>
+                <w:rFonts w:ascii="Calibri" w:cs="Calibri" w:eastAsia="Calibri" w:hAnsi="Calibri"/>
+                <w:b w:val="false"/>
+                <w:bCs w:val="false"/>
+                <w:sz w:val="19"/>
+                <w:szCs w:val="19"/>
+              </w:rPr>
+              <w:t xml:space="preserve">Young urban middle class</w:t>
+            </w:r>
+          </w:p>
+        </w:tc>
+        <w:tc>
+          <w:tcPr>
+            <w:tcW w:type="dxa" w:w="4138"/>
+            <w:tcBorders>
+              <w:top w:val="single" w:color="999999" w:sz="4"/>
+              <w:left w:val="single" w:color="999999" w:sz="4"/>
+              <w:bottom w:val="single" w:color="999999" w:sz="4"/>
+              <w:right w:val="single" w:color="999999" w:sz="4"/>
+            </w:tcBorders>
+            <w:tcMar>
+              <w:top w:type="dxa" w:w="60"/>
+              <w:left w:type="dxa" w:w="90"/>
+              <w:bottom w:type="dxa" w:w="60"/>
+              <w:right w:type="dxa" w:w="90"/>
+            </w:tcMar>
+          </w:tcPr>
+          <w:p>
+            <w:r>
+              <w:rPr>
+                <w:rFonts w:ascii="Calibri" w:cs="Calibri" w:eastAsia="Calibri" w:hAnsi="Calibri"/>
+                <w:b w:val="false"/>
+                <w:bCs w:val="false"/>
+                <w:sz w:val="19"/>
+                <w:szCs w:val="19"/>
+              </w:rPr>
+              <w:t xml:space="preserve">Dual demand base: inbound tourists plus remittance-supported urban households; tourism treated as its own perspective (Section 7)</w:t>
+            </w:r>
+          </w:p>
+        </w:tc>
+      </w:tr>
+      <w:tr>
+        <w:trPr>
+          <w:cantSplit/>
+        </w:trPr>
+        <w:tc>
+          <w:tcPr>
+            <w:tcW w:type="dxa" w:w="2000"/>
+            <w:tcBorders>
+              <w:top w:val="single" w:color="999999" w:sz="4"/>
+              <w:left w:val="single" w:color="999999" w:sz="4"/>
+              <w:bottom w:val="single" w:color="999999" w:sz="4"/>
+              <w:right w:val="single" w:color="999999" w:sz="4"/>
+            </w:tcBorders>
+            <w:tcMar>
+              <w:top w:type="dxa" w:w="60"/>
+              <w:left w:type="dxa" w:w="90"/>
+              <w:bottom w:type="dxa" w:w="60"/>
+              <w:right w:type="dxa" w:w="90"/>
+            </w:tcMar>
+          </w:tcPr>
+          <w:p>
+            <w:r>
+              <w:rPr>
+                <w:rFonts w:ascii="Calibri" w:cs="Calibri" w:eastAsia="Calibri" w:hAnsi="Calibri"/>
+                <w:b w:val="false"/>
+                <w:bCs w:val="false"/>
+                <w:sz w:val="19"/>
+                <w:szCs w:val="19"/>
+              </w:rPr>
               <w:t xml:space="preserve">Thesis type</w:t>
             </w:r>
           </w:p>
@@ -1852,7 +1944,7 @@
           <w:sz w:val="21"/>
           <w:szCs w:val="21"/>
         </w:rPr>
-        <w:t xml:space="preserve">Nepal is a weak volume market but a strong strategic option. Starbucks’ transferable advantages (sourcing standards, brand legitimacy) justify a staged, licence-led entry that begins as a buyer of Nepali coffee before becoming a seller, with explicit stage gates so that commitment grows only as institutional and demand uncertainty resolves.</w:t>
+        <w:t xml:space="preserve">Nepal is a weak volume market but a strong strategic option. Starbucks’ transferable advantages (sourcing standards, brand legitimacy) justify a staged, licence-led entry that begins as a buyer of Nepali coffee before becoming a seller, with explicit stage gates so that commitment grows only as institutional and demand uncertainty resolves. Demand rests on two pillars: inbound tourists (a familiar-brand niche) and remittance-supported urban households (a longer-term base).</w:t>
       </w:r>
     </w:p>
     <w:p>
@@ -2073,7 +2165,7 @@
                 <w:sz w:val="19"/>
                 <w:szCs w:val="19"/>
               </w:rPr>
-              <w:t xml:space="preserve">Income and affordability data (GNI per capita about $1,300; GDP per capita about $1,513); tourist and remittance-fed urban demand; coffee-origin story.</w:t>
+              <w:t xml:space="preserve">Income and affordability data (GNI per capita about $1,300; GDP per capita about $1,513); tourist demand (about 1.16m arrivals; average spend only about $33 a day); remittance-fed urban demand; coffee-origin story.</w:t>
             </w:r>
           </w:p>
         </w:tc>
@@ -2200,6 +2292,98 @@
                 <w:szCs w:val="19"/>
               </w:rPr>
               <w:t xml:space="preserve">C3</w:t>
+            </w:r>
+          </w:p>
+        </w:tc>
+        <w:tc>
+          <w:tcPr>
+            <w:tcW w:type="dxa" w:w="4100"/>
+            <w:tcBorders>
+              <w:top w:val="single" w:color="999999" w:sz="4"/>
+              <w:left w:val="single" w:color="999999" w:sz="4"/>
+              <w:bottom w:val="single" w:color="999999" w:sz="4"/>
+              <w:right w:val="single" w:color="999999" w:sz="4"/>
+            </w:tcBorders>
+            <w:tcMar>
+              <w:top w:type="dxa" w:w="60"/>
+              <w:left w:type="dxa" w:w="90"/>
+              <w:bottom w:type="dxa" w:w="60"/>
+              <w:right w:type="dxa" w:w="90"/>
+            </w:tcMar>
+          </w:tcPr>
+          <w:p>
+            <w:r>
+              <w:rPr>
+                <w:rFonts w:ascii="Calibri" w:cs="Calibri" w:eastAsia="Calibri" w:hAnsi="Calibri"/>
+                <w:b w:val="false"/>
+                <w:bCs w:val="false"/>
+                <w:sz w:val="19"/>
+                <w:szCs w:val="19"/>
+              </w:rPr>
+              <w:t xml:space="preserve">Tourist demand is real but thin and volatile: it supports a small number of destination stores, not a national roll-out.</w:t>
+            </w:r>
+          </w:p>
+        </w:tc>
+        <w:tc>
+          <w:tcPr>
+            <w:tcW w:type="dxa" w:w="4738"/>
+            <w:tcBorders>
+              <w:top w:val="single" w:color="999999" w:sz="4"/>
+              <w:left w:val="single" w:color="999999" w:sz="4"/>
+              <w:bottom w:val="single" w:color="999999" w:sz="4"/>
+              <w:right w:val="single" w:color="999999" w:sz="4"/>
+            </w:tcBorders>
+            <w:tcMar>
+              <w:top w:type="dxa" w:w="60"/>
+              <w:left w:type="dxa" w:w="90"/>
+              <w:bottom w:type="dxa" w:w="60"/>
+              <w:right w:type="dxa" w:w="90"/>
+            </w:tcMar>
+          </w:tcPr>
+          <w:p>
+            <w:r>
+              <w:rPr>
+                <w:rFonts w:ascii="Calibri" w:cs="Calibri" w:eastAsia="Calibri" w:hAnsi="Calibri"/>
+                <w:b w:val="false"/>
+                <w:bCs w:val="false"/>
+                <w:sz w:val="19"/>
+                <w:szCs w:val="19"/>
+              </w:rPr>
+              <w:t xml:space="preserve">Arrivals (1,158,459 in 2025), seasonality (September 2025 down 18.3%), short per-day spend, India-heavy source mix; test of the “familiar brand” assumption with evidence rather than assertion.</w:t>
+            </w:r>
+          </w:p>
+        </w:tc>
+      </w:tr>
+      <w:tr>
+        <w:trPr>
+          <w:cantSplit/>
+        </w:trPr>
+        <w:tc>
+          <w:tcPr>
+            <w:tcW w:type="dxa" w:w="800"/>
+            <w:tcBorders>
+              <w:top w:val="single" w:color="999999" w:sz="4"/>
+              <w:left w:val="single" w:color="999999" w:sz="4"/>
+              <w:bottom w:val="single" w:color="999999" w:sz="4"/>
+              <w:right w:val="single" w:color="999999" w:sz="4"/>
+            </w:tcBorders>
+            <w:tcMar>
+              <w:top w:type="dxa" w:w="60"/>
+              <w:left w:type="dxa" w:w="90"/>
+              <w:bottom w:type="dxa" w:w="60"/>
+              <w:right w:type="dxa" w:w="90"/>
+            </w:tcMar>
+          </w:tcPr>
+          <w:p>
+            <w:r>
+              <w:rPr>
+                <w:rFonts w:ascii="Calibri" w:cs="Calibri" w:eastAsia="Calibri" w:hAnsi="Calibri"/>
+                <w:b w:val="false"/>
+                <w:bCs w:val="false"/>
+                <w:sz w:val="19"/>
+                <w:szCs w:val="19"/>
+              </w:rPr>
+              <w:t xml:space="preserve">C4</w:t>
             </w:r>
           </w:p>
         </w:tc>
@@ -2552,6 +2736,69 @@
                 <w:szCs w:val="19"/>
               </w:rPr>
               <w:t xml:space="preserve">True; hence a short, conditional first phase and quality-audit rights. Licensing is also the only structure that fits a trading-heavy sector under FITTA (verify).</w:t>
+            </w:r>
+          </w:p>
+        </w:tc>
+      </w:tr>
+      <w:tr>
+        <w:trPr>
+          <w:cantSplit/>
+        </w:trPr>
+        <w:tc>
+          <w:tcPr>
+            <w:tcW w:type="dxa" w:w="3700"/>
+            <w:tcBorders>
+              <w:top w:val="single" w:color="999999" w:sz="4"/>
+              <w:left w:val="single" w:color="999999" w:sz="4"/>
+              <w:bottom w:val="single" w:color="999999" w:sz="4"/>
+              <w:right w:val="single" w:color="999999" w:sz="4"/>
+            </w:tcBorders>
+            <w:tcMar>
+              <w:top w:type="dxa" w:w="60"/>
+              <w:left w:type="dxa" w:w="90"/>
+              <w:bottom w:type="dxa" w:w="60"/>
+              <w:right w:type="dxa" w:w="90"/>
+            </w:tcMar>
+          </w:tcPr>
+          <w:p>
+            <w:r>
+              <w:rPr>
+                <w:rFonts w:ascii="Calibri" w:cs="Calibri" w:eastAsia="Calibri" w:hAnsi="Calibri"/>
+                <w:b w:val="false"/>
+                <w:bCs w:val="false"/>
+                <w:sz w:val="19"/>
+                <w:szCs w:val="19"/>
+              </w:rPr>
+              <w:t xml:space="preserve">Tourists want local cafes, not an international chain.</w:t>
+            </w:r>
+          </w:p>
+        </w:tc>
+        <w:tc>
+          <w:tcPr>
+            <w:tcW w:type="dxa" w:w="5938"/>
+            <w:tcBorders>
+              <w:top w:val="single" w:color="999999" w:sz="4"/>
+              <w:left w:val="single" w:color="999999" w:sz="4"/>
+              <w:bottom w:val="single" w:color="999999" w:sz="4"/>
+              <w:right w:val="single" w:color="999999" w:sz="4"/>
+            </w:tcBorders>
+            <w:tcMar>
+              <w:top w:type="dxa" w:w="60"/>
+              <w:left w:type="dxa" w:w="90"/>
+              <w:bottom w:type="dxa" w:w="60"/>
+              <w:right w:type="dxa" w:w="90"/>
+            </w:tcMar>
+          </w:tcPr>
+          <w:p>
+            <w:r>
+              <w:rPr>
+                <w:rFonts w:ascii="Calibri" w:cs="Calibri" w:eastAsia="Calibri" w:hAnsi="Calibri"/>
+                <w:b w:val="false"/>
+                <w:bCs w:val="false"/>
+                <w:sz w:val="19"/>
+                <w:szCs w:val="19"/>
+              </w:rPr>
+              <w:t xml:space="preserve">Fair; the claim is that a segment (first-time and short-stay visitors, long-haul visitors, airport and hotel-linked trade) values familiarity. Test it with segment evidence (Section 7) and keep the pilot to two stores.</w:t>
             </w:r>
           </w:p>
         </w:tc>
@@ -3333,6 +3580,98 @@
                 <w:sz w:val="19"/>
                 <w:szCs w:val="19"/>
               </w:rPr>
+              <w:t xml:space="preserve">Tourism lens: tourist “environmental bubble” (Cohen, 1972) and destination volatility (Butler, 1980)</w:t>
+            </w:r>
+          </w:p>
+        </w:tc>
+        <w:tc>
+          <w:tcPr>
+            <w:tcW w:type="dxa" w:w="3400"/>
+            <w:tcBorders>
+              <w:top w:val="single" w:color="999999" w:sz="4"/>
+              <w:left w:val="single" w:color="999999" w:sz="4"/>
+              <w:bottom w:val="single" w:color="999999" w:sz="4"/>
+              <w:right w:val="single" w:color="999999" w:sz="4"/>
+            </w:tcBorders>
+            <w:tcMar>
+              <w:top w:type="dxa" w:w="60"/>
+              <w:left w:type="dxa" w:w="90"/>
+              <w:bottom w:type="dxa" w:w="60"/>
+              <w:right w:type="dxa" w:w="90"/>
+            </w:tcMar>
+          </w:tcPr>
+          <w:p>
+            <w:r>
+              <w:rPr>
+                <w:rFonts w:ascii="Calibri" w:cs="Calibri" w:eastAsia="Calibri" w:hAnsi="Calibri"/>
+                <w:b w:val="false"/>
+                <w:bCs w:val="false"/>
+                <w:sz w:val="19"/>
+                <w:szCs w:val="19"/>
+              </w:rPr>
+              <w:t xml:space="preserve">Explain why some visitors seek familiar brands, and why tourist demand is cyclical.</w:t>
+            </w:r>
+          </w:p>
+        </w:tc>
+        <w:tc>
+          <w:tcPr>
+            <w:tcW w:type="dxa" w:w="4038"/>
+            <w:tcBorders>
+              <w:top w:val="single" w:color="999999" w:sz="4"/>
+              <w:left w:val="single" w:color="999999" w:sz="4"/>
+              <w:bottom w:val="single" w:color="999999" w:sz="4"/>
+              <w:right w:val="single" w:color="999999" w:sz="4"/>
+            </w:tcBorders>
+            <w:tcMar>
+              <w:top w:type="dxa" w:w="60"/>
+              <w:left w:type="dxa" w:w="90"/>
+              <w:bottom w:type="dxa" w:w="60"/>
+              <w:right w:type="dxa" w:w="90"/>
+            </w:tcMar>
+          </w:tcPr>
+          <w:p>
+            <w:r>
+              <w:rPr>
+                <w:rFonts w:ascii="Calibri" w:cs="Calibri" w:eastAsia="Calibri" w:hAnsi="Calibri"/>
+                <w:b w:val="false"/>
+                <w:bCs w:val="false"/>
+                <w:sz w:val="19"/>
+                <w:szCs w:val="19"/>
+              </w:rPr>
+              <w:t xml:space="preserve">Dated, general theories; tourists are not one segment; budget trekkers may avoid premium chains.</w:t>
+            </w:r>
+          </w:p>
+        </w:tc>
+      </w:tr>
+      <w:tr>
+        <w:trPr>
+          <w:cantSplit/>
+        </w:trPr>
+        <w:tc>
+          <w:tcPr>
+            <w:tcW w:type="dxa" w:w="2200"/>
+            <w:tcBorders>
+              <w:top w:val="single" w:color="999999" w:sz="4"/>
+              <w:left w:val="single" w:color="999999" w:sz="4"/>
+              <w:bottom w:val="single" w:color="999999" w:sz="4"/>
+              <w:right w:val="single" w:color="999999" w:sz="4"/>
+            </w:tcBorders>
+            <w:tcMar>
+              <w:top w:type="dxa" w:w="60"/>
+              <w:left w:type="dxa" w:w="90"/>
+              <w:bottom w:type="dxa" w:w="60"/>
+              <w:right w:type="dxa" w:w="90"/>
+            </w:tcMar>
+          </w:tcPr>
+          <w:p>
+            <w:r>
+              <w:rPr>
+                <w:rFonts w:ascii="Calibri" w:cs="Calibri" w:eastAsia="Calibri" w:hAnsi="Calibri"/>
+                <w:b w:val="false"/>
+                <w:bCs w:val="false"/>
+                <w:sz w:val="19"/>
+                <w:szCs w:val="19"/>
+              </w:rPr>
               <w:t xml:space="preserve">Dynamic capabilities (Teece et al., 1997)</w:t>
             </w:r>
           </w:p>
@@ -3727,7 +4066,7 @@
                 <w:sz w:val="19"/>
                 <w:szCs w:val="19"/>
               </w:rPr>
-              <w:t xml:space="preserve">1a 70 + 1b 160 + 1c 200</w:t>
+              <w:t xml:space="preserve">1a 60 + 1b 150 + 1c 220</w:t>
             </w:r>
           </w:p>
         </w:tc>
@@ -3819,7 +4158,7 @@
                 <w:sz w:val="19"/>
                 <w:szCs w:val="19"/>
               </w:rPr>
-              <w:t xml:space="preserve">2a 110 + 2b 90 + 2c 170 + 2d 60</w:t>
+              <w:t xml:space="preserve">2a 100 + 2b 110 + 2c 160 + 2d 60</w:t>
             </w:r>
           </w:p>
         </w:tc>
@@ -4115,7 +4454,7 @@
           <w:sz w:val="22"/>
           <w:szCs w:val="22"/>
         </w:rPr>
-        <w:t xml:space="preserve">1a. The strategic case: why this move (70 words)</w:t>
+        <w:t xml:space="preserve">1a. The strategic case: why this move (60 words)</w:t>
       </w:r>
     </w:p>
     <w:p>
@@ -4169,7 +4508,7 @@
           <w:sz w:val="21"/>
           <w:szCs w:val="21"/>
         </w:rPr>
-        <w:t xml:space="preserve">Critical move: concede that Nepal’s income level (GNI per capita about $1,300) limits revenue upside, so the benefit is optionality, origin credibility and tourist brand touchpoints, not market share.</w:t>
+        <w:t xml:space="preserve">Critical move: concede that Nepal’s income level (GNI per capita about $1,300) limits revenue upside, so the benefit is optionality, origin credibility and tourist brand touchpoints, not market share. Frame tourism as the first demand pillar, not as proof of market size.</w:t>
       </w:r>
     </w:p>
     <w:p>
@@ -4185,7 +4524,7 @@
           <w:sz w:val="22"/>
           <w:szCs w:val="22"/>
         </w:rPr>
-        <w:t xml:space="preserve">1b. Which advantages travel: RBV tested (160 words)</w:t>
+        <w:t xml:space="preserve">1b. Which advantages travel: RBV tested (150 words)</w:t>
       </w:r>
     </w:p>
     <w:p>
@@ -4273,7 +4612,7 @@
           <w:sz w:val="22"/>
           <w:szCs w:val="22"/>
         </w:rPr>
-        <w:t xml:space="preserve">1c. Why Nepal, and why this route: OLI plus institutions (200 words)</w:t>
+        <w:t xml:space="preserve">1c. Why Nepal, and why this route: OLI plus institutions (220 words)</w:t>
       </w:r>
     </w:p>
     <w:p>
@@ -4291,7 +4630,7 @@
           <w:sz w:val="21"/>
           <w:szCs w:val="21"/>
         </w:rPr>
-        <w:t xml:space="preserve">Location advantage re-read as resource-seeking plus niche market-seeking: Himalayan arabica origin (organic positioning, trademarked “Himalayan Specialty Nepal Coffee”) and about 1.16m tourists in 2025 (India the top source at about 25%).</w:t>
+        <w:t xml:space="preserve">Location advantage re-read as resource-seeking (Himalayan arabica, organic positioning, trademarked “Himalayan Specialty Nepal Coffee”) plus niche market-seeking through tourists: 1,158,459 arrivals in 2025, India the top source at about 25%, an average stay of 16.34 days, and about 5.25m international passengers through Kathmandu airport.</w:t>
       </w:r>
     </w:p>
     <w:p>
@@ -4309,7 +4648,7 @@
           <w:sz w:val="21"/>
           <w:szCs w:val="21"/>
         </w:rPr>
-        <w:t xml:space="preserve">Critical point: tourism is volatile (September 2025 arrivals fell 18.3% during the protests), so location advantages are not stable.</w:t>
+        <w:t xml:space="preserve">Tourism perspective (see Section 7): the tourist is a ready-made customer who already knows the brand, which reduces the liability of foreignness (Zaheer, 1995) and lowers marketing cost. Critical limits: average spend is only about $33 a day (down from $40.84), well below regional levels; arrivals are seasonal and volatile (September 2025 fell 18.3% during the protests); and Indian visitors, the largest group, already have access to Starbucks at home (verify).</w:t>
       </w:r>
     </w:p>
     <w:p>
@@ -4396,7 +4735,7 @@
           <w:sz w:val="22"/>
           <w:szCs w:val="22"/>
         </w:rPr>
-        <w:t xml:space="preserve">2a. Administrative distance: politics, law and governance (110 words)</w:t>
+        <w:t xml:space="preserve">2a. Administrative distance: politics, law and governance (100 words)</w:t>
       </w:r>
     </w:p>
     <w:p>
@@ -4484,7 +4823,7 @@
           <w:sz w:val="22"/>
           <w:szCs w:val="22"/>
         </w:rPr>
-        <w:t xml:space="preserve">2b. Economic and geographic distance (90 words)</w:t>
+        <w:t xml:space="preserve">2b. Economic and geographic distance (110 words)</w:t>
       </w:r>
     </w:p>
     <w:p>
@@ -4556,7 +4895,25 @@
           <w:sz w:val="21"/>
           <w:szCs w:val="21"/>
         </w:rPr>
-        <w:t xml:space="preserve">Geography: landlocked, with trade logistics tied to India (verify the exchange-rate peg and trade-share figures before citing).</w:t>
+        <w:t xml:space="preserve">Tourism as an economic exposure: foreign tourists spend about $33 a day, and foreign-exchange earnings from tourism rose 4.8% in 2025; protest-related shocks and global shocks hit this stream quickly. Tourism and remittances together make demand externally driven.</w:t>
+      </w:r>
+    </w:p>
+    <w:p>
+      <w:pPr>
+        <w:pStyle w:val="ListParagraph"/>
+        <w:numPr>
+          <w:ilvl w:val="0"/>
+          <w:numId w:val="2"/>
+        </w:numPr>
+        <w:spacing w:after="60"/>
+      </w:pPr>
+      <w:r>
+        <w:rPr>
+          <w:rFonts w:ascii="Calibri" w:cs="Calibri" w:eastAsia="Calibri" w:hAnsi="Calibri"/>
+          <w:sz w:val="21"/>
+          <w:szCs w:val="21"/>
+        </w:rPr>
+        <w:t xml:space="preserve">Geography: landlocked, with trade logistics tied to India (verify the exchange-rate peg and trade-share figures before citing). Tourist flows concentrate on Kathmandu, Pokhara, trekking corridors and Lumbini, which defines where a store can work.</w:t>
       </w:r>
     </w:p>
     <w:p>
@@ -4572,7 +4929,7 @@
           <w:sz w:val="22"/>
           <w:szCs w:val="22"/>
         </w:rPr>
-        <w:t xml:space="preserve">2c. Cultural distance: Hofstede by management function (170 words)</w:t>
+        <w:t xml:space="preserve">2c. Cultural distance: Hofstede by management function (160 words)</w:t>
       </w:r>
     </w:p>
     <w:tbl>
@@ -4869,7 +5226,7 @@
                 <w:sz w:val="19"/>
                 <w:szCs w:val="19"/>
               </w:rPr>
-              <w:t xml:space="preserve">Status and social display (verify); tea (chiya) culture and festival-linked gatherings (Dashain, Tihar): position as a social space and gifting occasion, not only a coffee seller. Evidence needed before claiming scores.</w:t>
+              <w:t xml:space="preserve">Status and social display (verify); tea (chiya) culture and festival-linked gatherings (Dashain, Tihar): position as a social space and gifting occasion. Two customers, two offers: tourists want familiarity and wifi; local customers want social space and local flavours. Evidence needed before claiming scores.</w:t>
             </w:r>
           </w:p>
         </w:tc>
@@ -5039,7 +5396,7 @@
           <w:sz w:val="21"/>
           <w:szCs w:val="21"/>
         </w:rPr>
-        <w:t xml:space="preserve">Opportunity: origin storytelling, specialty microlots (current exports go to Germany, Japan, Switzerland, South Korea, the UK and Australia), destination stores in Kathmandu and Pokhara.</w:t>
+        <w:t xml:space="preserve">Opportunity: origin storytelling for tourists (“drink the coffee where it is grown”), specialty microlots (current exports go to Germany, Japan, Switzerland, South Korea, the UK and Australia), destination stores in Kathmandu and Pokhara.</w:t>
       </w:r>
     </w:p>
     <w:p>
@@ -5075,7 +5432,7 @@
           <w:sz w:val="21"/>
           <w:szCs w:val="21"/>
         </w:rPr>
-        <w:t xml:space="preserve">Reverse learning: a small-farmer sourcing model for mountainous origins, and a licensing-plus-stage-gate playbook for other small LDC markets (Laos, Nepal). One sentence linking to dynamic capabilities (Teece et al., 1997).</w:t>
+        <w:t xml:space="preserve">Reverse learning: a small-farmer sourcing model for mountainous origins, a destination-store format for other tourist-dependent markets, and a licensing-plus-stage-gate playbook for small LDC markets (Laos, Nepal). One sentence linking to dynamic capabilities (Teece et al., 1997).</w:t>
       </w:r>
     </w:p>
     <w:p>
@@ -5181,7 +5538,1466 @@
           <w:sz w:val="30"/>
           <w:szCs w:val="30"/>
         </w:rPr>
-        <w:t xml:space="preserve">7. Visuals and appendices</w:t>
+        <w:t xml:space="preserve">7. Tourism perspective (new integrated pillar)</w:t>
+      </w:r>
+    </w:p>
+    <w:p>
+      <w:pPr>
+        <w:spacing w:after="100"/>
+      </w:pPr>
+      <w:r>
+        <w:rPr>
+          <w:rFonts w:ascii="Calibri" w:cs="Calibri" w:eastAsia="Calibri" w:hAnsi="Calibri"/>
+          <w:sz w:val="21"/>
+          <w:szCs w:val="21"/>
+        </w:rPr>
+        <w:t xml:space="preserve">Why it earns its place: foreign tourists are the demand segment most likely to know and seek the brand, they need no new brand education, and they concentrate in a few locations. But the evidence is mixed, so the report must treat tourism critically, not as proof of success.</w:t>
+      </w:r>
+    </w:p>
+    <w:p>
+      <w:pPr>
+        <w:pStyle w:val="Heading3"/>
+        <w:spacing w:after="80" w:before="140"/>
+      </w:pPr>
+      <w:r>
+        <w:rPr>
+          <w:rFonts w:ascii="Calibri" w:cs="Calibri" w:eastAsia="Calibri" w:hAnsi="Calibri"/>
+          <w:b/>
+          <w:bCs/>
+          <w:sz w:val="22"/>
+          <w:szCs w:val="22"/>
+        </w:rPr>
+        <w:t xml:space="preserve">Evidence available (all to be verified at source)</w:t>
+      </w:r>
+    </w:p>
+    <w:tbl>
+      <w:tblPr>
+        <w:tblW w:type="dxa" w:w="9638"/>
+        <w:tblBorders>
+          <w:top w:val="single" w:color="auto" w:sz="4"/>
+          <w:left w:val="single" w:color="auto" w:sz="4"/>
+          <w:bottom w:val="single" w:color="auto" w:sz="4"/>
+          <w:right w:val="single" w:color="auto" w:sz="4"/>
+          <w:insideH w:val="single" w:color="auto" w:sz="4"/>
+          <w:insideV w:val="single" w:color="auto" w:sz="4"/>
+        </w:tblBorders>
+      </w:tblPr>
+      <w:tblGrid>
+        <w:gridCol w:w="2700"/>
+        <w:gridCol w:w="3600"/>
+        <w:gridCol w:w="3338"/>
+      </w:tblGrid>
+      <w:tr>
+        <w:trPr>
+          <w:tblHeader/>
+        </w:trPr>
+        <w:tc>
+          <w:tcPr>
+            <w:tcW w:type="dxa" w:w="2700"/>
+            <w:tcBorders>
+              <w:top w:val="single" w:color="999999" w:sz="4"/>
+              <w:left w:val="single" w:color="999999" w:sz="4"/>
+              <w:bottom w:val="single" w:color="999999" w:sz="4"/>
+              <w:right w:val="single" w:color="999999" w:sz="4"/>
+            </w:tcBorders>
+            <w:shd w:fill="1F3864" w:color="auto" w:val="clear"/>
+            <w:tcMar>
+              <w:top w:type="dxa" w:w="60"/>
+              <w:left w:type="dxa" w:w="90"/>
+              <w:bottom w:type="dxa" w:w="60"/>
+              <w:right w:type="dxa" w:w="90"/>
+            </w:tcMar>
+          </w:tcPr>
+          <w:p>
+            <w:r>
+              <w:rPr>
+                <w:rFonts w:ascii="Calibri" w:cs="Calibri" w:eastAsia="Calibri" w:hAnsi="Calibri"/>
+                <w:b/>
+                <w:bCs/>
+                <w:color w:val="FFFFFF"/>
+                <w:sz w:val="19"/>
+                <w:szCs w:val="19"/>
+              </w:rPr>
+              <w:t xml:space="preserve">Fact</w:t>
+            </w:r>
+          </w:p>
+        </w:tc>
+        <w:tc>
+          <w:tcPr>
+            <w:tcW w:type="dxa" w:w="3600"/>
+            <w:tcBorders>
+              <w:top w:val="single" w:color="999999" w:sz="4"/>
+              <w:left w:val="single" w:color="999999" w:sz="4"/>
+              <w:bottom w:val="single" w:color="999999" w:sz="4"/>
+              <w:right w:val="single" w:color="999999" w:sz="4"/>
+            </w:tcBorders>
+            <w:shd w:fill="1F3864" w:color="auto" w:val="clear"/>
+            <w:tcMar>
+              <w:top w:type="dxa" w:w="60"/>
+              <w:left w:type="dxa" w:w="90"/>
+              <w:bottom w:type="dxa" w:w="60"/>
+              <w:right w:type="dxa" w:w="90"/>
+            </w:tcMar>
+          </w:tcPr>
+          <w:p>
+            <w:r>
+              <w:rPr>
+                <w:rFonts w:ascii="Calibri" w:cs="Calibri" w:eastAsia="Calibri" w:hAnsi="Calibri"/>
+                <w:b/>
+                <w:bCs/>
+                <w:color w:val="FFFFFF"/>
+                <w:sz w:val="19"/>
+                <w:szCs w:val="19"/>
+              </w:rPr>
+              <w:t xml:space="preserve">Finding</w:t>
+            </w:r>
+          </w:p>
+        </w:tc>
+        <w:tc>
+          <w:tcPr>
+            <w:tcW w:type="dxa" w:w="3338"/>
+            <w:tcBorders>
+              <w:top w:val="single" w:color="999999" w:sz="4"/>
+              <w:left w:val="single" w:color="999999" w:sz="4"/>
+              <w:bottom w:val="single" w:color="999999" w:sz="4"/>
+              <w:right w:val="single" w:color="999999" w:sz="4"/>
+            </w:tcBorders>
+            <w:shd w:fill="1F3864" w:color="auto" w:val="clear"/>
+            <w:tcMar>
+              <w:top w:type="dxa" w:w="60"/>
+              <w:left w:type="dxa" w:w="90"/>
+              <w:bottom w:type="dxa" w:w="60"/>
+              <w:right w:type="dxa" w:w="90"/>
+            </w:tcMar>
+          </w:tcPr>
+          <w:p>
+            <w:r>
+              <w:rPr>
+                <w:rFonts w:ascii="Calibri" w:cs="Calibri" w:eastAsia="Calibri" w:hAnsi="Calibri"/>
+                <w:b/>
+                <w:bCs/>
+                <w:color w:val="FFFFFF"/>
+                <w:sz w:val="19"/>
+                <w:szCs w:val="19"/>
+              </w:rPr>
+              <w:t xml:space="preserve">Use in the argument</w:t>
+            </w:r>
+          </w:p>
+        </w:tc>
+      </w:tr>
+      <w:tr>
+        <w:trPr>
+          <w:cantSplit/>
+        </w:trPr>
+        <w:tc>
+          <w:tcPr>
+            <w:tcW w:type="dxa" w:w="2700"/>
+            <w:tcBorders>
+              <w:top w:val="single" w:color="999999" w:sz="4"/>
+              <w:left w:val="single" w:color="999999" w:sz="4"/>
+              <w:bottom w:val="single" w:color="999999" w:sz="4"/>
+              <w:right w:val="single" w:color="999999" w:sz="4"/>
+            </w:tcBorders>
+            <w:tcMar>
+              <w:top w:type="dxa" w:w="60"/>
+              <w:left w:type="dxa" w:w="90"/>
+              <w:bottom w:type="dxa" w:w="60"/>
+              <w:right w:type="dxa" w:w="90"/>
+            </w:tcMar>
+          </w:tcPr>
+          <w:p>
+            <w:r>
+              <w:rPr>
+                <w:rFonts w:ascii="Calibri" w:cs="Calibri" w:eastAsia="Calibri" w:hAnsi="Calibri"/>
+                <w:b w:val="false"/>
+                <w:bCs w:val="false"/>
+                <w:sz w:val="19"/>
+                <w:szCs w:val="19"/>
+              </w:rPr>
+              <w:t xml:space="preserve">Arrivals 2025</w:t>
+            </w:r>
+          </w:p>
+        </w:tc>
+        <w:tc>
+          <w:tcPr>
+            <w:tcW w:type="dxa" w:w="3600"/>
+            <w:tcBorders>
+              <w:top w:val="single" w:color="999999" w:sz="4"/>
+              <w:left w:val="single" w:color="999999" w:sz="4"/>
+              <w:bottom w:val="single" w:color="999999" w:sz="4"/>
+              <w:right w:val="single" w:color="999999" w:sz="4"/>
+            </w:tcBorders>
+            <w:tcMar>
+              <w:top w:type="dxa" w:w="60"/>
+              <w:left w:type="dxa" w:w="90"/>
+              <w:bottom w:type="dxa" w:w="60"/>
+              <w:right w:type="dxa" w:w="90"/>
+            </w:tcMar>
+          </w:tcPr>
+          <w:p>
+            <w:r>
+              <w:rPr>
+                <w:rFonts w:ascii="Calibri" w:cs="Calibri" w:eastAsia="Calibri" w:hAnsi="Calibri"/>
+                <w:b w:val="false"/>
+                <w:bCs w:val="false"/>
+                <w:sz w:val="19"/>
+                <w:szCs w:val="19"/>
+              </w:rPr>
+              <w:t xml:space="preserve">1,158,459 foreign tourists (+1% on 2024; 96.8% of 2019 level of 1,197,191)</w:t>
+            </w:r>
+          </w:p>
+        </w:tc>
+        <w:tc>
+          <w:tcPr>
+            <w:tcW w:type="dxa" w:w="3338"/>
+            <w:tcBorders>
+              <w:top w:val="single" w:color="999999" w:sz="4"/>
+              <w:left w:val="single" w:color="999999" w:sz="4"/>
+              <w:bottom w:val="single" w:color="999999" w:sz="4"/>
+              <w:right w:val="single" w:color="999999" w:sz="4"/>
+            </w:tcBorders>
+            <w:tcMar>
+              <w:top w:type="dxa" w:w="60"/>
+              <w:left w:type="dxa" w:w="90"/>
+              <w:bottom w:type="dxa" w:w="60"/>
+              <w:right w:type="dxa" w:w="90"/>
+            </w:tcMar>
+          </w:tcPr>
+          <w:p>
+            <w:r>
+              <w:rPr>
+                <w:rFonts w:ascii="Calibri" w:cs="Calibri" w:eastAsia="Calibri" w:hAnsi="Calibri"/>
+                <w:b w:val="false"/>
+                <w:bCs w:val="false"/>
+                <w:sz w:val="19"/>
+                <w:szCs w:val="19"/>
+              </w:rPr>
+              <w:t xml:space="preserve">Scale of the tourist niche; recovery incomplete</w:t>
+            </w:r>
+          </w:p>
+        </w:tc>
+      </w:tr>
+      <w:tr>
+        <w:trPr>
+          <w:cantSplit/>
+        </w:trPr>
+        <w:tc>
+          <w:tcPr>
+            <w:tcW w:type="dxa" w:w="2700"/>
+            <w:tcBorders>
+              <w:top w:val="single" w:color="999999" w:sz="4"/>
+              <w:left w:val="single" w:color="999999" w:sz="4"/>
+              <w:bottom w:val="single" w:color="999999" w:sz="4"/>
+              <w:right w:val="single" w:color="999999" w:sz="4"/>
+            </w:tcBorders>
+            <w:tcMar>
+              <w:top w:type="dxa" w:w="60"/>
+              <w:left w:type="dxa" w:w="90"/>
+              <w:bottom w:type="dxa" w:w="60"/>
+              <w:right w:type="dxa" w:w="90"/>
+            </w:tcMar>
+          </w:tcPr>
+          <w:p>
+            <w:r>
+              <w:rPr>
+                <w:rFonts w:ascii="Calibri" w:cs="Calibri" w:eastAsia="Calibri" w:hAnsi="Calibri"/>
+                <w:b w:val="false"/>
+                <w:bCs w:val="false"/>
+                <w:sz w:val="19"/>
+                <w:szCs w:val="19"/>
+              </w:rPr>
+              <w:t xml:space="preserve">Source markets</w:t>
+            </w:r>
+          </w:p>
+        </w:tc>
+        <w:tc>
+          <w:tcPr>
+            <w:tcW w:type="dxa" w:w="3600"/>
+            <w:tcBorders>
+              <w:top w:val="single" w:color="999999" w:sz="4"/>
+              <w:left w:val="single" w:color="999999" w:sz="4"/>
+              <w:bottom w:val="single" w:color="999999" w:sz="4"/>
+              <w:right w:val="single" w:color="999999" w:sz="4"/>
+            </w:tcBorders>
+            <w:tcMar>
+              <w:top w:type="dxa" w:w="60"/>
+              <w:left w:type="dxa" w:w="90"/>
+              <w:bottom w:type="dxa" w:w="60"/>
+              <w:right w:type="dxa" w:w="90"/>
+            </w:tcMar>
+          </w:tcPr>
+          <w:p>
+            <w:r>
+              <w:rPr>
+                <w:rFonts w:ascii="Calibri" w:cs="Calibri" w:eastAsia="Calibri" w:hAnsi="Calibri"/>
+                <w:b w:val="false"/>
+                <w:bCs w:val="false"/>
+                <w:sz w:val="19"/>
+                <w:szCs w:val="19"/>
+              </w:rPr>
+              <w:t xml:space="preserve">India about 25.2% (292,438); US, China, UK, Bangladesh follow (rankings for 3rd to 5th conflict between sources)</w:t>
+            </w:r>
+          </w:p>
+        </w:tc>
+        <w:tc>
+          <w:tcPr>
+            <w:tcW w:type="dxa" w:w="3338"/>
+            <w:tcBorders>
+              <w:top w:val="single" w:color="999999" w:sz="4"/>
+              <w:left w:val="single" w:color="999999" w:sz="4"/>
+              <w:bottom w:val="single" w:color="999999" w:sz="4"/>
+              <w:right w:val="single" w:color="999999" w:sz="4"/>
+            </w:tcBorders>
+            <w:tcMar>
+              <w:top w:type="dxa" w:w="60"/>
+              <w:left w:type="dxa" w:w="90"/>
+              <w:bottom w:type="dxa" w:w="60"/>
+              <w:right w:type="dxa" w:w="90"/>
+            </w:tcMar>
+          </w:tcPr>
+          <w:p>
+            <w:r>
+              <w:rPr>
+                <w:rFonts w:ascii="Calibri" w:cs="Calibri" w:eastAsia="Calibri" w:hAnsi="Calibri"/>
+                <w:b w:val="false"/>
+                <w:bCs w:val="false"/>
+                <w:sz w:val="19"/>
+                <w:szCs w:val="19"/>
+              </w:rPr>
+              <w:t xml:space="preserve">Segment the visitors: long-haul visitors vs Indian visitors with Starbucks access at home</w:t>
+            </w:r>
+          </w:p>
+        </w:tc>
+      </w:tr>
+      <w:tr>
+        <w:trPr>
+          <w:cantSplit/>
+        </w:trPr>
+        <w:tc>
+          <w:tcPr>
+            <w:tcW w:type="dxa" w:w="2700"/>
+            <w:tcBorders>
+              <w:top w:val="single" w:color="999999" w:sz="4"/>
+              <w:left w:val="single" w:color="999999" w:sz="4"/>
+              <w:bottom w:val="single" w:color="999999" w:sz="4"/>
+              <w:right w:val="single" w:color="999999" w:sz="4"/>
+            </w:tcBorders>
+            <w:tcMar>
+              <w:top w:type="dxa" w:w="60"/>
+              <w:left w:type="dxa" w:w="90"/>
+              <w:bottom w:type="dxa" w:w="60"/>
+              <w:right w:type="dxa" w:w="90"/>
+            </w:tcMar>
+          </w:tcPr>
+          <w:p>
+            <w:r>
+              <w:rPr>
+                <w:rFonts w:ascii="Calibri" w:cs="Calibri" w:eastAsia="Calibri" w:hAnsi="Calibri"/>
+                <w:b w:val="false"/>
+                <w:bCs w:val="false"/>
+                <w:sz w:val="19"/>
+                <w:szCs w:val="19"/>
+              </w:rPr>
+              <w:t xml:space="preserve">Seasonality and shocks</w:t>
+            </w:r>
+          </w:p>
+        </w:tc>
+        <w:tc>
+          <w:tcPr>
+            <w:tcW w:type="dxa" w:w="3600"/>
+            <w:tcBorders>
+              <w:top w:val="single" w:color="999999" w:sz="4"/>
+              <w:left w:val="single" w:color="999999" w:sz="4"/>
+              <w:bottom w:val="single" w:color="999999" w:sz="4"/>
+              <w:right w:val="single" w:color="999999" w:sz="4"/>
+            </w:tcBorders>
+            <w:tcMar>
+              <w:top w:type="dxa" w:w="60"/>
+              <w:left w:type="dxa" w:w="90"/>
+              <w:bottom w:type="dxa" w:w="60"/>
+              <w:right w:type="dxa" w:w="90"/>
+            </w:tcMar>
+          </w:tcPr>
+          <w:p>
+            <w:r>
+              <w:rPr>
+                <w:rFonts w:ascii="Calibri" w:cs="Calibri" w:eastAsia="Calibri" w:hAnsi="Calibri"/>
+                <w:b w:val="false"/>
+                <w:bCs w:val="false"/>
+                <w:sz w:val="19"/>
+                <w:szCs w:val="19"/>
+              </w:rPr>
+              <w:t xml:space="preserve">October peak 128,443; September 2025 fell 18.3% (protests); Indian arrivals down 8%</w:t>
+            </w:r>
+          </w:p>
+        </w:tc>
+        <w:tc>
+          <w:tcPr>
+            <w:tcW w:type="dxa" w:w="3338"/>
+            <w:tcBorders>
+              <w:top w:val="single" w:color="999999" w:sz="4"/>
+              <w:left w:val="single" w:color="999999" w:sz="4"/>
+              <w:bottom w:val="single" w:color="999999" w:sz="4"/>
+              <w:right w:val="single" w:color="999999" w:sz="4"/>
+            </w:tcBorders>
+            <w:tcMar>
+              <w:top w:type="dxa" w:w="60"/>
+              <w:left w:type="dxa" w:w="90"/>
+              <w:bottom w:type="dxa" w:w="60"/>
+              <w:right w:type="dxa" w:w="90"/>
+            </w:tcMar>
+          </w:tcPr>
+          <w:p>
+            <w:r>
+              <w:rPr>
+                <w:rFonts w:ascii="Calibri" w:cs="Calibri" w:eastAsia="Calibri" w:hAnsi="Calibri"/>
+                <w:b w:val="false"/>
+                <w:bCs w:val="false"/>
+                <w:sz w:val="19"/>
+                <w:szCs w:val="19"/>
+              </w:rPr>
+              <w:t xml:space="preserve">Volatility: why phase 1 avoids retail commitment</w:t>
+            </w:r>
+          </w:p>
+        </w:tc>
+      </w:tr>
+      <w:tr>
+        <w:trPr>
+          <w:cantSplit/>
+        </w:trPr>
+        <w:tc>
+          <w:tcPr>
+            <w:tcW w:type="dxa" w:w="2700"/>
+            <w:tcBorders>
+              <w:top w:val="single" w:color="999999" w:sz="4"/>
+              <w:left w:val="single" w:color="999999" w:sz="4"/>
+              <w:bottom w:val="single" w:color="999999" w:sz="4"/>
+              <w:right w:val="single" w:color="999999" w:sz="4"/>
+            </w:tcBorders>
+            <w:tcMar>
+              <w:top w:type="dxa" w:w="60"/>
+              <w:left w:type="dxa" w:w="90"/>
+              <w:bottom w:type="dxa" w:w="60"/>
+              <w:right w:type="dxa" w:w="90"/>
+            </w:tcMar>
+          </w:tcPr>
+          <w:p>
+            <w:r>
+              <w:rPr>
+                <w:rFonts w:ascii="Calibri" w:cs="Calibri" w:eastAsia="Calibri" w:hAnsi="Calibri"/>
+                <w:b w:val="false"/>
+                <w:bCs w:val="false"/>
+                <w:sz w:val="19"/>
+                <w:szCs w:val="19"/>
+              </w:rPr>
+              <w:t xml:space="preserve">Length of stay</w:t>
+            </w:r>
+          </w:p>
+        </w:tc>
+        <w:tc>
+          <w:tcPr>
+            <w:tcW w:type="dxa" w:w="3600"/>
+            <w:tcBorders>
+              <w:top w:val="single" w:color="999999" w:sz="4"/>
+              <w:left w:val="single" w:color="999999" w:sz="4"/>
+              <w:bottom w:val="single" w:color="999999" w:sz="4"/>
+              <w:right w:val="single" w:color="999999" w:sz="4"/>
+            </w:tcBorders>
+            <w:tcMar>
+              <w:top w:type="dxa" w:w="60"/>
+              <w:left w:type="dxa" w:w="90"/>
+              <w:bottom w:type="dxa" w:w="60"/>
+              <w:right w:type="dxa" w:w="90"/>
+            </w:tcMar>
+          </w:tcPr>
+          <w:p>
+            <w:r>
+              <w:rPr>
+                <w:rFonts w:ascii="Calibri" w:cs="Calibri" w:eastAsia="Calibri" w:hAnsi="Calibri"/>
+                <w:b w:val="false"/>
+                <w:bCs w:val="false"/>
+                <w:sz w:val="19"/>
+                <w:szCs w:val="19"/>
+              </w:rPr>
+              <w:t xml:space="preserve">Record 16.34 days in 2025 (13.30 in 2024); data method changed in 2025</w:t>
+            </w:r>
+          </w:p>
+        </w:tc>
+        <w:tc>
+          <w:tcPr>
+            <w:tcW w:type="dxa" w:w="3338"/>
+            <w:tcBorders>
+              <w:top w:val="single" w:color="999999" w:sz="4"/>
+              <w:left w:val="single" w:color="999999" w:sz="4"/>
+              <w:bottom w:val="single" w:color="999999" w:sz="4"/>
+              <w:right w:val="single" w:color="999999" w:sz="4"/>
+            </w:tcBorders>
+            <w:tcMar>
+              <w:top w:type="dxa" w:w="60"/>
+              <w:left w:type="dxa" w:w="90"/>
+              <w:bottom w:type="dxa" w:w="60"/>
+              <w:right w:type="dxa" w:w="90"/>
+            </w:tcMar>
+          </w:tcPr>
+          <w:p>
+            <w:r>
+              <w:rPr>
+                <w:rFonts w:ascii="Calibri" w:cs="Calibri" w:eastAsia="Calibri" w:hAnsi="Calibri"/>
+                <w:b w:val="false"/>
+                <w:bCs w:val="false"/>
+                <w:sz w:val="19"/>
+                <w:szCs w:val="19"/>
+              </w:rPr>
+              <w:t xml:space="preserve">More café occasions per visitor; compare cautiously with earlier years</w:t>
+            </w:r>
+          </w:p>
+        </w:tc>
+      </w:tr>
+      <w:tr>
+        <w:trPr>
+          <w:cantSplit/>
+        </w:trPr>
+        <w:tc>
+          <w:tcPr>
+            <w:tcW w:type="dxa" w:w="2700"/>
+            <w:tcBorders>
+              <w:top w:val="single" w:color="999999" w:sz="4"/>
+              <w:left w:val="single" w:color="999999" w:sz="4"/>
+              <w:bottom w:val="single" w:color="999999" w:sz="4"/>
+              <w:right w:val="single" w:color="999999" w:sz="4"/>
+            </w:tcBorders>
+            <w:tcMar>
+              <w:top w:type="dxa" w:w="60"/>
+              <w:left w:type="dxa" w:w="90"/>
+              <w:bottom w:type="dxa" w:w="60"/>
+              <w:right w:type="dxa" w:w="90"/>
+            </w:tcMar>
+          </w:tcPr>
+          <w:p>
+            <w:r>
+              <w:rPr>
+                <w:rFonts w:ascii="Calibri" w:cs="Calibri" w:eastAsia="Calibri" w:hAnsi="Calibri"/>
+                <w:b w:val="false"/>
+                <w:bCs w:val="false"/>
+                <w:sz w:val="19"/>
+                <w:szCs w:val="19"/>
+              </w:rPr>
+              <w:t xml:space="preserve">Spend</w:t>
+            </w:r>
+          </w:p>
+        </w:tc>
+        <w:tc>
+          <w:tcPr>
+            <w:tcW w:type="dxa" w:w="3600"/>
+            <w:tcBorders>
+              <w:top w:val="single" w:color="999999" w:sz="4"/>
+              <w:left w:val="single" w:color="999999" w:sz="4"/>
+              <w:bottom w:val="single" w:color="999999" w:sz="4"/>
+              <w:right w:val="single" w:color="999999" w:sz="4"/>
+            </w:tcBorders>
+            <w:tcMar>
+              <w:top w:type="dxa" w:w="60"/>
+              <w:left w:type="dxa" w:w="90"/>
+              <w:bottom w:type="dxa" w:w="60"/>
+              <w:right w:type="dxa" w:w="90"/>
+            </w:tcMar>
+          </w:tcPr>
+          <w:p>
+            <w:r>
+              <w:rPr>
+                <w:rFonts w:ascii="Calibri" w:cs="Calibri" w:eastAsia="Calibri" w:hAnsi="Calibri"/>
+                <w:b w:val="false"/>
+                <w:bCs w:val="false"/>
+                <w:sz w:val="19"/>
+                <w:szCs w:val="19"/>
+              </w:rPr>
+              <w:t xml:space="preserve">About $33 a day in 2025 (from $40.84 in 2024); regional range cited at $100–150</w:t>
+            </w:r>
+          </w:p>
+        </w:tc>
+        <w:tc>
+          <w:tcPr>
+            <w:tcW w:type="dxa" w:w="3338"/>
+            <w:tcBorders>
+              <w:top w:val="single" w:color="999999" w:sz="4"/>
+              <w:left w:val="single" w:color="999999" w:sz="4"/>
+              <w:bottom w:val="single" w:color="999999" w:sz="4"/>
+              <w:right w:val="single" w:color="999999" w:sz="4"/>
+            </w:tcBorders>
+            <w:tcMar>
+              <w:top w:type="dxa" w:w="60"/>
+              <w:left w:type="dxa" w:w="90"/>
+              <w:bottom w:type="dxa" w:w="60"/>
+              <w:right w:type="dxa" w:w="90"/>
+            </w:tcMar>
+          </w:tcPr>
+          <w:p>
+            <w:r>
+              <w:rPr>
+                <w:rFonts w:ascii="Calibri" w:cs="Calibri" w:eastAsia="Calibri" w:hAnsi="Calibri"/>
+                <w:b w:val="false"/>
+                <w:bCs w:val="false"/>
+                <w:sz w:val="19"/>
+                <w:szCs w:val="19"/>
+              </w:rPr>
+              <w:t xml:space="preserve">The key critical point: long stays, low spend, so a premium price point reaches a narrow slice</w:t>
+            </w:r>
+          </w:p>
+        </w:tc>
+      </w:tr>
+      <w:tr>
+        <w:trPr>
+          <w:cantSplit/>
+        </w:trPr>
+        <w:tc>
+          <w:tcPr>
+            <w:tcW w:type="dxa" w:w="2700"/>
+            <w:tcBorders>
+              <w:top w:val="single" w:color="999999" w:sz="4"/>
+              <w:left w:val="single" w:color="999999" w:sz="4"/>
+              <w:bottom w:val="single" w:color="999999" w:sz="4"/>
+              <w:right w:val="single" w:color="999999" w:sz="4"/>
+            </w:tcBorders>
+            <w:tcMar>
+              <w:top w:type="dxa" w:w="60"/>
+              <w:left w:type="dxa" w:w="90"/>
+              <w:bottom w:type="dxa" w:w="60"/>
+              <w:right w:type="dxa" w:w="90"/>
+            </w:tcMar>
+          </w:tcPr>
+          <w:p>
+            <w:r>
+              <w:rPr>
+                <w:rFonts w:ascii="Calibri" w:cs="Calibri" w:eastAsia="Calibri" w:hAnsi="Calibri"/>
+                <w:b w:val="false"/>
+                <w:bCs w:val="false"/>
+                <w:sz w:val="19"/>
+                <w:szCs w:val="19"/>
+              </w:rPr>
+              <w:t xml:space="preserve">Air gateway</w:t>
+            </w:r>
+          </w:p>
+        </w:tc>
+        <w:tc>
+          <w:tcPr>
+            <w:tcW w:type="dxa" w:w="3600"/>
+            <w:tcBorders>
+              <w:top w:val="single" w:color="999999" w:sz="4"/>
+              <w:left w:val="single" w:color="999999" w:sz="4"/>
+              <w:bottom w:val="single" w:color="999999" w:sz="4"/>
+              <w:right w:val="single" w:color="999999" w:sz="4"/>
+            </w:tcBorders>
+            <w:tcMar>
+              <w:top w:type="dxa" w:w="60"/>
+              <w:left w:type="dxa" w:w="90"/>
+              <w:bottom w:type="dxa" w:w="60"/>
+              <w:right w:type="dxa" w:w="90"/>
+            </w:tcMar>
+          </w:tcPr>
+          <w:p>
+            <w:r>
+              <w:rPr>
+                <w:rFonts w:ascii="Calibri" w:cs="Calibri" w:eastAsia="Calibri" w:hAnsi="Calibri"/>
+                <w:b w:val="false"/>
+                <w:bCs w:val="false"/>
+                <w:sz w:val="19"/>
+                <w:szCs w:val="19"/>
+              </w:rPr>
+              <w:t xml:space="preserve">Kathmandu airport about 5.25m international and 4.53m domestic passengers in 2025</w:t>
+            </w:r>
+          </w:p>
+        </w:tc>
+        <w:tc>
+          <w:tcPr>
+            <w:tcW w:type="dxa" w:w="3338"/>
+            <w:tcBorders>
+              <w:top w:val="single" w:color="999999" w:sz="4"/>
+              <w:left w:val="single" w:color="999999" w:sz="4"/>
+              <w:bottom w:val="single" w:color="999999" w:sz="4"/>
+              <w:right w:val="single" w:color="999999" w:sz="4"/>
+            </w:tcBorders>
+            <w:tcMar>
+              <w:top w:type="dxa" w:w="60"/>
+              <w:left w:type="dxa" w:w="90"/>
+              <w:bottom w:type="dxa" w:w="60"/>
+              <w:right w:type="dxa" w:w="90"/>
+            </w:tcMar>
+          </w:tcPr>
+          <w:p>
+            <w:r>
+              <w:rPr>
+                <w:rFonts w:ascii="Calibri" w:cs="Calibri" w:eastAsia="Calibri" w:hAnsi="Calibri"/>
+                <w:b w:val="false"/>
+                <w:bCs w:val="false"/>
+                <w:sz w:val="19"/>
+                <w:szCs w:val="19"/>
+              </w:rPr>
+              <w:t xml:space="preserve">Airport and arrivals-hall format is a candidate site; mixes tourists, returning workers and students</w:t>
+            </w:r>
+          </w:p>
+        </w:tc>
+      </w:tr>
+    </w:tbl>
+    <w:p>
+      <w:pPr>
+        <w:spacing w:after="80"/>
+      </w:pPr>
+    </w:p>
+    <w:p>
+      <w:pPr>
+        <w:pStyle w:val="Heading3"/>
+        <w:spacing w:after="80" w:before="140"/>
+      </w:pPr>
+      <w:r>
+        <w:rPr>
+          <w:rFonts w:ascii="Calibri" w:cs="Calibri" w:eastAsia="Calibri" w:hAnsi="Calibri"/>
+          <w:b/>
+          <w:bCs/>
+          <w:sz w:val="22"/>
+          <w:szCs w:val="22"/>
+        </w:rPr>
+        <w:t xml:space="preserve">Tourist segments and what Starbucks should do about each (hypotheses to test)</w:t>
+      </w:r>
+    </w:p>
+    <w:tbl>
+      <w:tblPr>
+        <w:tblW w:type="dxa" w:w="9638"/>
+        <w:tblBorders>
+          <w:top w:val="single" w:color="auto" w:sz="4"/>
+          <w:left w:val="single" w:color="auto" w:sz="4"/>
+          <w:bottom w:val="single" w:color="auto" w:sz="4"/>
+          <w:right w:val="single" w:color="auto" w:sz="4"/>
+          <w:insideH w:val="single" w:color="auto" w:sz="4"/>
+          <w:insideV w:val="single" w:color="auto" w:sz="4"/>
+        </w:tblBorders>
+      </w:tblPr>
+      <w:tblGrid>
+        <w:gridCol w:w="2200"/>
+        <w:gridCol w:w="3600"/>
+        <w:gridCol w:w="3838"/>
+      </w:tblGrid>
+      <w:tr>
+        <w:trPr>
+          <w:tblHeader/>
+        </w:trPr>
+        <w:tc>
+          <w:tcPr>
+            <w:tcW w:type="dxa" w:w="2200"/>
+            <w:tcBorders>
+              <w:top w:val="single" w:color="999999" w:sz="4"/>
+              <w:left w:val="single" w:color="999999" w:sz="4"/>
+              <w:bottom w:val="single" w:color="999999" w:sz="4"/>
+              <w:right w:val="single" w:color="999999" w:sz="4"/>
+            </w:tcBorders>
+            <w:shd w:fill="1F3864" w:color="auto" w:val="clear"/>
+            <w:tcMar>
+              <w:top w:type="dxa" w:w="60"/>
+              <w:left w:type="dxa" w:w="90"/>
+              <w:bottom w:type="dxa" w:w="60"/>
+              <w:right w:type="dxa" w:w="90"/>
+            </w:tcMar>
+          </w:tcPr>
+          <w:p>
+            <w:r>
+              <w:rPr>
+                <w:rFonts w:ascii="Calibri" w:cs="Calibri" w:eastAsia="Calibri" w:hAnsi="Calibri"/>
+                <w:b/>
+                <w:bCs/>
+                <w:color w:val="FFFFFF"/>
+                <w:sz w:val="19"/>
+                <w:szCs w:val="19"/>
+              </w:rPr>
+              <w:t xml:space="preserve">Segment</w:t>
+            </w:r>
+          </w:p>
+        </w:tc>
+        <w:tc>
+          <w:tcPr>
+            <w:tcW w:type="dxa" w:w="3600"/>
+            <w:tcBorders>
+              <w:top w:val="single" w:color="999999" w:sz="4"/>
+              <w:left w:val="single" w:color="999999" w:sz="4"/>
+              <w:bottom w:val="single" w:color="999999" w:sz="4"/>
+              <w:right w:val="single" w:color="999999" w:sz="4"/>
+            </w:tcBorders>
+            <w:shd w:fill="1F3864" w:color="auto" w:val="clear"/>
+            <w:tcMar>
+              <w:top w:type="dxa" w:w="60"/>
+              <w:left w:type="dxa" w:w="90"/>
+              <w:bottom w:type="dxa" w:w="60"/>
+              <w:right w:type="dxa" w:w="90"/>
+            </w:tcMar>
+          </w:tcPr>
+          <w:p>
+            <w:r>
+              <w:rPr>
+                <w:rFonts w:ascii="Calibri" w:cs="Calibri" w:eastAsia="Calibri" w:hAnsi="Calibri"/>
+                <w:b/>
+                <w:bCs/>
+                <w:color w:val="FFFFFF"/>
+                <w:sz w:val="19"/>
+                <w:szCs w:val="19"/>
+              </w:rPr>
+              <w:t xml:space="preserve">Likely behaviour (hypothesis, needs evidence)</w:t>
+            </w:r>
+          </w:p>
+        </w:tc>
+        <w:tc>
+          <w:tcPr>
+            <w:tcW w:type="dxa" w:w="3838"/>
+            <w:tcBorders>
+              <w:top w:val="single" w:color="999999" w:sz="4"/>
+              <w:left w:val="single" w:color="999999" w:sz="4"/>
+              <w:bottom w:val="single" w:color="999999" w:sz="4"/>
+              <w:right w:val="single" w:color="999999" w:sz="4"/>
+            </w:tcBorders>
+            <w:shd w:fill="1F3864" w:color="auto" w:val="clear"/>
+            <w:tcMar>
+              <w:top w:type="dxa" w:w="60"/>
+              <w:left w:type="dxa" w:w="90"/>
+              <w:bottom w:type="dxa" w:w="60"/>
+              <w:right w:type="dxa" w:w="90"/>
+            </w:tcMar>
+          </w:tcPr>
+          <w:p>
+            <w:r>
+              <w:rPr>
+                <w:rFonts w:ascii="Calibri" w:cs="Calibri" w:eastAsia="Calibri" w:hAnsi="Calibri"/>
+                <w:b/>
+                <w:bCs/>
+                <w:color w:val="FFFFFF"/>
+                <w:sz w:val="19"/>
+                <w:szCs w:val="19"/>
+              </w:rPr>
+              <w:t xml:space="preserve">Implication</w:t>
+            </w:r>
+          </w:p>
+        </w:tc>
+      </w:tr>
+      <w:tr>
+        <w:trPr>
+          <w:cantSplit/>
+        </w:trPr>
+        <w:tc>
+          <w:tcPr>
+            <w:tcW w:type="dxa" w:w="2200"/>
+            <w:tcBorders>
+              <w:top w:val="single" w:color="999999" w:sz="4"/>
+              <w:left w:val="single" w:color="999999" w:sz="4"/>
+              <w:bottom w:val="single" w:color="999999" w:sz="4"/>
+              <w:right w:val="single" w:color="999999" w:sz="4"/>
+            </w:tcBorders>
+            <w:tcMar>
+              <w:top w:type="dxa" w:w="60"/>
+              <w:left w:type="dxa" w:w="90"/>
+              <w:bottom w:type="dxa" w:w="60"/>
+              <w:right w:type="dxa" w:w="90"/>
+            </w:tcMar>
+          </w:tcPr>
+          <w:p>
+            <w:r>
+              <w:rPr>
+                <w:rFonts w:ascii="Calibri" w:cs="Calibri" w:eastAsia="Calibri" w:hAnsi="Calibri"/>
+                <w:b w:val="false"/>
+                <w:bCs w:val="false"/>
+                <w:sz w:val="19"/>
+                <w:szCs w:val="19"/>
+              </w:rPr>
+              <w:t xml:space="preserve">Long-haul leisure (US, UK, Europe)</w:t>
+            </w:r>
+          </w:p>
+        </w:tc>
+        <w:tc>
+          <w:tcPr>
+            <w:tcW w:type="dxa" w:w="3600"/>
+            <w:tcBorders>
+              <w:top w:val="single" w:color="999999" w:sz="4"/>
+              <w:left w:val="single" w:color="999999" w:sz="4"/>
+              <w:bottom w:val="single" w:color="999999" w:sz="4"/>
+              <w:right w:val="single" w:color="999999" w:sz="4"/>
+            </w:tcBorders>
+            <w:tcMar>
+              <w:top w:type="dxa" w:w="60"/>
+              <w:left w:type="dxa" w:w="90"/>
+              <w:bottom w:type="dxa" w:w="60"/>
+              <w:right w:type="dxa" w:w="90"/>
+            </w:tcMar>
+          </w:tcPr>
+          <w:p>
+            <w:r>
+              <w:rPr>
+                <w:rFonts w:ascii="Calibri" w:cs="Calibri" w:eastAsia="Calibri" w:hAnsi="Calibri"/>
+                <w:b w:val="false"/>
+                <w:bCs w:val="false"/>
+                <w:sz w:val="19"/>
+                <w:szCs w:val="19"/>
+              </w:rPr>
+              <w:t xml:space="preserve">Familiar-brand seekers after long travel; higher willingness to pay</w:t>
+            </w:r>
+          </w:p>
+        </w:tc>
+        <w:tc>
+          <w:tcPr>
+            <w:tcW w:type="dxa" w:w="3838"/>
+            <w:tcBorders>
+              <w:top w:val="single" w:color="999999" w:sz="4"/>
+              <w:left w:val="single" w:color="999999" w:sz="4"/>
+              <w:bottom w:val="single" w:color="999999" w:sz="4"/>
+              <w:right w:val="single" w:color="999999" w:sz="4"/>
+            </w:tcBorders>
+            <w:tcMar>
+              <w:top w:type="dxa" w:w="60"/>
+              <w:left w:type="dxa" w:w="90"/>
+              <w:bottom w:type="dxa" w:w="60"/>
+              <w:right w:type="dxa" w:w="90"/>
+            </w:tcMar>
+          </w:tcPr>
+          <w:p>
+            <w:r>
+              <w:rPr>
+                <w:rFonts w:ascii="Calibri" w:cs="Calibri" w:eastAsia="Calibri" w:hAnsi="Calibri"/>
+                <w:b w:val="false"/>
+                <w:bCs w:val="false"/>
+                <w:sz w:val="19"/>
+                <w:szCs w:val="19"/>
+              </w:rPr>
+              <w:t xml:space="preserve">Primary target; destination stores in Thamel/Kathmandu and Pokhara</w:t>
+            </w:r>
+          </w:p>
+        </w:tc>
+      </w:tr>
+      <w:tr>
+        <w:trPr>
+          <w:cantSplit/>
+        </w:trPr>
+        <w:tc>
+          <w:tcPr>
+            <w:tcW w:type="dxa" w:w="2200"/>
+            <w:tcBorders>
+              <w:top w:val="single" w:color="999999" w:sz="4"/>
+              <w:left w:val="single" w:color="999999" w:sz="4"/>
+              <w:bottom w:val="single" w:color="999999" w:sz="4"/>
+              <w:right w:val="single" w:color="999999" w:sz="4"/>
+            </w:tcBorders>
+            <w:tcMar>
+              <w:top w:type="dxa" w:w="60"/>
+              <w:left w:type="dxa" w:w="90"/>
+              <w:bottom w:type="dxa" w:w="60"/>
+              <w:right w:type="dxa" w:w="90"/>
+            </w:tcMar>
+          </w:tcPr>
+          <w:p>
+            <w:r>
+              <w:rPr>
+                <w:rFonts w:ascii="Calibri" w:cs="Calibri" w:eastAsia="Calibri" w:hAnsi="Calibri"/>
+                <w:b w:val="false"/>
+                <w:bCs w:val="false"/>
+                <w:sz w:val="19"/>
+                <w:szCs w:val="19"/>
+              </w:rPr>
+              <w:t xml:space="preserve">Indian visitors (largest group)</w:t>
+            </w:r>
+          </w:p>
+        </w:tc>
+        <w:tc>
+          <w:tcPr>
+            <w:tcW w:type="dxa" w:w="3600"/>
+            <w:tcBorders>
+              <w:top w:val="single" w:color="999999" w:sz="4"/>
+              <w:left w:val="single" w:color="999999" w:sz="4"/>
+              <w:bottom w:val="single" w:color="999999" w:sz="4"/>
+              <w:right w:val="single" w:color="999999" w:sz="4"/>
+            </w:tcBorders>
+            <w:tcMar>
+              <w:top w:type="dxa" w:w="60"/>
+              <w:left w:type="dxa" w:w="90"/>
+              <w:bottom w:type="dxa" w:w="60"/>
+              <w:right w:type="dxa" w:w="90"/>
+            </w:tcMar>
+          </w:tcPr>
+          <w:p>
+            <w:r>
+              <w:rPr>
+                <w:rFonts w:ascii="Calibri" w:cs="Calibri" w:eastAsia="Calibri" w:hAnsi="Calibri"/>
+                <w:b w:val="false"/>
+                <w:bCs w:val="false"/>
+                <w:sz w:val="19"/>
+                <w:szCs w:val="19"/>
+              </w:rPr>
+              <w:t xml:space="preserve">Already have access to Starbucks at home (verify); may prefer local or value options</w:t>
+            </w:r>
+          </w:p>
+        </w:tc>
+        <w:tc>
+          <w:tcPr>
+            <w:tcW w:type="dxa" w:w="3838"/>
+            <w:tcBorders>
+              <w:top w:val="single" w:color="999999" w:sz="4"/>
+              <w:left w:val="single" w:color="999999" w:sz="4"/>
+              <w:bottom w:val="single" w:color="999999" w:sz="4"/>
+              <w:right w:val="single" w:color="999999" w:sz="4"/>
+            </w:tcBorders>
+            <w:tcMar>
+              <w:top w:type="dxa" w:w="60"/>
+              <w:left w:type="dxa" w:w="90"/>
+              <w:bottom w:type="dxa" w:w="60"/>
+              <w:right w:type="dxa" w:w="90"/>
+            </w:tcMar>
+          </w:tcPr>
+          <w:p>
+            <w:r>
+              <w:rPr>
+                <w:rFonts w:ascii="Calibri" w:cs="Calibri" w:eastAsia="Calibri" w:hAnsi="Calibri"/>
+                <w:b w:val="false"/>
+                <w:bCs w:val="false"/>
+                <w:sz w:val="19"/>
+                <w:szCs w:val="19"/>
+              </w:rPr>
+              <w:t xml:space="preserve">Do not rely on this segment for premium demand</w:t>
+            </w:r>
+          </w:p>
+        </w:tc>
+      </w:tr>
+      <w:tr>
+        <w:trPr>
+          <w:cantSplit/>
+        </w:trPr>
+        <w:tc>
+          <w:tcPr>
+            <w:tcW w:type="dxa" w:w="2200"/>
+            <w:tcBorders>
+              <w:top w:val="single" w:color="999999" w:sz="4"/>
+              <w:left w:val="single" w:color="999999" w:sz="4"/>
+              <w:bottom w:val="single" w:color="999999" w:sz="4"/>
+              <w:right w:val="single" w:color="999999" w:sz="4"/>
+            </w:tcBorders>
+            <w:tcMar>
+              <w:top w:type="dxa" w:w="60"/>
+              <w:left w:type="dxa" w:w="90"/>
+              <w:bottom w:type="dxa" w:w="60"/>
+              <w:right w:type="dxa" w:w="90"/>
+            </w:tcMar>
+          </w:tcPr>
+          <w:p>
+            <w:r>
+              <w:rPr>
+                <w:rFonts w:ascii="Calibri" w:cs="Calibri" w:eastAsia="Calibri" w:hAnsi="Calibri"/>
+                <w:b w:val="false"/>
+                <w:bCs w:val="false"/>
+                <w:sz w:val="19"/>
+                <w:szCs w:val="19"/>
+              </w:rPr>
+              <w:t xml:space="preserve">Trekkers and budget travellers</w:t>
+            </w:r>
+          </w:p>
+        </w:tc>
+        <w:tc>
+          <w:tcPr>
+            <w:tcW w:type="dxa" w:w="3600"/>
+            <w:tcBorders>
+              <w:top w:val="single" w:color="999999" w:sz="4"/>
+              <w:left w:val="single" w:color="999999" w:sz="4"/>
+              <w:bottom w:val="single" w:color="999999" w:sz="4"/>
+              <w:right w:val="single" w:color="999999" w:sz="4"/>
+            </w:tcBorders>
+            <w:tcMar>
+              <w:top w:type="dxa" w:w="60"/>
+              <w:left w:type="dxa" w:w="90"/>
+              <w:bottom w:type="dxa" w:w="60"/>
+              <w:right w:type="dxa" w:w="90"/>
+            </w:tcMar>
+          </w:tcPr>
+          <w:p>
+            <w:r>
+              <w:rPr>
+                <w:rFonts w:ascii="Calibri" w:cs="Calibri" w:eastAsia="Calibri" w:hAnsi="Calibri"/>
+                <w:b w:val="false"/>
+                <w:bCs w:val="false"/>
+                <w:sz w:val="19"/>
+                <w:szCs w:val="19"/>
+              </w:rPr>
+              <w:t xml:space="preserve">Long stays, low daily spend; strong local-cafe culture</w:t>
+            </w:r>
+          </w:p>
+        </w:tc>
+        <w:tc>
+          <w:tcPr>
+            <w:tcW w:type="dxa" w:w="3838"/>
+            <w:tcBorders>
+              <w:top w:val="single" w:color="999999" w:sz="4"/>
+              <w:left w:val="single" w:color="999999" w:sz="4"/>
+              <w:bottom w:val="single" w:color="999999" w:sz="4"/>
+              <w:right w:val="single" w:color="999999" w:sz="4"/>
+            </w:tcBorders>
+            <w:tcMar>
+              <w:top w:type="dxa" w:w="60"/>
+              <w:left w:type="dxa" w:w="90"/>
+              <w:bottom w:type="dxa" w:w="60"/>
+              <w:right w:type="dxa" w:w="90"/>
+            </w:tcMar>
+          </w:tcPr>
+          <w:p>
+            <w:r>
+              <w:rPr>
+                <w:rFonts w:ascii="Calibri" w:cs="Calibri" w:eastAsia="Calibri" w:hAnsi="Calibri"/>
+                <w:b w:val="false"/>
+                <w:bCs w:val="false"/>
+                <w:sz w:val="19"/>
+                <w:szCs w:val="19"/>
+              </w:rPr>
+              <w:t xml:space="preserve">Weak target; use origin storytelling and low-price items only if at all</w:t>
+            </w:r>
+          </w:p>
+        </w:tc>
+      </w:tr>
+      <w:tr>
+        <w:trPr>
+          <w:cantSplit/>
+        </w:trPr>
+        <w:tc>
+          <w:tcPr>
+            <w:tcW w:type="dxa" w:w="2200"/>
+            <w:tcBorders>
+              <w:top w:val="single" w:color="999999" w:sz="4"/>
+              <w:left w:val="single" w:color="999999" w:sz="4"/>
+              <w:bottom w:val="single" w:color="999999" w:sz="4"/>
+              <w:right w:val="single" w:color="999999" w:sz="4"/>
+            </w:tcBorders>
+            <w:tcMar>
+              <w:top w:type="dxa" w:w="60"/>
+              <w:left w:type="dxa" w:w="90"/>
+              <w:bottom w:type="dxa" w:w="60"/>
+              <w:right w:type="dxa" w:w="90"/>
+            </w:tcMar>
+          </w:tcPr>
+          <w:p>
+            <w:r>
+              <w:rPr>
+                <w:rFonts w:ascii="Calibri" w:cs="Calibri" w:eastAsia="Calibri" w:hAnsi="Calibri"/>
+                <w:b w:val="false"/>
+                <w:bCs w:val="false"/>
+                <w:sz w:val="19"/>
+                <w:szCs w:val="19"/>
+              </w:rPr>
+              <w:t xml:space="preserve">Business, NGO and returning diaspora</w:t>
+            </w:r>
+          </w:p>
+        </w:tc>
+        <w:tc>
+          <w:tcPr>
+            <w:tcW w:type="dxa" w:w="3600"/>
+            <w:tcBorders>
+              <w:top w:val="single" w:color="999999" w:sz="4"/>
+              <w:left w:val="single" w:color="999999" w:sz="4"/>
+              <w:bottom w:val="single" w:color="999999" w:sz="4"/>
+              <w:right w:val="single" w:color="999999" w:sz="4"/>
+            </w:tcBorders>
+            <w:tcMar>
+              <w:top w:type="dxa" w:w="60"/>
+              <w:left w:type="dxa" w:w="90"/>
+              <w:bottom w:type="dxa" w:w="60"/>
+              <w:right w:type="dxa" w:w="90"/>
+            </w:tcMar>
+          </w:tcPr>
+          <w:p>
+            <w:r>
+              <w:rPr>
+                <w:rFonts w:ascii="Calibri" w:cs="Calibri" w:eastAsia="Calibri" w:hAnsi="Calibri"/>
+                <w:b w:val="false"/>
+                <w:bCs w:val="false"/>
+                <w:sz w:val="19"/>
+                <w:szCs w:val="19"/>
+              </w:rPr>
+              <w:t xml:space="preserve">Frequent, repeat, brand-aware</w:t>
+            </w:r>
+          </w:p>
+        </w:tc>
+        <w:tc>
+          <w:tcPr>
+            <w:tcW w:type="dxa" w:w="3838"/>
+            <w:tcBorders>
+              <w:top w:val="single" w:color="999999" w:sz="4"/>
+              <w:left w:val="single" w:color="999999" w:sz="4"/>
+              <w:bottom w:val="single" w:color="999999" w:sz="4"/>
+              <w:right w:val="single" w:color="999999" w:sz="4"/>
+            </w:tcBorders>
+            <w:tcMar>
+              <w:top w:type="dxa" w:w="60"/>
+              <w:left w:type="dxa" w:w="90"/>
+              <w:bottom w:type="dxa" w:w="60"/>
+              <w:right w:type="dxa" w:w="90"/>
+            </w:tcMar>
+          </w:tcPr>
+          <w:p>
+            <w:r>
+              <w:rPr>
+                <w:rFonts w:ascii="Calibri" w:cs="Calibri" w:eastAsia="Calibri" w:hAnsi="Calibri"/>
+                <w:b w:val="false"/>
+                <w:bCs w:val="false"/>
+                <w:sz w:val="19"/>
+                <w:szCs w:val="19"/>
+              </w:rPr>
+              <w:t xml:space="preserve">Airport, hotel and office-district sites; steadier than leisure tourists</w:t>
+            </w:r>
+          </w:p>
+        </w:tc>
+      </w:tr>
+      <w:tr>
+        <w:trPr>
+          <w:cantSplit/>
+        </w:trPr>
+        <w:tc>
+          <w:tcPr>
+            <w:tcW w:type="dxa" w:w="2200"/>
+            <w:tcBorders>
+              <w:top w:val="single" w:color="999999" w:sz="4"/>
+              <w:left w:val="single" w:color="999999" w:sz="4"/>
+              <w:bottom w:val="single" w:color="999999" w:sz="4"/>
+              <w:right w:val="single" w:color="999999" w:sz="4"/>
+            </w:tcBorders>
+            <w:tcMar>
+              <w:top w:type="dxa" w:w="60"/>
+              <w:left w:type="dxa" w:w="90"/>
+              <w:bottom w:type="dxa" w:w="60"/>
+              <w:right w:type="dxa" w:w="90"/>
+            </w:tcMar>
+          </w:tcPr>
+          <w:p>
+            <w:r>
+              <w:rPr>
+                <w:rFonts w:ascii="Calibri" w:cs="Calibri" w:eastAsia="Calibri" w:hAnsi="Calibri"/>
+                <w:b w:val="false"/>
+                <w:bCs w:val="false"/>
+                <w:sz w:val="19"/>
+                <w:szCs w:val="19"/>
+              </w:rPr>
+              <w:t xml:space="preserve">Pilgrims (Lumbini)</w:t>
+            </w:r>
+          </w:p>
+        </w:tc>
+        <w:tc>
+          <w:tcPr>
+            <w:tcW w:type="dxa" w:w="3600"/>
+            <w:tcBorders>
+              <w:top w:val="single" w:color="999999" w:sz="4"/>
+              <w:left w:val="single" w:color="999999" w:sz="4"/>
+              <w:bottom w:val="single" w:color="999999" w:sz="4"/>
+              <w:right w:val="single" w:color="999999" w:sz="4"/>
+            </w:tcBorders>
+            <w:tcMar>
+              <w:top w:type="dxa" w:w="60"/>
+              <w:left w:type="dxa" w:w="90"/>
+              <w:bottom w:type="dxa" w:w="60"/>
+              <w:right w:type="dxa" w:w="90"/>
+            </w:tcMar>
+          </w:tcPr>
+          <w:p>
+            <w:r>
+              <w:rPr>
+                <w:rFonts w:ascii="Calibri" w:cs="Calibri" w:eastAsia="Calibri" w:hAnsi="Calibri"/>
+                <w:b w:val="false"/>
+                <w:bCs w:val="false"/>
+                <w:sz w:val="19"/>
+                <w:szCs w:val="19"/>
+              </w:rPr>
+              <w:t xml:space="preserve">Group travel; limited evidence</w:t>
+            </w:r>
+          </w:p>
+        </w:tc>
+        <w:tc>
+          <w:tcPr>
+            <w:tcW w:type="dxa" w:w="3838"/>
+            <w:tcBorders>
+              <w:top w:val="single" w:color="999999" w:sz="4"/>
+              <w:left w:val="single" w:color="999999" w:sz="4"/>
+              <w:bottom w:val="single" w:color="999999" w:sz="4"/>
+              <w:right w:val="single" w:color="999999" w:sz="4"/>
+            </w:tcBorders>
+            <w:tcMar>
+              <w:top w:type="dxa" w:w="60"/>
+              <w:left w:type="dxa" w:w="90"/>
+              <w:bottom w:type="dxa" w:w="60"/>
+              <w:right w:type="dxa" w:w="90"/>
+            </w:tcMar>
+          </w:tcPr>
+          <w:p>
+            <w:r>
+              <w:rPr>
+                <w:rFonts w:ascii="Calibri" w:cs="Calibri" w:eastAsia="Calibri" w:hAnsi="Calibri"/>
+                <w:b w:val="false"/>
+                <w:bCs w:val="false"/>
+                <w:sz w:val="19"/>
+                <w:szCs w:val="19"/>
+              </w:rPr>
+              <w:t xml:space="preserve">Low priority; verify before including</w:t>
+            </w:r>
+          </w:p>
+        </w:tc>
+      </w:tr>
+    </w:tbl>
+    <w:p>
+      <w:pPr>
+        <w:spacing w:after="80"/>
+      </w:pPr>
+    </w:p>
+    <w:p>
+      <w:pPr>
+        <w:pStyle w:val="Heading3"/>
+        <w:spacing w:after="80" w:before="140"/>
+      </w:pPr>
+      <w:r>
+        <w:rPr>
+          <w:rFonts w:ascii="Calibri" w:cs="Calibri" w:eastAsia="Calibri" w:hAnsi="Calibri"/>
+          <w:b/>
+          <w:bCs/>
+          <w:sz w:val="22"/>
+          <w:szCs w:val="22"/>
+        </w:rPr>
+        <w:t xml:space="preserve">How to use tourism in each part of the report</w:t>
+      </w:r>
+    </w:p>
+    <w:p>
+      <w:pPr>
+        <w:pStyle w:val="ListParagraph"/>
+        <w:numPr>
+          <w:ilvl w:val="0"/>
+          <w:numId w:val="2"/>
+        </w:numPr>
+        <w:spacing w:after="60"/>
+      </w:pPr>
+      <w:r>
+        <w:rPr>
+          <w:rFonts w:ascii="Calibri" w:cs="Calibri" w:eastAsia="Calibri" w:hAnsi="Calibri"/>
+          <w:sz w:val="21"/>
+          <w:szCs w:val="21"/>
+        </w:rPr>
+        <w:t xml:space="preserve">AC1 1a: tourism as part of the strategic option value, not market size.</w:t>
+      </w:r>
+    </w:p>
+    <w:p>
+      <w:pPr>
+        <w:pStyle w:val="ListParagraph"/>
+        <w:numPr>
+          <w:ilvl w:val="0"/>
+          <w:numId w:val="2"/>
+        </w:numPr>
+        <w:spacing w:after="60"/>
+      </w:pPr>
+      <w:r>
+        <w:rPr>
+          <w:rFonts w:ascii="Calibri" w:cs="Calibri" w:eastAsia="Calibri" w:hAnsi="Calibri"/>
+          <w:sz w:val="21"/>
+          <w:szCs w:val="21"/>
+        </w:rPr>
+        <w:t xml:space="preserve">AC1 1c (OLI): tourists as a location advantage that lowers the liability of foreignness; limits: low spend, volatility, Indian-visitor overlap.</w:t>
+      </w:r>
+    </w:p>
+    <w:p>
+      <w:pPr>
+        <w:pStyle w:val="ListParagraph"/>
+        <w:numPr>
+          <w:ilvl w:val="0"/>
+          <w:numId w:val="2"/>
+        </w:numPr>
+        <w:spacing w:after="60"/>
+      </w:pPr>
+      <w:r>
+        <w:rPr>
+          <w:rFonts w:ascii="Calibri" w:cs="Calibri" w:eastAsia="Calibri" w:hAnsi="Calibri"/>
+          <w:sz w:val="21"/>
+          <w:szCs w:val="21"/>
+        </w:rPr>
+        <w:t xml:space="preserve">AC2 2b: tourism and remittances as external-demand exposures; cyclical risk.</w:t>
+      </w:r>
+    </w:p>
+    <w:p>
+      <w:pPr>
+        <w:pStyle w:val="ListParagraph"/>
+        <w:numPr>
+          <w:ilvl w:val="0"/>
+          <w:numId w:val="2"/>
+        </w:numPr>
+        <w:spacing w:after="60"/>
+      </w:pPr>
+      <w:r>
+        <w:rPr>
+          <w:rFonts w:ascii="Calibri" w:cs="Calibri" w:eastAsia="Calibri" w:hAnsi="Calibri"/>
+          <w:sz w:val="21"/>
+          <w:szCs w:val="21"/>
+        </w:rPr>
+        <w:t xml:space="preserve">AC2 2c: two customers, two offers (tourists: familiarity; locals: social space).</w:t>
+      </w:r>
+    </w:p>
+    <w:p>
+      <w:pPr>
+        <w:pStyle w:val="ListParagraph"/>
+        <w:numPr>
+          <w:ilvl w:val="0"/>
+          <w:numId w:val="2"/>
+        </w:numPr>
+        <w:spacing w:after="60"/>
+      </w:pPr>
+      <w:r>
+        <w:rPr>
+          <w:rFonts w:ascii="Calibri" w:cs="Calibri" w:eastAsia="Calibri" w:hAnsi="Calibri"/>
+          <w:sz w:val="21"/>
+          <w:szCs w:val="21"/>
+        </w:rPr>
+        <w:t xml:space="preserve">AC2 2d and conclusion: destination-store format as reverse learning; tourism indicators as stage-gate triggers.</w:t>
+      </w:r>
+    </w:p>
+    <w:p>
+      <w:pPr>
+        <w:pStyle w:val="ListParagraph"/>
+        <w:numPr>
+          <w:ilvl w:val="0"/>
+          <w:numId w:val="2"/>
+        </w:numPr>
+        <w:spacing w:after="60"/>
+      </w:pPr>
+      <w:r>
+        <w:rPr>
+          <w:rFonts w:ascii="Calibri" w:cs="Calibri" w:eastAsia="Calibri" w:hAnsi="Calibri"/>
+          <w:sz w:val="21"/>
+          <w:szCs w:val="21"/>
+        </w:rPr>
+        <w:t xml:space="preserve">Appendix: tourist segment table and a chart of monthly arrivals showing seasonality and the September 2025 shock.</w:t>
+      </w:r>
+    </w:p>
+    <w:p>
+      <w:pPr>
+        <w:spacing w:after="100"/>
+        <w:rPr>
+          <w:i/>
+          <w:iCs/>
+        </w:rPr>
+      </w:pPr>
+      <w:r>
+        <w:rPr>
+          <w:rFonts w:ascii="Calibri" w:cs="Calibri" w:eastAsia="Calibri" w:hAnsi="Calibri"/>
+          <w:i/>
+          <w:iCs/>
+          <w:sz w:val="21"/>
+          <w:szCs w:val="21"/>
+        </w:rPr>
+        <w:t xml:space="preserve">Evidence caution: I found no data on tourists’ actual coffee-chain preferences in Nepal. State the segment logic as a reasoned hypothesis and say what survey or visitor data would confirm it.</w:t>
+      </w:r>
+    </w:p>
+    <w:p>
+      <w:pPr>
+        <w:pStyle w:val="Heading1"/>
+        <w:spacing w:after="120" w:before="300"/>
+      </w:pPr>
+      <w:r>
+        <w:rPr>
+          <w:rFonts w:ascii="Calibri" w:cs="Calibri" w:eastAsia="Calibri" w:hAnsi="Calibri"/>
+          <w:b/>
+          <w:bCs/>
+          <w:color w:val="1F3864"/>
+          <w:sz w:val="30"/>
+          <w:szCs w:val="30"/>
+        </w:rPr>
+        <w:t xml:space="preserve">8. Visuals and appendices</w:t>
       </w:r>
     </w:p>
     <w:tbl>
@@ -5387,6 +7203,98 @@
                 <w:szCs w:val="19"/>
               </w:rPr>
               <w:t xml:space="preserve">Makes the sourcing logic visible in one glance. Needs a caption, source and a clear fiscal-year label because sources give different years.</w:t>
+            </w:r>
+          </w:p>
+        </w:tc>
+      </w:tr>
+      <w:tr>
+        <w:trPr>
+          <w:cantSplit/>
+        </w:trPr>
+        <w:tc>
+          <w:tcPr>
+            <w:tcW w:type="dxa" w:w="2700"/>
+            <w:tcBorders>
+              <w:top w:val="single" w:color="999999" w:sz="4"/>
+              <w:left w:val="single" w:color="999999" w:sz="4"/>
+              <w:bottom w:val="single" w:color="999999" w:sz="4"/>
+              <w:right w:val="single" w:color="999999" w:sz="4"/>
+            </w:tcBorders>
+            <w:tcMar>
+              <w:top w:type="dxa" w:w="60"/>
+              <w:left w:type="dxa" w:w="90"/>
+              <w:bottom w:type="dxa" w:w="60"/>
+              <w:right w:type="dxa" w:w="90"/>
+            </w:tcMar>
+          </w:tcPr>
+          <w:p>
+            <w:r>
+              <w:rPr>
+                <w:rFonts w:ascii="Calibri" w:cs="Calibri" w:eastAsia="Calibri" w:hAnsi="Calibri"/>
+                <w:b w:val="false"/>
+                <w:bCs w:val="false"/>
+                <w:sz w:val="19"/>
+                <w:szCs w:val="19"/>
+              </w:rPr>
+              <w:t xml:space="preserve">Figure 2: Monthly foreign tourist arrivals 2025 with the September protest shock, plus spend per day 2024 vs 2025</w:t>
+            </w:r>
+          </w:p>
+        </w:tc>
+        <w:tc>
+          <w:tcPr>
+            <w:tcW w:type="dxa" w:w="1700"/>
+            <w:tcBorders>
+              <w:top w:val="single" w:color="999999" w:sz="4"/>
+              <w:left w:val="single" w:color="999999" w:sz="4"/>
+              <w:bottom w:val="single" w:color="999999" w:sz="4"/>
+              <w:right w:val="single" w:color="999999" w:sz="4"/>
+            </w:tcBorders>
+            <w:tcMar>
+              <w:top w:type="dxa" w:w="60"/>
+              <w:left w:type="dxa" w:w="90"/>
+              <w:bottom w:type="dxa" w:w="60"/>
+              <w:right w:type="dxa" w:w="90"/>
+            </w:tcMar>
+          </w:tcPr>
+          <w:p>
+            <w:r>
+              <w:rPr>
+                <w:rFonts w:ascii="Calibri" w:cs="Calibri" w:eastAsia="Calibri" w:hAnsi="Calibri"/>
+                <w:b w:val="false"/>
+                <w:bCs w:val="false"/>
+                <w:sz w:val="19"/>
+                <w:szCs w:val="19"/>
+              </w:rPr>
+              <w:t xml:space="preserve">Body or Appendix</w:t>
+            </w:r>
+          </w:p>
+        </w:tc>
+        <w:tc>
+          <w:tcPr>
+            <w:tcW w:type="dxa" w:w="5238"/>
+            <w:tcBorders>
+              <w:top w:val="single" w:color="999999" w:sz="4"/>
+              <w:left w:val="single" w:color="999999" w:sz="4"/>
+              <w:bottom w:val="single" w:color="999999" w:sz="4"/>
+              <w:right w:val="single" w:color="999999" w:sz="4"/>
+            </w:tcBorders>
+            <w:tcMar>
+              <w:top w:type="dxa" w:w="60"/>
+              <w:left w:type="dxa" w:w="90"/>
+              <w:bottom w:type="dxa" w:w="60"/>
+              <w:right w:type="dxa" w:w="90"/>
+            </w:tcMar>
+          </w:tcPr>
+          <w:p>
+            <w:r>
+              <w:rPr>
+                <w:rFonts w:ascii="Calibri" w:cs="Calibri" w:eastAsia="Calibri" w:hAnsi="Calibri"/>
+                <w:b w:val="false"/>
+                <w:bCs w:val="false"/>
+                <w:sz w:val="19"/>
+                <w:szCs w:val="19"/>
+              </w:rPr>
+              <w:t xml:space="preserve">Shows volatility and the low-spend point. Put in the body only if space and word count allow.</w:t>
             </w:r>
           </w:p>
         </w:tc>
@@ -6136,7 +8044,7 @@
                 <w:sz w:val="19"/>
                 <w:szCs w:val="19"/>
               </w:rPr>
-              <w:t xml:space="preserve">Legal opinion on FITTA and NRB royalty repatriation; supplier quality benchmarks met</w:t>
+              <w:t xml:space="preserve">Legal opinion on FITTA and NRB royalty repatriation; supplier quality benchmarks met; tourism recovery confirmed (annual arrivals at or above the 2019 level, spend per day stable or rising)</w:t>
             </w:r>
           </w:p>
         </w:tc>
@@ -6257,7 +8165,7 @@
                 <w:sz w:val="19"/>
                 <w:szCs w:val="19"/>
               </w:rPr>
-              <w:t xml:space="preserve">Pilot store performance thresholds (to be defined); political and FX stability review</w:t>
+              <w:t xml:space="preserve">Pilot store performance thresholds (to be defined); tourist vs local sales mix; political and FX stability review</w:t>
             </w:r>
           </w:p>
         </w:tc>
@@ -6417,7 +8325,7 @@
           <w:sz w:val="30"/>
           <w:szCs w:val="30"/>
         </w:rPr>
-        <w:t xml:space="preserve">8. Data pack</w:t>
+        <w:t xml:space="preserve">9. Data pack</w:t>
       </w:r>
     </w:p>
     <w:p>
@@ -8061,7 +9969,7 @@
                 <w:sz w:val="19"/>
                 <w:szCs w:val="19"/>
               </w:rPr>
-              <w:t xml:space="preserve">Starbucks Laos precedent</w:t>
+              <w:t xml:space="preserve">Length of stay</w:t>
             </w:r>
           </w:p>
         </w:tc>
@@ -8090,7 +9998,7 @@
                 <w:sz w:val="19"/>
                 <w:szCs w:val="19"/>
               </w:rPr>
-              <w:t xml:space="preserve">Licensed partner Coffee Concepts (Laos), part of Maxim’s Caterers</w:t>
+              <w:t xml:space="preserve">16.34 days in 2025 (13.30 in 2024); recording method changed in 2025</w:t>
             </w:r>
           </w:p>
         </w:tc>
@@ -8148,7 +10056,7 @@
                 <w:sz w:val="19"/>
                 <w:szCs w:val="19"/>
               </w:rPr>
-              <w:t xml:space="preserve">Date and details to verify</w:t>
+              <w:t xml:space="preserve">Kathmandu Post; compare cautiously</w:t>
             </w:r>
           </w:p>
         </w:tc>
@@ -8182,7 +10090,7 @@
                 <w:sz w:val="19"/>
                 <w:szCs w:val="19"/>
               </w:rPr>
-              <w:t xml:space="preserve">Hofstede</w:t>
+              <w:t xml:space="preserve">Tourist spend</w:t>
             </w:r>
           </w:p>
         </w:tc>
@@ -8211,7 +10119,7 @@
                 <w:sz w:val="19"/>
                 <w:szCs w:val="19"/>
               </w:rPr>
-              <w:t xml:space="preserve">No verified official Nepal scores found; qualitative evidence only</w:t>
+              <w:t xml:space="preserve">About $33 a day in 2025 (2024: $40.84); regional range cited at $100–150; target $125 within 10 years</w:t>
             </w:r>
           </w:p>
         </w:tc>
@@ -8269,7 +10177,7 @@
                 <w:sz w:val="19"/>
                 <w:szCs w:val="19"/>
               </w:rPr>
-              <w:t xml:space="preserve">Hofstede Insights; NABIL Bank study</w:t>
+              <w:t xml:space="preserve">Kathmandu Post; Ekantipur; regional figure unsourced</w:t>
             </w:r>
           </w:p>
         </w:tc>
@@ -8303,6 +10211,490 @@
                 <w:sz w:val="19"/>
                 <w:szCs w:val="19"/>
               </w:rPr>
+              <w:t xml:space="preserve">Tourism earnings</w:t>
+            </w:r>
+          </w:p>
+        </w:tc>
+        <w:tc>
+          <w:tcPr>
+            <w:tcW w:type="dxa" w:w="3800"/>
+            <w:tcBorders>
+              <w:top w:val="single" w:color="999999" w:sz="4"/>
+              <w:left w:val="single" w:color="999999" w:sz="4"/>
+              <w:bottom w:val="single" w:color="999999" w:sz="4"/>
+              <w:right w:val="single" w:color="999999" w:sz="4"/>
+            </w:tcBorders>
+            <w:tcMar>
+              <w:top w:type="dxa" w:w="60"/>
+              <w:left w:type="dxa" w:w="90"/>
+              <w:bottom w:type="dxa" w:w="60"/>
+              <w:right w:type="dxa" w:w="90"/>
+            </w:tcMar>
+          </w:tcPr>
+          <w:p>
+            <w:r>
+              <w:rPr>
+                <w:rFonts w:ascii="Calibri" w:cs="Calibri" w:eastAsia="Calibri" w:hAnsi="Calibri"/>
+                <w:b w:val="false"/>
+                <w:bCs w:val="false"/>
+                <w:sz w:val="19"/>
+                <w:szCs w:val="19"/>
+              </w:rPr>
+              <w:t xml:space="preserve">Foreign-exchange earnings from tourism +4.8% (about NPR 87.4bn)</w:t>
+            </w:r>
+          </w:p>
+        </w:tc>
+        <w:tc>
+          <w:tcPr>
+            <w:tcW w:type="dxa" w:w="800"/>
+            <w:tcBorders>
+              <w:top w:val="single" w:color="999999" w:sz="4"/>
+              <w:left w:val="single" w:color="999999" w:sz="4"/>
+              <w:bottom w:val="single" w:color="999999" w:sz="4"/>
+              <w:right w:val="single" w:color="999999" w:sz="4"/>
+            </w:tcBorders>
+            <w:tcMar>
+              <w:top w:type="dxa" w:w="60"/>
+              <w:left w:type="dxa" w:w="90"/>
+              <w:bottom w:type="dxa" w:w="60"/>
+              <w:right w:type="dxa" w:w="90"/>
+            </w:tcMar>
+          </w:tcPr>
+          <w:p>
+            <w:r>
+              <w:rPr>
+                <w:rFonts w:ascii="Calibri" w:cs="Calibri" w:eastAsia="Calibri" w:hAnsi="Calibri"/>
+                <w:b w:val="false"/>
+                <w:bCs w:val="false"/>
+                <w:sz w:val="19"/>
+                <w:szCs w:val="19"/>
+              </w:rPr>
+              <w:t xml:space="preserve">CHECK</w:t>
+            </w:r>
+          </w:p>
+        </w:tc>
+        <w:tc>
+          <w:tcPr>
+            <w:tcW w:type="dxa" w:w="3038"/>
+            <w:tcBorders>
+              <w:top w:val="single" w:color="999999" w:sz="4"/>
+              <w:left w:val="single" w:color="999999" w:sz="4"/>
+              <w:bottom w:val="single" w:color="999999" w:sz="4"/>
+              <w:right w:val="single" w:color="999999" w:sz="4"/>
+            </w:tcBorders>
+            <w:tcMar>
+              <w:top w:type="dxa" w:w="60"/>
+              <w:left w:type="dxa" w:w="90"/>
+              <w:bottom w:type="dxa" w:w="60"/>
+              <w:right w:type="dxa" w:w="90"/>
+            </w:tcMar>
+          </w:tcPr>
+          <w:p>
+            <w:r>
+              <w:rPr>
+                <w:rFonts w:ascii="Calibri" w:cs="Calibri" w:eastAsia="Calibri" w:hAnsi="Calibri"/>
+                <w:b w:val="false"/>
+                <w:bCs w:val="false"/>
+                <w:sz w:val="19"/>
+                <w:szCs w:val="19"/>
+              </w:rPr>
+              <w:t xml:space="preserve">Press report; verify at NRB or NTB</w:t>
+            </w:r>
+          </w:p>
+        </w:tc>
+      </w:tr>
+      <w:tr>
+        <w:trPr>
+          <w:cantSplit/>
+        </w:trPr>
+        <w:tc>
+          <w:tcPr>
+            <w:tcW w:type="dxa" w:w="2000"/>
+            <w:tcBorders>
+              <w:top w:val="single" w:color="999999" w:sz="4"/>
+              <w:left w:val="single" w:color="999999" w:sz="4"/>
+              <w:bottom w:val="single" w:color="999999" w:sz="4"/>
+              <w:right w:val="single" w:color="999999" w:sz="4"/>
+            </w:tcBorders>
+            <w:tcMar>
+              <w:top w:type="dxa" w:w="60"/>
+              <w:left w:type="dxa" w:w="90"/>
+              <w:bottom w:type="dxa" w:w="60"/>
+              <w:right w:type="dxa" w:w="90"/>
+            </w:tcMar>
+          </w:tcPr>
+          <w:p>
+            <w:r>
+              <w:rPr>
+                <w:rFonts w:ascii="Calibri" w:cs="Calibri" w:eastAsia="Calibri" w:hAnsi="Calibri"/>
+                <w:b w:val="false"/>
+                <w:bCs w:val="false"/>
+                <w:sz w:val="19"/>
+                <w:szCs w:val="19"/>
+              </w:rPr>
+              <w:t xml:space="preserve">Air gateway</w:t>
+            </w:r>
+          </w:p>
+        </w:tc>
+        <w:tc>
+          <w:tcPr>
+            <w:tcW w:type="dxa" w:w="3800"/>
+            <w:tcBorders>
+              <w:top w:val="single" w:color="999999" w:sz="4"/>
+              <w:left w:val="single" w:color="999999" w:sz="4"/>
+              <w:bottom w:val="single" w:color="999999" w:sz="4"/>
+              <w:right w:val="single" w:color="999999" w:sz="4"/>
+            </w:tcBorders>
+            <w:tcMar>
+              <w:top w:type="dxa" w:w="60"/>
+              <w:left w:type="dxa" w:w="90"/>
+              <w:bottom w:type="dxa" w:w="60"/>
+              <w:right w:type="dxa" w:w="90"/>
+            </w:tcMar>
+          </w:tcPr>
+          <w:p>
+            <w:r>
+              <w:rPr>
+                <w:rFonts w:ascii="Calibri" w:cs="Calibri" w:eastAsia="Calibri" w:hAnsi="Calibri"/>
+                <w:b w:val="false"/>
+                <w:bCs w:val="false"/>
+                <w:sz w:val="19"/>
+                <w:szCs w:val="19"/>
+              </w:rPr>
+              <w:t xml:space="preserve">Kathmandu airport about 5.25m international and 4.53m domestic passengers in 2025</w:t>
+            </w:r>
+          </w:p>
+        </w:tc>
+        <w:tc>
+          <w:tcPr>
+            <w:tcW w:type="dxa" w:w="800"/>
+            <w:tcBorders>
+              <w:top w:val="single" w:color="999999" w:sz="4"/>
+              <w:left w:val="single" w:color="999999" w:sz="4"/>
+              <w:bottom w:val="single" w:color="999999" w:sz="4"/>
+              <w:right w:val="single" w:color="999999" w:sz="4"/>
+            </w:tcBorders>
+            <w:tcMar>
+              <w:top w:type="dxa" w:w="60"/>
+              <w:left w:type="dxa" w:w="90"/>
+              <w:bottom w:type="dxa" w:w="60"/>
+              <w:right w:type="dxa" w:w="90"/>
+            </w:tcMar>
+          </w:tcPr>
+          <w:p>
+            <w:r>
+              <w:rPr>
+                <w:rFonts w:ascii="Calibri" w:cs="Calibri" w:eastAsia="Calibri" w:hAnsi="Calibri"/>
+                <w:b w:val="false"/>
+                <w:bCs w:val="false"/>
+                <w:sz w:val="19"/>
+                <w:szCs w:val="19"/>
+              </w:rPr>
+              <w:t xml:space="preserve">OK</w:t>
+            </w:r>
+          </w:p>
+        </w:tc>
+        <w:tc>
+          <w:tcPr>
+            <w:tcW w:type="dxa" w:w="3038"/>
+            <w:tcBorders>
+              <w:top w:val="single" w:color="999999" w:sz="4"/>
+              <w:left w:val="single" w:color="999999" w:sz="4"/>
+              <w:bottom w:val="single" w:color="999999" w:sz="4"/>
+              <w:right w:val="single" w:color="999999" w:sz="4"/>
+            </w:tcBorders>
+            <w:tcMar>
+              <w:top w:type="dxa" w:w="60"/>
+              <w:left w:type="dxa" w:w="90"/>
+              <w:bottom w:type="dxa" w:w="60"/>
+              <w:right w:type="dxa" w:w="90"/>
+            </w:tcMar>
+          </w:tcPr>
+          <w:p>
+            <w:r>
+              <w:rPr>
+                <w:rFonts w:ascii="Calibri" w:cs="Calibri" w:eastAsia="Calibri" w:hAnsi="Calibri"/>
+                <w:b w:val="false"/>
+                <w:bCs w:val="false"/>
+                <w:sz w:val="19"/>
+                <w:szCs w:val="19"/>
+              </w:rPr>
+              <w:t xml:space="preserve">Civil Aviation Authority of Nepal via Ekantipur</w:t>
+            </w:r>
+          </w:p>
+        </w:tc>
+      </w:tr>
+      <w:tr>
+        <w:trPr>
+          <w:cantSplit/>
+        </w:trPr>
+        <w:tc>
+          <w:tcPr>
+            <w:tcW w:type="dxa" w:w="2000"/>
+            <w:tcBorders>
+              <w:top w:val="single" w:color="999999" w:sz="4"/>
+              <w:left w:val="single" w:color="999999" w:sz="4"/>
+              <w:bottom w:val="single" w:color="999999" w:sz="4"/>
+              <w:right w:val="single" w:color="999999" w:sz="4"/>
+            </w:tcBorders>
+            <w:tcMar>
+              <w:top w:type="dxa" w:w="60"/>
+              <w:left w:type="dxa" w:w="90"/>
+              <w:bottom w:type="dxa" w:w="60"/>
+              <w:right w:type="dxa" w:w="90"/>
+            </w:tcMar>
+          </w:tcPr>
+          <w:p>
+            <w:r>
+              <w:rPr>
+                <w:rFonts w:ascii="Calibri" w:cs="Calibri" w:eastAsia="Calibri" w:hAnsi="Calibri"/>
+                <w:b w:val="false"/>
+                <w:bCs w:val="false"/>
+                <w:sz w:val="19"/>
+                <w:szCs w:val="19"/>
+              </w:rPr>
+              <w:t xml:space="preserve">Starbucks Laos precedent</w:t>
+            </w:r>
+          </w:p>
+        </w:tc>
+        <w:tc>
+          <w:tcPr>
+            <w:tcW w:type="dxa" w:w="3800"/>
+            <w:tcBorders>
+              <w:top w:val="single" w:color="999999" w:sz="4"/>
+              <w:left w:val="single" w:color="999999" w:sz="4"/>
+              <w:bottom w:val="single" w:color="999999" w:sz="4"/>
+              <w:right w:val="single" w:color="999999" w:sz="4"/>
+            </w:tcBorders>
+            <w:tcMar>
+              <w:top w:type="dxa" w:w="60"/>
+              <w:left w:type="dxa" w:w="90"/>
+              <w:bottom w:type="dxa" w:w="60"/>
+              <w:right w:type="dxa" w:w="90"/>
+            </w:tcMar>
+          </w:tcPr>
+          <w:p>
+            <w:r>
+              <w:rPr>
+                <w:rFonts w:ascii="Calibri" w:cs="Calibri" w:eastAsia="Calibri" w:hAnsi="Calibri"/>
+                <w:b w:val="false"/>
+                <w:bCs w:val="false"/>
+                <w:sz w:val="19"/>
+                <w:szCs w:val="19"/>
+              </w:rPr>
+              <w:t xml:space="preserve">Licensed partner Coffee Concepts (Laos), part of Maxim’s Caterers</w:t>
+            </w:r>
+          </w:p>
+        </w:tc>
+        <w:tc>
+          <w:tcPr>
+            <w:tcW w:type="dxa" w:w="800"/>
+            <w:tcBorders>
+              <w:top w:val="single" w:color="999999" w:sz="4"/>
+              <w:left w:val="single" w:color="999999" w:sz="4"/>
+              <w:bottom w:val="single" w:color="999999" w:sz="4"/>
+              <w:right w:val="single" w:color="999999" w:sz="4"/>
+            </w:tcBorders>
+            <w:tcMar>
+              <w:top w:type="dxa" w:w="60"/>
+              <w:left w:type="dxa" w:w="90"/>
+              <w:bottom w:type="dxa" w:w="60"/>
+              <w:right w:type="dxa" w:w="90"/>
+            </w:tcMar>
+          </w:tcPr>
+          <w:p>
+            <w:r>
+              <w:rPr>
+                <w:rFonts w:ascii="Calibri" w:cs="Calibri" w:eastAsia="Calibri" w:hAnsi="Calibri"/>
+                <w:b w:val="false"/>
+                <w:bCs w:val="false"/>
+                <w:sz w:val="19"/>
+                <w:szCs w:val="19"/>
+              </w:rPr>
+              <w:t xml:space="preserve">CHECK</w:t>
+            </w:r>
+          </w:p>
+        </w:tc>
+        <w:tc>
+          <w:tcPr>
+            <w:tcW w:type="dxa" w:w="3038"/>
+            <w:tcBorders>
+              <w:top w:val="single" w:color="999999" w:sz="4"/>
+              <w:left w:val="single" w:color="999999" w:sz="4"/>
+              <w:bottom w:val="single" w:color="999999" w:sz="4"/>
+              <w:right w:val="single" w:color="999999" w:sz="4"/>
+            </w:tcBorders>
+            <w:tcMar>
+              <w:top w:type="dxa" w:w="60"/>
+              <w:left w:type="dxa" w:w="90"/>
+              <w:bottom w:type="dxa" w:w="60"/>
+              <w:right w:type="dxa" w:w="90"/>
+            </w:tcMar>
+          </w:tcPr>
+          <w:p>
+            <w:r>
+              <w:rPr>
+                <w:rFonts w:ascii="Calibri" w:cs="Calibri" w:eastAsia="Calibri" w:hAnsi="Calibri"/>
+                <w:b w:val="false"/>
+                <w:bCs w:val="false"/>
+                <w:sz w:val="19"/>
+                <w:szCs w:val="19"/>
+              </w:rPr>
+              <w:t xml:space="preserve">Date and details to verify</w:t>
+            </w:r>
+          </w:p>
+        </w:tc>
+      </w:tr>
+      <w:tr>
+        <w:trPr>
+          <w:cantSplit/>
+        </w:trPr>
+        <w:tc>
+          <w:tcPr>
+            <w:tcW w:type="dxa" w:w="2000"/>
+            <w:tcBorders>
+              <w:top w:val="single" w:color="999999" w:sz="4"/>
+              <w:left w:val="single" w:color="999999" w:sz="4"/>
+              <w:bottom w:val="single" w:color="999999" w:sz="4"/>
+              <w:right w:val="single" w:color="999999" w:sz="4"/>
+            </w:tcBorders>
+            <w:tcMar>
+              <w:top w:type="dxa" w:w="60"/>
+              <w:left w:type="dxa" w:w="90"/>
+              <w:bottom w:type="dxa" w:w="60"/>
+              <w:right w:type="dxa" w:w="90"/>
+            </w:tcMar>
+          </w:tcPr>
+          <w:p>
+            <w:r>
+              <w:rPr>
+                <w:rFonts w:ascii="Calibri" w:cs="Calibri" w:eastAsia="Calibri" w:hAnsi="Calibri"/>
+                <w:b w:val="false"/>
+                <w:bCs w:val="false"/>
+                <w:sz w:val="19"/>
+                <w:szCs w:val="19"/>
+              </w:rPr>
+              <w:t xml:space="preserve">Hofstede</w:t>
+            </w:r>
+          </w:p>
+        </w:tc>
+        <w:tc>
+          <w:tcPr>
+            <w:tcW w:type="dxa" w:w="3800"/>
+            <w:tcBorders>
+              <w:top w:val="single" w:color="999999" w:sz="4"/>
+              <w:left w:val="single" w:color="999999" w:sz="4"/>
+              <w:bottom w:val="single" w:color="999999" w:sz="4"/>
+              <w:right w:val="single" w:color="999999" w:sz="4"/>
+            </w:tcBorders>
+            <w:tcMar>
+              <w:top w:type="dxa" w:w="60"/>
+              <w:left w:type="dxa" w:w="90"/>
+              <w:bottom w:type="dxa" w:w="60"/>
+              <w:right w:type="dxa" w:w="90"/>
+            </w:tcMar>
+          </w:tcPr>
+          <w:p>
+            <w:r>
+              <w:rPr>
+                <w:rFonts w:ascii="Calibri" w:cs="Calibri" w:eastAsia="Calibri" w:hAnsi="Calibri"/>
+                <w:b w:val="false"/>
+                <w:bCs w:val="false"/>
+                <w:sz w:val="19"/>
+                <w:szCs w:val="19"/>
+              </w:rPr>
+              <w:t xml:space="preserve">No verified official Nepal scores found; qualitative evidence only</w:t>
+            </w:r>
+          </w:p>
+        </w:tc>
+        <w:tc>
+          <w:tcPr>
+            <w:tcW w:type="dxa" w:w="800"/>
+            <w:tcBorders>
+              <w:top w:val="single" w:color="999999" w:sz="4"/>
+              <w:left w:val="single" w:color="999999" w:sz="4"/>
+              <w:bottom w:val="single" w:color="999999" w:sz="4"/>
+              <w:right w:val="single" w:color="999999" w:sz="4"/>
+            </w:tcBorders>
+            <w:tcMar>
+              <w:top w:type="dxa" w:w="60"/>
+              <w:left w:type="dxa" w:w="90"/>
+              <w:bottom w:type="dxa" w:w="60"/>
+              <w:right w:type="dxa" w:w="90"/>
+            </w:tcMar>
+          </w:tcPr>
+          <w:p>
+            <w:r>
+              <w:rPr>
+                <w:rFonts w:ascii="Calibri" w:cs="Calibri" w:eastAsia="Calibri" w:hAnsi="Calibri"/>
+                <w:b w:val="false"/>
+                <w:bCs w:val="false"/>
+                <w:sz w:val="19"/>
+                <w:szCs w:val="19"/>
+              </w:rPr>
+              <w:t xml:space="preserve">CHECK</w:t>
+            </w:r>
+          </w:p>
+        </w:tc>
+        <w:tc>
+          <w:tcPr>
+            <w:tcW w:type="dxa" w:w="3038"/>
+            <w:tcBorders>
+              <w:top w:val="single" w:color="999999" w:sz="4"/>
+              <w:left w:val="single" w:color="999999" w:sz="4"/>
+              <w:bottom w:val="single" w:color="999999" w:sz="4"/>
+              <w:right w:val="single" w:color="999999" w:sz="4"/>
+            </w:tcBorders>
+            <w:tcMar>
+              <w:top w:type="dxa" w:w="60"/>
+              <w:left w:type="dxa" w:w="90"/>
+              <w:bottom w:type="dxa" w:w="60"/>
+              <w:right w:type="dxa" w:w="90"/>
+            </w:tcMar>
+          </w:tcPr>
+          <w:p>
+            <w:r>
+              <w:rPr>
+                <w:rFonts w:ascii="Calibri" w:cs="Calibri" w:eastAsia="Calibri" w:hAnsi="Calibri"/>
+                <w:b w:val="false"/>
+                <w:bCs w:val="false"/>
+                <w:sz w:val="19"/>
+                <w:szCs w:val="19"/>
+              </w:rPr>
+              <w:t xml:space="preserve">Hofstede Insights; NABIL Bank study</w:t>
+            </w:r>
+          </w:p>
+        </w:tc>
+      </w:tr>
+      <w:tr>
+        <w:trPr>
+          <w:cantSplit/>
+        </w:trPr>
+        <w:tc>
+          <w:tcPr>
+            <w:tcW w:type="dxa" w:w="2000"/>
+            <w:tcBorders>
+              <w:top w:val="single" w:color="999999" w:sz="4"/>
+              <w:left w:val="single" w:color="999999" w:sz="4"/>
+              <w:bottom w:val="single" w:color="999999" w:sz="4"/>
+              <w:right w:val="single" w:color="999999" w:sz="4"/>
+            </w:tcBorders>
+            <w:tcMar>
+              <w:top w:type="dxa" w:w="60"/>
+              <w:left w:type="dxa" w:w="90"/>
+              <w:bottom w:type="dxa" w:w="60"/>
+              <w:right w:type="dxa" w:w="90"/>
+            </w:tcMar>
+          </w:tcPr>
+          <w:p>
+            <w:r>
+              <w:rPr>
+                <w:rFonts w:ascii="Calibri" w:cs="Calibri" w:eastAsia="Calibri" w:hAnsi="Calibri"/>
+                <w:b w:val="false"/>
+                <w:bCs w:val="false"/>
+                <w:sz w:val="19"/>
+                <w:szCs w:val="19"/>
+              </w:rPr>
               <w:t xml:space="preserve">Local competition</w:t>
             </w:r>
           </w:p>
@@ -8410,7 +10802,7 @@
           <w:sz w:val="30"/>
           <w:szCs w:val="30"/>
         </w:rPr>
-        <w:t xml:space="preserve">9. Planned reference set (all to be verified before use)</w:t>
+        <w:t xml:space="preserve">10. Planned reference set (all to be verified before use)</w:t>
       </w:r>
     </w:p>
     <w:p>
@@ -8621,7 +11013,7 @@
           <w:sz w:val="21"/>
           <w:szCs w:val="21"/>
         </w:rPr>
-        <w:t xml:space="preserve">Zaheer, S. (1995) ‘Overcoming the liability of foreignness’, Academy of Management Journal, 38(2).</w:t>
+        <w:t xml:space="preserve">Cohen, E. (1972) ‘Toward a sociology of international tourism’, Social Research, 39(1).</w:t>
       </w:r>
     </w:p>
     <w:p>
@@ -8639,7 +11031,7 @@
           <w:sz w:val="21"/>
           <w:szCs w:val="21"/>
         </w:rPr>
-        <w:t xml:space="preserve">Starbucks Corporation: latest Form 10-K and Global Impact Report.</w:t>
+        <w:t xml:space="preserve">Butler, R.W. (1980) ‘The concept of a tourist area cycle of evolution’, Canadian Geographer, 24(1).</w:t>
       </w:r>
     </w:p>
     <w:p>
@@ -8657,7 +11049,7 @@
           <w:sz w:val="21"/>
           <w:szCs w:val="21"/>
         </w:rPr>
-        <w:t xml:space="preserve">Transparency International (2026) Corruption Perceptions Index 2025.</w:t>
+        <w:t xml:space="preserve">Zaheer, S. (1995) ‘Overcoming the liability of foreignness’, Academy of Management Journal, 38(2).</w:t>
       </w:r>
     </w:p>
     <w:p>
@@ -8675,7 +11067,7 @@
           <w:sz w:val="21"/>
           <w:szCs w:val="21"/>
         </w:rPr>
-        <w:t xml:space="preserve">Nepal Rastra Bank (2026) Current macroeconomic and financial situation (FY2025/26).</w:t>
+        <w:t xml:space="preserve">Starbucks Corporation: latest Form 10-K and Global Impact Report.</w:t>
       </w:r>
     </w:p>
     <w:p>
@@ -8693,7 +11085,7 @@
           <w:sz w:val="21"/>
           <w:szCs w:val="21"/>
         </w:rPr>
-        <w:t xml:space="preserve">Ministry of Finance, Nepal (2026) Economic Survey 2025/26.</w:t>
+        <w:t xml:space="preserve">Transparency International (2026) Corruption Perceptions Index 2025.</w:t>
       </w:r>
     </w:p>
     <w:p>
@@ -8711,7 +11103,7 @@
           <w:sz w:val="21"/>
           <w:szCs w:val="21"/>
         </w:rPr>
-        <w:t xml:space="preserve">Nepal Tourism Board (2026) Tourism Insight / annual arrivals.</w:t>
+        <w:t xml:space="preserve">Nepal Rastra Bank (2026) Current macroeconomic and financial situation (FY2025/26).</w:t>
       </w:r>
     </w:p>
     <w:p>
@@ -8729,7 +11121,7 @@
           <w:sz w:val="21"/>
           <w:szCs w:val="21"/>
         </w:rPr>
-        <w:t xml:space="preserve">Foreign Investment and Technology Transfer Act 2019 (Nepal) and Schedule.</w:t>
+        <w:t xml:space="preserve">Ministry of Finance, Nepal (2026) Economic Survey 2025/26.</w:t>
       </w:r>
     </w:p>
     <w:p>
@@ -8747,40 +11139,7 @@
           <w:sz w:val="21"/>
           <w:szCs w:val="21"/>
         </w:rPr>
-        <w:t xml:space="preserve">Tea and Coffee Development Board (NTCDB) and press reports on coffee trade.</w:t>
-      </w:r>
-    </w:p>
-    <w:p>
-      <w:pPr>
-        <w:pStyle w:val="Heading1"/>
-        <w:spacing w:after="120" w:before="300"/>
-      </w:pPr>
-      <w:r>
-        <w:rPr>
-          <w:rFonts w:ascii="Calibri" w:cs="Calibri" w:eastAsia="Calibri" w:hAnsi="Calibri"/>
-          <w:b/>
-          <w:bCs/>
-          <w:color w:val="1F3864"/>
-          <w:sz w:val="30"/>
-          <w:szCs w:val="30"/>
-        </w:rPr>
-        <w:t xml:space="preserve">10. Harsh-marker checklist</w:t>
-      </w:r>
-    </w:p>
-    <w:p>
-      <w:pPr>
-        <w:pStyle w:val="Heading3"/>
-        <w:spacing w:after="80" w:before="140"/>
-      </w:pPr>
-      <w:r>
-        <w:rPr>
-          <w:rFonts w:ascii="Calibri" w:cs="Calibri" w:eastAsia="Calibri" w:hAnsi="Calibri"/>
-          <w:b/>
-          <w:bCs/>
-          <w:sz w:val="22"/>
-          <w:szCs w:val="22"/>
-        </w:rPr>
-        <w:t xml:space="preserve">Include</w:t>
+        <w:t xml:space="preserve">Nepal Tourism Board (2026) Tourism Insight / annual arrivals.</w:t>
       </w:r>
     </w:p>
     <w:p>
@@ -8798,7 +11157,7 @@
           <w:sz w:val="21"/>
           <w:szCs w:val="21"/>
         </w:rPr>
-        <w:t xml:space="preserve">Thesis and recommendation in the first 30 words.</w:t>
+        <w:t xml:space="preserve">Foreign Investment and Technology Transfer Act 2019 (Nepal) and Schedule.</w:t>
       </w:r>
     </w:p>
     <w:p>
@@ -8816,7 +11175,40 @@
           <w:sz w:val="21"/>
           <w:szCs w:val="21"/>
         </w:rPr>
-        <w:t xml:space="preserve">One integrated argument: RBV → OLI → institutions → distance → culture → stage gates.</w:t>
+        <w:t xml:space="preserve">Tea and Coffee Development Board (NTCDB) and press reports on coffee trade.</w:t>
+      </w:r>
+    </w:p>
+    <w:p>
+      <w:pPr>
+        <w:pStyle w:val="Heading1"/>
+        <w:spacing w:after="120" w:before="300"/>
+      </w:pPr>
+      <w:r>
+        <w:rPr>
+          <w:rFonts w:ascii="Calibri" w:cs="Calibri" w:eastAsia="Calibri" w:hAnsi="Calibri"/>
+          <w:b/>
+          <w:bCs/>
+          <w:color w:val="1F3864"/>
+          <w:sz w:val="30"/>
+          <w:szCs w:val="30"/>
+        </w:rPr>
+        <w:t xml:space="preserve">11. Harsh-marker checklist</w:t>
+      </w:r>
+    </w:p>
+    <w:p>
+      <w:pPr>
+        <w:pStyle w:val="Heading3"/>
+        <w:spacing w:after="80" w:before="140"/>
+      </w:pPr>
+      <w:r>
+        <w:rPr>
+          <w:rFonts w:ascii="Calibri" w:cs="Calibri" w:eastAsia="Calibri" w:hAnsi="Calibri"/>
+          <w:b/>
+          <w:bCs/>
+          <w:sz w:val="22"/>
+          <w:szCs w:val="22"/>
+        </w:rPr>
+        <w:t xml:space="preserve">Include</w:t>
       </w:r>
     </w:p>
     <w:p>
@@ -8834,7 +11226,7 @@
           <w:sz w:val="21"/>
           <w:szCs w:val="21"/>
         </w:rPr>
-        <w:t xml:space="preserve">A stated limit for every theory, and a stated limit for your own data.</w:t>
+        <w:t xml:space="preserve">Thesis and recommendation in the first 30 words.</w:t>
       </w:r>
     </w:p>
     <w:p>
@@ -8852,7 +11244,7 @@
           <w:sz w:val="21"/>
           <w:szCs w:val="21"/>
         </w:rPr>
-        <w:t xml:space="preserve">Conflicting data acknowledged (growth forecasts, coffee-trade years).</w:t>
+        <w:t xml:space="preserve">One integrated argument: RBV → OLI → institutions → distance → culture → stage gates.</w:t>
       </w:r>
     </w:p>
     <w:p>
@@ -8870,7 +11262,7 @@
           <w:sz w:val="21"/>
           <w:szCs w:val="21"/>
         </w:rPr>
-        <w:t xml:space="preserve">Number plus consequence for every statistic.</w:t>
+        <w:t xml:space="preserve">A stated limit for every theory, and a stated limit for your own data.</w:t>
       </w:r>
     </w:p>
     <w:p>
@@ -8888,7 +11280,7 @@
           <w:sz w:val="21"/>
           <w:szCs w:val="21"/>
         </w:rPr>
-        <w:t xml:space="preserve">All six Hofstede dimensions, grouped by management function.</w:t>
+        <w:t xml:space="preserve">Conflicting data acknowledged (growth forecasts, coffee-trade years).</w:t>
       </w:r>
     </w:p>
     <w:p>
@@ -8906,7 +11298,7 @@
           <w:sz w:val="21"/>
           <w:szCs w:val="21"/>
         </w:rPr>
-        <w:t xml:space="preserve">Reverse learning and a clear monitoring line in the conclusion.</w:t>
+        <w:t xml:space="preserve">Number plus consequence for every statistic.</w:t>
       </w:r>
     </w:p>
     <w:p>
@@ -8924,23 +11316,7 @@
           <w:sz w:val="21"/>
           <w:szCs w:val="21"/>
         </w:rPr>
-        <w:t xml:space="preserve">Hedged wording where evidence is weak (“suggests”, “is likely to”).</w:t>
-      </w:r>
-    </w:p>
-    <w:p>
-      <w:pPr>
-        <w:pStyle w:val="Heading3"/>
-        <w:spacing w:after="80" w:before="140"/>
-      </w:pPr>
-      <w:r>
-        <w:rPr>
-          <w:rFonts w:ascii="Calibri" w:cs="Calibri" w:eastAsia="Calibri" w:hAnsi="Calibri"/>
-          <w:b/>
-          <w:bCs/>
-          <w:sz w:val="22"/>
-          <w:szCs w:val="22"/>
-        </w:rPr>
-        <w:t xml:space="preserve">Remove or avoid</w:t>
+        <w:t xml:space="preserve">All six Hofstede dimensions, grouped by management function.</w:t>
       </w:r>
     </w:p>
     <w:p>
@@ -8958,7 +11334,7 @@
           <w:sz w:val="21"/>
           <w:szCs w:val="21"/>
         </w:rPr>
-        <w:t xml:space="preserve">Theory definitions and Starbucks history.</w:t>
+        <w:t xml:space="preserve">Reverse learning and a clear monitoring line in the conclusion.</w:t>
       </w:r>
     </w:p>
     <w:p>
@@ -8976,7 +11352,7 @@
           <w:sz w:val="21"/>
           <w:szCs w:val="21"/>
         </w:rPr>
-        <w:t xml:space="preserve">Invented Hofstede scores or any unsourced number.</w:t>
+        <w:t xml:space="preserve">Tourism treated critically: scale, low spend, seasonality and segment differences, with hypotheses labelled as hypotheses.</w:t>
       </w:r>
     </w:p>
     <w:p>
@@ -8994,7 +11370,23 @@
           <w:sz w:val="21"/>
           <w:szCs w:val="21"/>
         </w:rPr>
-        <w:t xml:space="preserve">Generic claims (“culture is important”).</w:t>
+        <w:t xml:space="preserve">Hedged wording where evidence is weak (“suggests”, “is likely to”).</w:t>
+      </w:r>
+    </w:p>
+    <w:p>
+      <w:pPr>
+        <w:pStyle w:val="Heading3"/>
+        <w:spacing w:after="80" w:before="140"/>
+      </w:pPr>
+      <w:r>
+        <w:rPr>
+          <w:rFonts w:ascii="Calibri" w:cs="Calibri" w:eastAsia="Calibri" w:hAnsi="Calibri"/>
+          <w:b/>
+          <w:bCs/>
+          <w:sz w:val="22"/>
+          <w:szCs w:val="22"/>
+        </w:rPr>
+        <w:t xml:space="preserve">Remove or avoid</w:t>
       </w:r>
     </w:p>
     <w:p>
@@ -9012,7 +11404,7 @@
           <w:sz w:val="21"/>
           <w:szCs w:val="21"/>
         </w:rPr>
-        <w:t xml:space="preserve">More than one internal framework.</w:t>
+        <w:t xml:space="preserve">Theory definitions and Starbucks history.</w:t>
       </w:r>
     </w:p>
     <w:p>
@@ -9030,7 +11422,7 @@
           <w:sz w:val="21"/>
           <w:szCs w:val="21"/>
         </w:rPr>
-        <w:t xml:space="preserve">New evidence in the conclusion.</w:t>
+        <w:t xml:space="preserve">Invented Hofstede scores or any unsourced number.</w:t>
       </w:r>
     </w:p>
     <w:p>
@@ -9048,6 +11440,60 @@
           <w:sz w:val="21"/>
           <w:szCs w:val="21"/>
         </w:rPr>
+        <w:t xml:space="preserve">Generic claims (“culture is important”).</w:t>
+      </w:r>
+    </w:p>
+    <w:p>
+      <w:pPr>
+        <w:pStyle w:val="ListParagraph"/>
+        <w:numPr>
+          <w:ilvl w:val="0"/>
+          <w:numId w:val="2"/>
+        </w:numPr>
+        <w:spacing w:after="60"/>
+      </w:pPr>
+      <w:r>
+        <w:rPr>
+          <w:rFonts w:ascii="Calibri" w:cs="Calibri" w:eastAsia="Calibri" w:hAnsi="Calibri"/>
+          <w:sz w:val="21"/>
+          <w:szCs w:val="21"/>
+        </w:rPr>
+        <w:t xml:space="preserve">More than one internal framework.</w:t>
+      </w:r>
+    </w:p>
+    <w:p>
+      <w:pPr>
+        <w:pStyle w:val="ListParagraph"/>
+        <w:numPr>
+          <w:ilvl w:val="0"/>
+          <w:numId w:val="2"/>
+        </w:numPr>
+        <w:spacing w:after="60"/>
+      </w:pPr>
+      <w:r>
+        <w:rPr>
+          <w:rFonts w:ascii="Calibri" w:cs="Calibri" w:eastAsia="Calibri" w:hAnsi="Calibri"/>
+          <w:sz w:val="21"/>
+          <w:szCs w:val="21"/>
+        </w:rPr>
+        <w:t xml:space="preserve">New evidence in the conclusion.</w:t>
+      </w:r>
+    </w:p>
+    <w:p>
+      <w:pPr>
+        <w:pStyle w:val="ListParagraph"/>
+        <w:numPr>
+          <w:ilvl w:val="0"/>
+          <w:numId w:val="2"/>
+        </w:numPr>
+        <w:spacing w:after="60"/>
+      </w:pPr>
+      <w:r>
+        <w:rPr>
+          <w:rFonts w:ascii="Calibri" w:cs="Calibri" w:eastAsia="Calibri" w:hAnsi="Calibri"/>
+          <w:sz w:val="21"/>
+          <w:szCs w:val="21"/>
+        </w:rPr>
         <w:t xml:space="preserve">Name or contact details (SRN only); anything over 1,000 words.</w:t>
       </w:r>
     </w:p>
@@ -9065,7 +11511,7 @@
           <w:sz w:val="30"/>
           <w:szCs w:val="30"/>
         </w:rPr>
-        <w:t xml:space="preserve">11. Compliance, working order and AI warning</w:t>
+        <w:t xml:space="preserve">12. Compliance, working order and AI warning</w:t>
       </w:r>
     </w:p>
     <w:p>
@@ -9260,7 +11706,7 @@
           <w:sz w:val="30"/>
           <w:szCs w:val="30"/>
         </w:rPr>
-        <w:t xml:space="preserve">12. Sources used for this blueprint</w:t>
+        <w:t xml:space="preserve">13. Sources used for this blueprint</w:t>
       </w:r>
     </w:p>
     <w:p>
@@ -9272,7 +11718,7 @@
         </w:numPr>
         <w:spacing w:after="40"/>
       </w:pPr>
-      <w:hyperlink w:history="1" r:id="rIdaplyseuc0c1zwzgwgcccg">
+      <w:hyperlink w:history="1" r:id="rIdhlrm95mqgyifv7aueej_x">
         <w:r>
           <w:rPr>
             <w:rStyle w:val="Hyperlink"/>
@@ -9293,7 +11739,7 @@
         </w:numPr>
         <w:spacing w:after="40"/>
       </w:pPr>
-      <w:hyperlink w:history="1" r:id="rId7xt9otpyldwkjgmohapfr">
+      <w:hyperlink w:history="1" r:id="rIdmdqdche85y91voay8xeew">
         <w:r>
           <w:rPr>
             <w:rStyle w:val="Hyperlink"/>
@@ -9314,7 +11760,7 @@
         </w:numPr>
         <w:spacing w:after="40"/>
       </w:pPr>
-      <w:hyperlink w:history="1" r:id="rId6eoff4ms-b6slizhjrfre">
+      <w:hyperlink w:history="1" r:id="rIdsjcxnn8k5z99yqtmd-nee">
         <w:r>
           <w:rPr>
             <w:rStyle w:val="Hyperlink"/>
@@ -9335,7 +11781,7 @@
         </w:numPr>
         <w:spacing w:after="40"/>
       </w:pPr>
-      <w:hyperlink w:history="1" r:id="rId3recyiczjdso-laj7hktd">
+      <w:hyperlink w:history="1" r:id="rId8aqh6vcppx1ohtmuvnzqa">
         <w:r>
           <w:rPr>
             <w:rStyle w:val="Hyperlink"/>
@@ -9356,7 +11802,7 @@
         </w:numPr>
         <w:spacing w:after="40"/>
       </w:pPr>
-      <w:hyperlink w:history="1" r:id="rId5otod2bnxvjyh9cdy19rq">
+      <w:hyperlink w:history="1" r:id="rId9_hg4a7xnokh8srm6pdo7">
         <w:r>
           <w:rPr>
             <w:rStyle w:val="Hyperlink"/>
@@ -9377,7 +11823,7 @@
         </w:numPr>
         <w:spacing w:after="40"/>
       </w:pPr>
-      <w:hyperlink w:history="1" r:id="rIdhynqtb50prkt_maqpztiq">
+      <w:hyperlink w:history="1" r:id="rIdhjznuhsqrzbitsq0ewzsg">
         <w:r>
           <w:rPr>
             <w:rStyle w:val="Hyperlink"/>
@@ -9398,7 +11844,7 @@
         </w:numPr>
         <w:spacing w:after="40"/>
       </w:pPr>
-      <w:hyperlink w:history="1" r:id="rIda4efffxqbjg9zmucimovo">
+      <w:hyperlink w:history="1" r:id="rIdehd3cfhoqv1wshjqi1gx7">
         <w:r>
           <w:rPr>
             <w:rStyle w:val="Hyperlink"/>
@@ -9419,7 +11865,7 @@
         </w:numPr>
         <w:spacing w:after="40"/>
       </w:pPr>
-      <w:hyperlink w:history="1" r:id="rIdywu05topsxofj-q5wozyn">
+      <w:hyperlink w:history="1" r:id="rIdgaomok-dvy3n16mvngerh">
         <w:r>
           <w:rPr>
             <w:rStyle w:val="Hyperlink"/>
@@ -9440,7 +11886,7 @@
         </w:numPr>
         <w:spacing w:after="40"/>
       </w:pPr>
-      <w:hyperlink w:history="1" r:id="rIdhb6mqesal3vq_-kcka9ll">
+      <w:hyperlink w:history="1" r:id="rIdnqlqvr2amzrvublabpivb">
         <w:r>
           <w:rPr>
             <w:rStyle w:val="Hyperlink"/>
@@ -9461,7 +11907,7 @@
         </w:numPr>
         <w:spacing w:after="40"/>
       </w:pPr>
-      <w:hyperlink w:history="1" r:id="rId1uldmuj-c4tny82yaidhv">
+      <w:hyperlink w:history="1" r:id="rIdof1ojpmlo8ucozyovvaww">
         <w:r>
           <w:rPr>
             <w:rStyle w:val="Hyperlink"/>
@@ -9482,7 +11928,7 @@
         </w:numPr>
         <w:spacing w:after="40"/>
       </w:pPr>
-      <w:hyperlink w:history="1" r:id="rIdkqhajhlandnvzpxzsbnz9">
+      <w:hyperlink w:history="1" r:id="rIdtztbcejpm9q1d4hj0r94t">
         <w:r>
           <w:rPr>
             <w:rStyle w:val="Hyperlink"/>
@@ -9503,7 +11949,7 @@
         </w:numPr>
         <w:spacing w:after="40"/>
       </w:pPr>
-      <w:hyperlink w:history="1" r:id="rId1zeagq4t95iewfrzhynct">
+      <w:hyperlink w:history="1" r:id="rId646ib_tag6auaihrr6fjm">
         <w:r>
           <w:rPr>
             <w:rStyle w:val="Hyperlink"/>
@@ -9524,7 +11970,7 @@
         </w:numPr>
         <w:spacing w:after="40"/>
       </w:pPr>
-      <w:hyperlink w:history="1" r:id="rIdhjzs2o_w2mdkjf3iz1kpv">
+      <w:hyperlink w:history="1" r:id="rId095dwhc-9br_6vr7zdkob">
         <w:r>
           <w:rPr>
             <w:rStyle w:val="Hyperlink"/>
@@ -9545,7 +11991,70 @@
         </w:numPr>
         <w:spacing w:after="40"/>
       </w:pPr>
-      <w:hyperlink w:history="1" r:id="rIdp6f1x5sa5uot7_6pwnrgf">
+      <w:hyperlink w:history="1" r:id="rIdoqrxqqfxkjkipsur1pqsa">
+        <w:r>
+          <w:rPr>
+            <w:rStyle w:val="Hyperlink"/>
+            <w:rFonts w:ascii="Calibri" w:cs="Calibri" w:eastAsia="Calibri" w:hAnsi="Calibri"/>
+            <w:sz w:val="19"/>
+            <w:szCs w:val="19"/>
+          </w:rPr>
+          <w:t xml:space="preserve">Kathmandu Post – tourists staying longer, spending less</w:t>
+        </w:r>
+      </w:hyperlink>
+    </w:p>
+    <w:p>
+      <w:pPr>
+        <w:pStyle w:val="ListParagraph"/>
+        <w:numPr>
+          <w:ilvl w:val="0"/>
+          <w:numId w:val="2"/>
+        </w:numPr>
+        <w:spacing w:after="40"/>
+      </w:pPr>
+      <w:hyperlink w:history="1" r:id="rIdtmzb353snrlhtnc2r9dv2">
+        <w:r>
+          <w:rPr>
+            <w:rStyle w:val="Hyperlink"/>
+            <w:rFonts w:ascii="Calibri" w:cs="Calibri" w:eastAsia="Calibri" w:hAnsi="Calibri"/>
+            <w:sz w:val="19"/>
+            <w:szCs w:val="19"/>
+          </w:rPr>
+          <w:t xml:space="preserve">Ekantipur – Kathmandu airport 2025 passenger numbers</w:t>
+        </w:r>
+      </w:hyperlink>
+    </w:p>
+    <w:p>
+      <w:pPr>
+        <w:pStyle w:val="ListParagraph"/>
+        <w:numPr>
+          <w:ilvl w:val="0"/>
+          <w:numId w:val="2"/>
+        </w:numPr>
+        <w:spacing w:after="40"/>
+      </w:pPr>
+      <w:hyperlink w:history="1" r:id="rIdodeopcy-xd_pr_xigq36y">
+        <w:r>
+          <w:rPr>
+            <w:rStyle w:val="Hyperlink"/>
+            <w:rFonts w:ascii="Calibri" w:cs="Calibri" w:eastAsia="Calibri" w:hAnsi="Calibri"/>
+            <w:sz w:val="19"/>
+            <w:szCs w:val="19"/>
+          </w:rPr>
+          <w:t xml:space="preserve">Sharesansar – September 2025 arrivals</w:t>
+        </w:r>
+      </w:hyperlink>
+    </w:p>
+    <w:p>
+      <w:pPr>
+        <w:pStyle w:val="ListParagraph"/>
+        <w:numPr>
+          <w:ilvl w:val="0"/>
+          <w:numId w:val="2"/>
+        </w:numPr>
+        <w:spacing w:after="40"/>
+      </w:pPr>
+      <w:hyperlink w:history="1" r:id="rIdbze6csssbbgus0dfchwq3">
         <w:r>
           <w:rPr>
             <w:rStyle w:val="Hyperlink"/>
@@ -9566,7 +12075,7 @@
         </w:numPr>
         <w:spacing w:after="40"/>
       </w:pPr>
-      <w:hyperlink w:history="1" r:id="rIdivu-81dryfy6sktmzsax0">
+      <w:hyperlink w:history="1" r:id="rIdzqviof7augysewhipowib">
         <w:r>
           <w:rPr>
             <w:rStyle w:val="Hyperlink"/>
@@ -9587,7 +12096,7 @@
         </w:numPr>
         <w:spacing w:after="40"/>
       </w:pPr>
-      <w:hyperlink w:history="1" r:id="rIdzfghivvkaqpugqhnscgiw">
+      <w:hyperlink w:history="1" r:id="rIdj9uwa8vbcq9x7a1m-dxbp">
         <w:r>
           <w:rPr>
             <w:rStyle w:val="Hyperlink"/>
@@ -9608,7 +12117,7 @@
         </w:numPr>
         <w:spacing w:after="40"/>
       </w:pPr>
-      <w:hyperlink w:history="1" r:id="rIdg4sjaphism4qpqcjhuklr">
+      <w:hyperlink w:history="1" r:id="rIdz-dvnpnrurbj4v6hs89oa">
         <w:r>
           <w:rPr>
             <w:rStyle w:val="Hyperlink"/>

</xml_diff>

<commit_message>
Make Nepal blueprint standalone
Co-Authored-By: Claude Sonnet 5.5 <noreply@anthropic.com>
Claude-Session: https://claude.ai/code/session_0111sQgAXXkFSZgwaRVLyatu
</commit_message>
<xml_diff>
--- a/Starbucks_Nepal_Blueprint.docx
+++ b/Starbucks_Nepal_Blueprint.docx
@@ -15,7 +15,7 @@
           <w:sz w:val="40"/>
           <w:szCs w:val="40"/>
         </w:rPr>
-        <w:t xml:space="preserve">Blueprint v3: Starbucks Expansion into Nepal (with tourism perspective)</w:t>
+        <w:t xml:space="preserve">Blueprint: Starbucks Expansion into Nepal</w:t>
       </w:r>
     </w:p>
     <w:p>
@@ -77,1152 +77,7 @@
           <w:sz w:val="30"/>
           <w:szCs w:val="30"/>
         </w:rPr>
-        <w:t xml:space="preserve">1. How this differs from the Nigeria blueprint</w:t>
-      </w:r>
-    </w:p>
-    <w:tbl>
-      <w:tblPr>
-        <w:tblW w:type="dxa" w:w="9638"/>
-        <w:tblBorders>
-          <w:top w:val="single" w:color="auto" w:sz="4"/>
-          <w:left w:val="single" w:color="auto" w:sz="4"/>
-          <w:bottom w:val="single" w:color="auto" w:sz="4"/>
-          <w:right w:val="single" w:color="auto" w:sz="4"/>
-          <w:insideH w:val="single" w:color="auto" w:sz="4"/>
-          <w:insideV w:val="single" w:color="auto" w:sz="4"/>
-        </w:tblBorders>
-      </w:tblPr>
-      <w:tblGrid>
-        <w:gridCol w:w="2000"/>
-        <w:gridCol w:w="3500"/>
-        <w:gridCol w:w="4138"/>
-      </w:tblGrid>
-      <w:tr>
-        <w:trPr>
-          <w:tblHeader/>
-        </w:trPr>
-        <w:tc>
-          <w:tcPr>
-            <w:tcW w:type="dxa" w:w="2000"/>
-            <w:tcBorders>
-              <w:top w:val="single" w:color="999999" w:sz="4"/>
-              <w:left w:val="single" w:color="999999" w:sz="4"/>
-              <w:bottom w:val="single" w:color="999999" w:sz="4"/>
-              <w:right w:val="single" w:color="999999" w:sz="4"/>
-            </w:tcBorders>
-            <w:shd w:fill="1F3864" w:color="auto" w:val="clear"/>
-            <w:tcMar>
-              <w:top w:type="dxa" w:w="60"/>
-              <w:left w:type="dxa" w:w="90"/>
-              <w:bottom w:type="dxa" w:w="60"/>
-              <w:right w:type="dxa" w:w="90"/>
-            </w:tcMar>
-          </w:tcPr>
-          <w:p>
-            <w:r>
-              <w:rPr>
-                <w:rFonts w:ascii="Calibri" w:cs="Calibri" w:eastAsia="Calibri" w:hAnsi="Calibri"/>
-                <w:b/>
-                <w:bCs/>
-                <w:color w:val="FFFFFF"/>
-                <w:sz w:val="19"/>
-                <w:szCs w:val="19"/>
-              </w:rPr>
-              <w:t xml:space="preserve">Element</w:t>
-            </w:r>
-          </w:p>
-        </w:tc>
-        <w:tc>
-          <w:tcPr>
-            <w:tcW w:type="dxa" w:w="3500"/>
-            <w:tcBorders>
-              <w:top w:val="single" w:color="999999" w:sz="4"/>
-              <w:left w:val="single" w:color="999999" w:sz="4"/>
-              <w:bottom w:val="single" w:color="999999" w:sz="4"/>
-              <w:right w:val="single" w:color="999999" w:sz="4"/>
-            </w:tcBorders>
-            <w:shd w:fill="1F3864" w:color="auto" w:val="clear"/>
-            <w:tcMar>
-              <w:top w:type="dxa" w:w="60"/>
-              <w:left w:type="dxa" w:w="90"/>
-              <w:bottom w:type="dxa" w:w="60"/>
-              <w:right w:type="dxa" w:w="90"/>
-            </w:tcMar>
-          </w:tcPr>
-          <w:p>
-            <w:r>
-              <w:rPr>
-                <w:rFonts w:ascii="Calibri" w:cs="Calibri" w:eastAsia="Calibri" w:hAnsi="Calibri"/>
-                <w:b/>
-                <w:bCs/>
-                <w:color w:val="FFFFFF"/>
-                <w:sz w:val="19"/>
-                <w:szCs w:val="19"/>
-              </w:rPr>
-              <w:t xml:space="preserve">Nigeria version</w:t>
-            </w:r>
-          </w:p>
-        </w:tc>
-        <w:tc>
-          <w:tcPr>
-            <w:tcW w:type="dxa" w:w="4138"/>
-            <w:tcBorders>
-              <w:top w:val="single" w:color="999999" w:sz="4"/>
-              <w:left w:val="single" w:color="999999" w:sz="4"/>
-              <w:bottom w:val="single" w:color="999999" w:sz="4"/>
-              <w:right w:val="single" w:color="999999" w:sz="4"/>
-            </w:tcBorders>
-            <w:shd w:fill="1F3864" w:color="auto" w:val="clear"/>
-            <w:tcMar>
-              <w:top w:type="dxa" w:w="60"/>
-              <w:left w:type="dxa" w:w="90"/>
-              <w:bottom w:type="dxa" w:w="60"/>
-              <w:right w:type="dxa" w:w="90"/>
-            </w:tcMar>
-          </w:tcPr>
-          <w:p>
-            <w:r>
-              <w:rPr>
-                <w:rFonts w:ascii="Calibri" w:cs="Calibri" w:eastAsia="Calibri" w:hAnsi="Calibri"/>
-                <w:b/>
-                <w:bCs/>
-                <w:color w:val="FFFFFF"/>
-                <w:sz w:val="19"/>
-                <w:szCs w:val="19"/>
-              </w:rPr>
-              <w:t xml:space="preserve">Nepal version (this one)</w:t>
-            </w:r>
-          </w:p>
-        </w:tc>
-      </w:tr>
-      <w:tr>
-        <w:trPr>
-          <w:cantSplit/>
-        </w:trPr>
-        <w:tc>
-          <w:tcPr>
-            <w:tcW w:type="dxa" w:w="2000"/>
-            <w:tcBorders>
-              <w:top w:val="single" w:color="999999" w:sz="4"/>
-              <w:left w:val="single" w:color="999999" w:sz="4"/>
-              <w:bottom w:val="single" w:color="999999" w:sz="4"/>
-              <w:right w:val="single" w:color="999999" w:sz="4"/>
-            </w:tcBorders>
-            <w:tcMar>
-              <w:top w:type="dxa" w:w="60"/>
-              <w:left w:type="dxa" w:w="90"/>
-              <w:bottom w:type="dxa" w:w="60"/>
-              <w:right w:type="dxa" w:w="90"/>
-            </w:tcMar>
-          </w:tcPr>
-          <w:p>
-            <w:r>
-              <w:rPr>
-                <w:rFonts w:ascii="Calibri" w:cs="Calibri" w:eastAsia="Calibri" w:hAnsi="Calibri"/>
-                <w:b w:val="false"/>
-                <w:bCs w:val="false"/>
-                <w:sz w:val="19"/>
-                <w:szCs w:val="19"/>
-              </w:rPr>
-              <w:t xml:space="preserve">Core framing</w:t>
-            </w:r>
-          </w:p>
-        </w:tc>
-        <w:tc>
-          <w:tcPr>
-            <w:tcW w:type="dxa" w:w="3500"/>
-            <w:tcBorders>
-              <w:top w:val="single" w:color="999999" w:sz="4"/>
-              <w:left w:val="single" w:color="999999" w:sz="4"/>
-              <w:bottom w:val="single" w:color="999999" w:sz="4"/>
-              <w:right w:val="single" w:color="999999" w:sz="4"/>
-            </w:tcBorders>
-            <w:tcMar>
-              <w:top w:type="dxa" w:w="60"/>
-              <w:left w:type="dxa" w:w="90"/>
-              <w:bottom w:type="dxa" w:w="60"/>
-              <w:right w:type="dxa" w:w="90"/>
-            </w:tcMar>
-          </w:tcPr>
-          <w:p>
-            <w:r>
-              <w:rPr>
-                <w:rFonts w:ascii="Calibri" w:cs="Calibri" w:eastAsia="Calibri" w:hAnsi="Calibri"/>
-                <w:b w:val="false"/>
-                <w:bCs w:val="false"/>
-                <w:sz w:val="19"/>
-                <w:szCs w:val="19"/>
-              </w:rPr>
-              <w:t xml:space="preserve">Brand-led entry; partner model manages risk</w:t>
-            </w:r>
-          </w:p>
-        </w:tc>
-        <w:tc>
-          <w:tcPr>
-            <w:tcW w:type="dxa" w:w="4138"/>
-            <w:tcBorders>
-              <w:top w:val="single" w:color="999999" w:sz="4"/>
-              <w:left w:val="single" w:color="999999" w:sz="4"/>
-              <w:bottom w:val="single" w:color="999999" w:sz="4"/>
-              <w:right w:val="single" w:color="999999" w:sz="4"/>
-            </w:tcBorders>
-            <w:tcMar>
-              <w:top w:type="dxa" w:w="60"/>
-              <w:left w:type="dxa" w:w="90"/>
-              <w:bottom w:type="dxa" w:w="60"/>
-              <w:right w:type="dxa" w:w="90"/>
-            </w:tcMar>
-          </w:tcPr>
-          <w:p>
-            <w:r>
-              <w:rPr>
-                <w:rFonts w:ascii="Calibri" w:cs="Calibri" w:eastAsia="Calibri" w:hAnsi="Calibri"/>
-                <w:b w:val="false"/>
-                <w:bCs w:val="false"/>
-                <w:sz w:val="19"/>
-                <w:szCs w:val="19"/>
-              </w:rPr>
-              <w:t xml:space="preserve">“Buyer before seller”: a sourcing-led, staged, real-options entry. Nepal is a strategic option, not a volume market.</w:t>
-            </w:r>
-          </w:p>
-        </w:tc>
-      </w:tr>
-      <w:tr>
-        <w:trPr>
-          <w:cantSplit/>
-        </w:trPr>
-        <w:tc>
-          <w:tcPr>
-            <w:tcW w:type="dxa" w:w="2000"/>
-            <w:tcBorders>
-              <w:top w:val="single" w:color="999999" w:sz="4"/>
-              <w:left w:val="single" w:color="999999" w:sz="4"/>
-              <w:bottom w:val="single" w:color="999999" w:sz="4"/>
-              <w:right w:val="single" w:color="999999" w:sz="4"/>
-            </w:tcBorders>
-            <w:tcMar>
-              <w:top w:type="dxa" w:w="60"/>
-              <w:left w:type="dxa" w:w="90"/>
-              <w:bottom w:type="dxa" w:w="60"/>
-              <w:right w:type="dxa" w:w="90"/>
-            </w:tcMar>
-          </w:tcPr>
-          <w:p>
-            <w:r>
-              <w:rPr>
-                <w:rFonts w:ascii="Calibri" w:cs="Calibri" w:eastAsia="Calibri" w:hAnsi="Calibri"/>
-                <w:b w:val="false"/>
-                <w:bCs w:val="false"/>
-                <w:sz w:val="19"/>
-                <w:szCs w:val="19"/>
-              </w:rPr>
-              <w:t xml:space="preserve">Demand logic</w:t>
-            </w:r>
-          </w:p>
-        </w:tc>
-        <w:tc>
-          <w:tcPr>
-            <w:tcW w:type="dxa" w:w="3500"/>
-            <w:tcBorders>
-              <w:top w:val="single" w:color="999999" w:sz="4"/>
-              <w:left w:val="single" w:color="999999" w:sz="4"/>
-              <w:bottom w:val="single" w:color="999999" w:sz="4"/>
-              <w:right w:val="single" w:color="999999" w:sz="4"/>
-            </w:tcBorders>
-            <w:tcMar>
-              <w:top w:type="dxa" w:w="60"/>
-              <w:left w:type="dxa" w:w="90"/>
-              <w:bottom w:type="dxa" w:w="60"/>
-              <w:right w:type="dxa" w:w="90"/>
-            </w:tcMar>
-          </w:tcPr>
-          <w:p>
-            <w:r>
-              <w:rPr>
-                <w:rFonts w:ascii="Calibri" w:cs="Calibri" w:eastAsia="Calibri" w:hAnsi="Calibri"/>
-                <w:b w:val="false"/>
-                <w:bCs w:val="false"/>
-                <w:sz w:val="19"/>
-                <w:szCs w:val="19"/>
-              </w:rPr>
-              <w:t xml:space="preserve">Young urban middle class</w:t>
-            </w:r>
-          </w:p>
-        </w:tc>
-        <w:tc>
-          <w:tcPr>
-            <w:tcW w:type="dxa" w:w="4138"/>
-            <w:tcBorders>
-              <w:top w:val="single" w:color="999999" w:sz="4"/>
-              <w:left w:val="single" w:color="999999" w:sz="4"/>
-              <w:bottom w:val="single" w:color="999999" w:sz="4"/>
-              <w:right w:val="single" w:color="999999" w:sz="4"/>
-            </w:tcBorders>
-            <w:tcMar>
-              <w:top w:type="dxa" w:w="60"/>
-              <w:left w:type="dxa" w:w="90"/>
-              <w:bottom w:type="dxa" w:w="60"/>
-              <w:right w:type="dxa" w:w="90"/>
-            </w:tcMar>
-          </w:tcPr>
-          <w:p>
-            <w:r>
-              <w:rPr>
-                <w:rFonts w:ascii="Calibri" w:cs="Calibri" w:eastAsia="Calibri" w:hAnsi="Calibri"/>
-                <w:b w:val="false"/>
-                <w:bCs w:val="false"/>
-                <w:sz w:val="19"/>
-                <w:szCs w:val="19"/>
-              </w:rPr>
-              <w:t xml:space="preserve">Dual demand base: inbound tourists plus remittance-supported urban households; tourism treated as its own perspective (Section 7)</w:t>
-            </w:r>
-          </w:p>
-        </w:tc>
-      </w:tr>
-      <w:tr>
-        <w:trPr>
-          <w:cantSplit/>
-        </w:trPr>
-        <w:tc>
-          <w:tcPr>
-            <w:tcW w:type="dxa" w:w="2000"/>
-            <w:tcBorders>
-              <w:top w:val="single" w:color="999999" w:sz="4"/>
-              <w:left w:val="single" w:color="999999" w:sz="4"/>
-              <w:bottom w:val="single" w:color="999999" w:sz="4"/>
-              <w:right w:val="single" w:color="999999" w:sz="4"/>
-            </w:tcBorders>
-            <w:tcMar>
-              <w:top w:type="dxa" w:w="60"/>
-              <w:left w:type="dxa" w:w="90"/>
-              <w:bottom w:type="dxa" w:w="60"/>
-              <w:right w:type="dxa" w:w="90"/>
-            </w:tcMar>
-          </w:tcPr>
-          <w:p>
-            <w:r>
-              <w:rPr>
-                <w:rFonts w:ascii="Calibri" w:cs="Calibri" w:eastAsia="Calibri" w:hAnsi="Calibri"/>
-                <w:b w:val="false"/>
-                <w:bCs w:val="false"/>
-                <w:sz w:val="19"/>
-                <w:szCs w:val="19"/>
-              </w:rPr>
-              <w:t xml:space="preserve">Thesis type</w:t>
-            </w:r>
-          </w:p>
-        </w:tc>
-        <w:tc>
-          <w:tcPr>
-            <w:tcW w:type="dxa" w:w="3500"/>
-            <w:tcBorders>
-              <w:top w:val="single" w:color="999999" w:sz="4"/>
-              <w:left w:val="single" w:color="999999" w:sz="4"/>
-              <w:bottom w:val="single" w:color="999999" w:sz="4"/>
-              <w:right w:val="single" w:color="999999" w:sz="4"/>
-            </w:tcBorders>
-            <w:tcMar>
-              <w:top w:type="dxa" w:w="60"/>
-              <w:left w:type="dxa" w:w="90"/>
-              <w:bottom w:type="dxa" w:w="60"/>
-              <w:right w:type="dxa" w:w="90"/>
-            </w:tcMar>
-          </w:tcPr>
-          <w:p>
-            <w:r>
-              <w:rPr>
-                <w:rFonts w:ascii="Calibri" w:cs="Calibri" w:eastAsia="Calibri" w:hAnsi="Calibri"/>
-                <w:b w:val="false"/>
-                <w:bCs w:val="false"/>
-                <w:sz w:val="19"/>
-                <w:szCs w:val="19"/>
-              </w:rPr>
-              <w:t xml:space="preserve">Recommend entry + partner model</w:t>
-            </w:r>
-          </w:p>
-        </w:tc>
-        <w:tc>
-          <w:tcPr>
-            <w:tcW w:type="dxa" w:w="4138"/>
-            <w:tcBorders>
-              <w:top w:val="single" w:color="999999" w:sz="4"/>
-              <w:left w:val="single" w:color="999999" w:sz="4"/>
-              <w:bottom w:val="single" w:color="999999" w:sz="4"/>
-              <w:right w:val="single" w:color="999999" w:sz="4"/>
-            </w:tcBorders>
-            <w:tcMar>
-              <w:top w:type="dxa" w:w="60"/>
-              <w:left w:type="dxa" w:w="90"/>
-              <w:bottom w:type="dxa" w:w="60"/>
-              <w:right w:type="dxa" w:w="90"/>
-            </w:tcMar>
-          </w:tcPr>
-          <w:p>
-            <w:r>
-              <w:rPr>
-                <w:rFonts w:ascii="Calibri" w:cs="Calibri" w:eastAsia="Calibri" w:hAnsi="Calibri"/>
-                <w:b w:val="false"/>
-                <w:bCs w:val="false"/>
-                <w:sz w:val="19"/>
-                <w:szCs w:val="19"/>
-              </w:rPr>
-              <w:t xml:space="preserve">Conditional recommendation with stage gates and kill criteria</w:t>
-            </w:r>
-          </w:p>
-        </w:tc>
-      </w:tr>
-      <w:tr>
-        <w:trPr>
-          <w:cantSplit/>
-        </w:trPr>
-        <w:tc>
-          <w:tcPr>
-            <w:tcW w:type="dxa" w:w="2000"/>
-            <w:tcBorders>
-              <w:top w:val="single" w:color="999999" w:sz="4"/>
-              <w:left w:val="single" w:color="999999" w:sz="4"/>
-              <w:bottom w:val="single" w:color="999999" w:sz="4"/>
-              <w:right w:val="single" w:color="999999" w:sz="4"/>
-            </w:tcBorders>
-            <w:tcMar>
-              <w:top w:type="dxa" w:w="60"/>
-              <w:left w:type="dxa" w:w="90"/>
-              <w:bottom w:type="dxa" w:w="60"/>
-              <w:right w:type="dxa" w:w="90"/>
-            </w:tcMar>
-          </w:tcPr>
-          <w:p>
-            <w:r>
-              <w:rPr>
-                <w:rFonts w:ascii="Calibri" w:cs="Calibri" w:eastAsia="Calibri" w:hAnsi="Calibri"/>
-                <w:b w:val="false"/>
-                <w:bCs w:val="false"/>
-                <w:sz w:val="19"/>
-                <w:szCs w:val="19"/>
-              </w:rPr>
-              <w:t xml:space="preserve">AC1 organisation</w:t>
-            </w:r>
-          </w:p>
-        </w:tc>
-        <w:tc>
-          <w:tcPr>
-            <w:tcW w:type="dxa" w:w="3500"/>
-            <w:tcBorders>
-              <w:top w:val="single" w:color="999999" w:sz="4"/>
-              <w:left w:val="single" w:color="999999" w:sz="4"/>
-              <w:bottom w:val="single" w:color="999999" w:sz="4"/>
-              <w:right w:val="single" w:color="999999" w:sz="4"/>
-            </w:tcBorders>
-            <w:tcMar>
-              <w:top w:type="dxa" w:w="60"/>
-              <w:left w:type="dxa" w:w="90"/>
-              <w:bottom w:type="dxa" w:w="60"/>
-              <w:right w:type="dxa" w:w="90"/>
-            </w:tcMar>
-          </w:tcPr>
-          <w:p>
-            <w:r>
-              <w:rPr>
-                <w:rFonts w:ascii="Calibri" w:cs="Calibri" w:eastAsia="Calibri" w:hAnsi="Calibri"/>
-                <w:b w:val="false"/>
-                <w:bCs w:val="false"/>
-                <w:sz w:val="19"/>
-                <w:szCs w:val="19"/>
-              </w:rPr>
-              <w:t xml:space="preserve">Theory-led (1a, 1b VRIO table, 1c OLI + IT)</w:t>
-            </w:r>
-          </w:p>
-        </w:tc>
-        <w:tc>
-          <w:tcPr>
-            <w:tcW w:type="dxa" w:w="4138"/>
-            <w:tcBorders>
-              <w:top w:val="single" w:color="999999" w:sz="4"/>
-              <w:left w:val="single" w:color="999999" w:sz="4"/>
-              <w:bottom w:val="single" w:color="999999" w:sz="4"/>
-              <w:right w:val="single" w:color="999999" w:sz="4"/>
-            </w:tcBorders>
-            <w:tcMar>
-              <w:top w:type="dxa" w:w="60"/>
-              <w:left w:type="dxa" w:w="90"/>
-              <w:bottom w:type="dxa" w:w="60"/>
-              <w:right w:type="dxa" w:w="90"/>
-            </w:tcMar>
-          </w:tcPr>
-          <w:p>
-            <w:r>
-              <w:rPr>
-                <w:rFonts w:ascii="Calibri" w:cs="Calibri" w:eastAsia="Calibri" w:hAnsi="Calibri"/>
-                <w:b w:val="false"/>
-                <w:bCs w:val="false"/>
-                <w:sz w:val="19"/>
-                <w:szCs w:val="19"/>
-              </w:rPr>
-              <w:t xml:space="preserve">Question-led: why this move, which advantages travel, why this entry route</w:t>
-            </w:r>
-          </w:p>
-        </w:tc>
-      </w:tr>
-      <w:tr>
-        <w:trPr>
-          <w:cantSplit/>
-        </w:trPr>
-        <w:tc>
-          <w:tcPr>
-            <w:tcW w:type="dxa" w:w="2000"/>
-            <w:tcBorders>
-              <w:top w:val="single" w:color="999999" w:sz="4"/>
-              <w:left w:val="single" w:color="999999" w:sz="4"/>
-              <w:bottom w:val="single" w:color="999999" w:sz="4"/>
-              <w:right w:val="single" w:color="999999" w:sz="4"/>
-            </w:tcBorders>
-            <w:tcMar>
-              <w:top w:type="dxa" w:w="60"/>
-              <w:left w:type="dxa" w:w="90"/>
-              <w:bottom w:type="dxa" w:w="60"/>
-              <w:right w:type="dxa" w:w="90"/>
-            </w:tcMar>
-          </w:tcPr>
-          <w:p>
-            <w:r>
-              <w:rPr>
-                <w:rFonts w:ascii="Calibri" w:cs="Calibri" w:eastAsia="Calibri" w:hAnsi="Calibri"/>
-                <w:b w:val="false"/>
-                <w:bCs w:val="false"/>
-                <w:sz w:val="19"/>
-                <w:szCs w:val="19"/>
-              </w:rPr>
-              <w:t xml:space="preserve">Internal framework (ONE)</w:t>
-            </w:r>
-          </w:p>
-        </w:tc>
-        <w:tc>
-          <w:tcPr>
-            <w:tcW w:type="dxa" w:w="3500"/>
-            <w:tcBorders>
-              <w:top w:val="single" w:color="999999" w:sz="4"/>
-              <w:left w:val="single" w:color="999999" w:sz="4"/>
-              <w:bottom w:val="single" w:color="999999" w:sz="4"/>
-              <w:right w:val="single" w:color="999999" w:sz="4"/>
-            </w:tcBorders>
-            <w:tcMar>
-              <w:top w:type="dxa" w:w="60"/>
-              <w:left w:type="dxa" w:w="90"/>
-              <w:bottom w:type="dxa" w:w="60"/>
-              <w:right w:type="dxa" w:w="90"/>
-            </w:tcMar>
-          </w:tcPr>
-          <w:p>
-            <w:r>
-              <w:rPr>
-                <w:rFonts w:ascii="Calibri" w:cs="Calibri" w:eastAsia="Calibri" w:hAnsi="Calibri"/>
-                <w:b w:val="false"/>
-                <w:bCs w:val="false"/>
-                <w:sz w:val="19"/>
-                <w:szCs w:val="19"/>
-              </w:rPr>
-              <w:t xml:space="preserve">RBV/VRIO table</w:t>
-            </w:r>
-          </w:p>
-        </w:tc>
-        <w:tc>
-          <w:tcPr>
-            <w:tcW w:type="dxa" w:w="4138"/>
-            <w:tcBorders>
-              <w:top w:val="single" w:color="999999" w:sz="4"/>
-              <w:left w:val="single" w:color="999999" w:sz="4"/>
-              <w:bottom w:val="single" w:color="999999" w:sz="4"/>
-              <w:right w:val="single" w:color="999999" w:sz="4"/>
-            </w:tcBorders>
-            <w:tcMar>
-              <w:top w:type="dxa" w:w="60"/>
-              <w:left w:type="dxa" w:w="90"/>
-              <w:bottom w:type="dxa" w:w="60"/>
-              <w:right w:type="dxa" w:w="90"/>
-            </w:tcMar>
-          </w:tcPr>
-          <w:p>
-            <w:r>
-              <w:rPr>
-                <w:rFonts w:ascii="Calibri" w:cs="Calibri" w:eastAsia="Calibri" w:hAnsi="Calibri"/>
-                <w:b w:val="false"/>
-                <w:bCs w:val="false"/>
-                <w:sz w:val="19"/>
-                <w:szCs w:val="19"/>
-              </w:rPr>
-              <w:t xml:space="preserve">RBV tested for transferability: location-bound vs non-location-bound resources (Rugman and Verbeke, 2004)</w:t>
-            </w:r>
-          </w:p>
-        </w:tc>
-      </w:tr>
-      <w:tr>
-        <w:trPr>
-          <w:cantSplit/>
-        </w:trPr>
-        <w:tc>
-          <w:tcPr>
-            <w:tcW w:type="dxa" w:w="2000"/>
-            <w:tcBorders>
-              <w:top w:val="single" w:color="999999" w:sz="4"/>
-              <w:left w:val="single" w:color="999999" w:sz="4"/>
-              <w:bottom w:val="single" w:color="999999" w:sz="4"/>
-              <w:right w:val="single" w:color="999999" w:sz="4"/>
-            </w:tcBorders>
-            <w:tcMar>
-              <w:top w:type="dxa" w:w="60"/>
-              <w:left w:type="dxa" w:w="90"/>
-              <w:bottom w:type="dxa" w:w="60"/>
-              <w:right w:type="dxa" w:w="90"/>
-            </w:tcMar>
-          </w:tcPr>
-          <w:p>
-            <w:r>
-              <w:rPr>
-                <w:rFonts w:ascii="Calibri" w:cs="Calibri" w:eastAsia="Calibri" w:hAnsi="Calibri"/>
-                <w:b w:val="false"/>
-                <w:bCs w:val="false"/>
-                <w:sz w:val="19"/>
-                <w:szCs w:val="19"/>
-              </w:rPr>
-              <w:t xml:space="preserve">Entry logic</w:t>
-            </w:r>
-          </w:p>
-        </w:tc>
-        <w:tc>
-          <w:tcPr>
-            <w:tcW w:type="dxa" w:w="3500"/>
-            <w:tcBorders>
-              <w:top w:val="single" w:color="999999" w:sz="4"/>
-              <w:left w:val="single" w:color="999999" w:sz="4"/>
-              <w:bottom w:val="single" w:color="999999" w:sz="4"/>
-              <w:right w:val="single" w:color="999999" w:sz="4"/>
-            </w:tcBorders>
-            <w:tcMar>
-              <w:top w:type="dxa" w:w="60"/>
-              <w:left w:type="dxa" w:w="90"/>
-              <w:bottom w:type="dxa" w:w="60"/>
-              <w:right w:type="dxa" w:w="90"/>
-            </w:tcMar>
-          </w:tcPr>
-          <w:p>
-            <w:r>
-              <w:rPr>
-                <w:rFonts w:ascii="Calibri" w:cs="Calibri" w:eastAsia="Calibri" w:hAnsi="Calibri"/>
-                <w:b w:val="false"/>
-                <w:bCs w:val="false"/>
-                <w:sz w:val="19"/>
-                <w:szCs w:val="19"/>
-              </w:rPr>
-              <w:t xml:space="preserve">OLI + Scott/Kostova</w:t>
-            </w:r>
-          </w:p>
-        </w:tc>
-        <w:tc>
-          <w:tcPr>
-            <w:tcW w:type="dxa" w:w="4138"/>
-            <w:tcBorders>
-              <w:top w:val="single" w:color="999999" w:sz="4"/>
-              <w:left w:val="single" w:color="999999" w:sz="4"/>
-              <w:bottom w:val="single" w:color="999999" w:sz="4"/>
-              <w:right w:val="single" w:color="999999" w:sz="4"/>
-            </w:tcBorders>
-            <w:tcMar>
-              <w:top w:type="dxa" w:w="60"/>
-              <w:left w:type="dxa" w:w="90"/>
-              <w:bottom w:type="dxa" w:w="60"/>
-              <w:right w:type="dxa" w:w="90"/>
-            </w:tcMar>
-          </w:tcPr>
-          <w:p>
-            <w:r>
-              <w:rPr>
-                <w:rFonts w:ascii="Calibri" w:cs="Calibri" w:eastAsia="Calibri" w:hAnsi="Calibri"/>
-                <w:b w:val="false"/>
-                <w:bCs w:val="false"/>
-                <w:sz w:val="19"/>
-                <w:szCs w:val="19"/>
-              </w:rPr>
-              <w:t xml:space="preserve">OLI re-read as resource-seeking, plus Peng et al. (2008) institution-based view; legal form (FITTA “industrial activity” test) as a driver</w:t>
-            </w:r>
-          </w:p>
-        </w:tc>
-      </w:tr>
-      <w:tr>
-        <w:trPr>
-          <w:cantSplit/>
-        </w:trPr>
-        <w:tc>
-          <w:tcPr>
-            <w:tcW w:type="dxa" w:w="2000"/>
-            <w:tcBorders>
-              <w:top w:val="single" w:color="999999" w:sz="4"/>
-              <w:left w:val="single" w:color="999999" w:sz="4"/>
-              <w:bottom w:val="single" w:color="999999" w:sz="4"/>
-              <w:right w:val="single" w:color="999999" w:sz="4"/>
-            </w:tcBorders>
-            <w:tcMar>
-              <w:top w:type="dxa" w:w="60"/>
-              <w:left w:type="dxa" w:w="90"/>
-              <w:bottom w:type="dxa" w:w="60"/>
-              <w:right w:type="dxa" w:w="90"/>
-            </w:tcMar>
-          </w:tcPr>
-          <w:p>
-            <w:r>
-              <w:rPr>
-                <w:rFonts w:ascii="Calibri" w:cs="Calibri" w:eastAsia="Calibri" w:hAnsi="Calibri"/>
-                <w:b w:val="false"/>
-                <w:bCs w:val="false"/>
-                <w:sz w:val="19"/>
-                <w:szCs w:val="19"/>
-              </w:rPr>
-              <w:t xml:space="preserve">AC2 organisation</w:t>
-            </w:r>
-          </w:p>
-        </w:tc>
-        <w:tc>
-          <w:tcPr>
-            <w:tcW w:type="dxa" w:w="3500"/>
-            <w:tcBorders>
-              <w:top w:val="single" w:color="999999" w:sz="4"/>
-              <w:left w:val="single" w:color="999999" w:sz="4"/>
-              <w:bottom w:val="single" w:color="999999" w:sz="4"/>
-              <w:right w:val="single" w:color="999999" w:sz="4"/>
-            </w:tcBorders>
-            <w:tcMar>
-              <w:top w:type="dxa" w:w="60"/>
-              <w:left w:type="dxa" w:w="90"/>
-              <w:bottom w:type="dxa" w:w="60"/>
-              <w:right w:type="dxa" w:w="90"/>
-            </w:tcMar>
-          </w:tcPr>
-          <w:p>
-            <w:r>
-              <w:rPr>
-                <w:rFonts w:ascii="Calibri" w:cs="Calibri" w:eastAsia="Calibri" w:hAnsi="Calibri"/>
-                <w:b w:val="false"/>
-                <w:bCs w:val="false"/>
-                <w:sz w:val="19"/>
-                <w:szCs w:val="19"/>
-              </w:rPr>
-              <w:t xml:space="preserve">Political/economic/legal → Hofstede table → opportunities</w:t>
-            </w:r>
-          </w:p>
-        </w:tc>
-        <w:tc>
-          <w:tcPr>
-            <w:tcW w:type="dxa" w:w="4138"/>
-            <w:tcBorders>
-              <w:top w:val="single" w:color="999999" w:sz="4"/>
-              <w:left w:val="single" w:color="999999" w:sz="4"/>
-              <w:bottom w:val="single" w:color="999999" w:sz="4"/>
-              <w:right w:val="single" w:color="999999" w:sz="4"/>
-            </w:tcBorders>
-            <w:tcMar>
-              <w:top w:type="dxa" w:w="60"/>
-              <w:left w:type="dxa" w:w="90"/>
-              <w:bottom w:type="dxa" w:w="60"/>
-              <w:right w:type="dxa" w:w="90"/>
-            </w:tcMar>
-          </w:tcPr>
-          <w:p>
-            <w:r>
-              <w:rPr>
-                <w:rFonts w:ascii="Calibri" w:cs="Calibri" w:eastAsia="Calibri" w:hAnsi="Calibri"/>
-                <w:b w:val="false"/>
-                <w:bCs w:val="false"/>
-                <w:sz w:val="19"/>
-                <w:szCs w:val="19"/>
-              </w:rPr>
-              <w:t xml:space="preserve">Organised by distance (Ghemawat’s CAGE): administrative, economic and geographic, cultural; then learning</w:t>
-            </w:r>
-          </w:p>
-        </w:tc>
-      </w:tr>
-      <w:tr>
-        <w:trPr>
-          <w:cantSplit/>
-        </w:trPr>
-        <w:tc>
-          <w:tcPr>
-            <w:tcW w:type="dxa" w:w="2000"/>
-            <w:tcBorders>
-              <w:top w:val="single" w:color="999999" w:sz="4"/>
-              <w:left w:val="single" w:color="999999" w:sz="4"/>
-              <w:bottom w:val="single" w:color="999999" w:sz="4"/>
-              <w:right w:val="single" w:color="999999" w:sz="4"/>
-            </w:tcBorders>
-            <w:tcMar>
-              <w:top w:type="dxa" w:w="60"/>
-              <w:left w:type="dxa" w:w="90"/>
-              <w:bottom w:type="dxa" w:w="60"/>
-              <w:right w:type="dxa" w:w="90"/>
-            </w:tcMar>
-          </w:tcPr>
-          <w:p>
-            <w:r>
-              <w:rPr>
-                <w:rFonts w:ascii="Calibri" w:cs="Calibri" w:eastAsia="Calibri" w:hAnsi="Calibri"/>
-                <w:b w:val="false"/>
-                <w:bCs w:val="false"/>
-                <w:sz w:val="19"/>
-                <w:szCs w:val="19"/>
-              </w:rPr>
-              <w:t xml:space="preserve">Culture handling</w:t>
-            </w:r>
-          </w:p>
-        </w:tc>
-        <w:tc>
-          <w:tcPr>
-            <w:tcW w:type="dxa" w:w="3500"/>
-            <w:tcBorders>
-              <w:top w:val="single" w:color="999999" w:sz="4"/>
-              <w:left w:val="single" w:color="999999" w:sz="4"/>
-              <w:bottom w:val="single" w:color="999999" w:sz="4"/>
-              <w:right w:val="single" w:color="999999" w:sz="4"/>
-            </w:tcBorders>
-            <w:tcMar>
-              <w:top w:type="dxa" w:w="60"/>
-              <w:left w:type="dxa" w:w="90"/>
-              <w:bottom w:type="dxa" w:w="60"/>
-              <w:right w:type="dxa" w:w="90"/>
-            </w:tcMar>
-          </w:tcPr>
-          <w:p>
-            <w:r>
-              <w:rPr>
-                <w:rFonts w:ascii="Calibri" w:cs="Calibri" w:eastAsia="Calibri" w:hAnsi="Calibri"/>
-                <w:b w:val="false"/>
-                <w:bCs w:val="false"/>
-                <w:sz w:val="19"/>
-                <w:szCs w:val="19"/>
-              </w:rPr>
-              <w:t xml:space="preserve">Six scores with consequences</w:t>
-            </w:r>
-          </w:p>
-        </w:tc>
-        <w:tc>
-          <w:tcPr>
-            <w:tcW w:type="dxa" w:w="4138"/>
-            <w:tcBorders>
-              <w:top w:val="single" w:color="999999" w:sz="4"/>
-              <w:left w:val="single" w:color="999999" w:sz="4"/>
-              <w:bottom w:val="single" w:color="999999" w:sz="4"/>
-              <w:right w:val="single" w:color="999999" w:sz="4"/>
-            </w:tcBorders>
-            <w:tcMar>
-              <w:top w:type="dxa" w:w="60"/>
-              <w:left w:type="dxa" w:w="90"/>
-              <w:bottom w:type="dxa" w:w="60"/>
-              <w:right w:type="dxa" w:w="90"/>
-            </w:tcMar>
-          </w:tcPr>
-          <w:p>
-            <w:r>
-              <w:rPr>
-                <w:rFonts w:ascii="Calibri" w:cs="Calibri" w:eastAsia="Calibri" w:hAnsi="Calibri"/>
-                <w:b w:val="false"/>
-                <w:bCs w:val="false"/>
-                <w:sz w:val="19"/>
-                <w:szCs w:val="19"/>
-              </w:rPr>
-              <w:t xml:space="preserve">All six dimensions grouped by management function, with an explicit data-limitation critique (no verified official Nepal scores found)</w:t>
-            </w:r>
-          </w:p>
-        </w:tc>
-      </w:tr>
-      <w:tr>
-        <w:trPr>
-          <w:cantSplit/>
-        </w:trPr>
-        <w:tc>
-          <w:tcPr>
-            <w:tcW w:type="dxa" w:w="2000"/>
-            <w:tcBorders>
-              <w:top w:val="single" w:color="999999" w:sz="4"/>
-              <w:left w:val="single" w:color="999999" w:sz="4"/>
-              <w:bottom w:val="single" w:color="999999" w:sz="4"/>
-              <w:right w:val="single" w:color="999999" w:sz="4"/>
-            </w:tcBorders>
-            <w:tcMar>
-              <w:top w:type="dxa" w:w="60"/>
-              <w:left w:type="dxa" w:w="90"/>
-              <w:bottom w:type="dxa" w:w="60"/>
-              <w:right w:type="dxa" w:w="90"/>
-            </w:tcMar>
-          </w:tcPr>
-          <w:p>
-            <w:r>
-              <w:rPr>
-                <w:rFonts w:ascii="Calibri" w:cs="Calibri" w:eastAsia="Calibri" w:hAnsi="Calibri"/>
-                <w:b w:val="false"/>
-                <w:bCs w:val="false"/>
-                <w:sz w:val="19"/>
-                <w:szCs w:val="19"/>
-              </w:rPr>
-              <w:t xml:space="preserve">Evidence set</w:t>
-            </w:r>
-          </w:p>
-        </w:tc>
-        <w:tc>
-          <w:tcPr>
-            <w:tcW w:type="dxa" w:w="3500"/>
-            <w:tcBorders>
-              <w:top w:val="single" w:color="999999" w:sz="4"/>
-              <w:left w:val="single" w:color="999999" w:sz="4"/>
-              <w:bottom w:val="single" w:color="999999" w:sz="4"/>
-              <w:right w:val="single" w:color="999999" w:sz="4"/>
-            </w:tcBorders>
-            <w:tcMar>
-              <w:top w:type="dxa" w:w="60"/>
-              <w:left w:type="dxa" w:w="90"/>
-              <w:bottom w:type="dxa" w:w="60"/>
-              <w:right w:type="dxa" w:w="90"/>
-            </w:tcMar>
-          </w:tcPr>
-          <w:p>
-            <w:r>
-              <w:rPr>
-                <w:rFonts w:ascii="Calibri" w:cs="Calibri" w:eastAsia="Calibri" w:hAnsi="Calibri"/>
-                <w:b w:val="false"/>
-                <w:bCs w:val="false"/>
-                <w:sz w:val="19"/>
-                <w:szCs w:val="19"/>
-              </w:rPr>
-              <w:t xml:space="preserve">Nigeria CPI, FX, repatriation, Café Neo</w:t>
-            </w:r>
-          </w:p>
-        </w:tc>
-        <w:tc>
-          <w:tcPr>
-            <w:tcW w:type="dxa" w:w="4138"/>
-            <w:tcBorders>
-              <w:top w:val="single" w:color="999999" w:sz="4"/>
-              <w:left w:val="single" w:color="999999" w:sz="4"/>
-              <w:bottom w:val="single" w:color="999999" w:sz="4"/>
-              <w:right w:val="single" w:color="999999" w:sz="4"/>
-            </w:tcBorders>
-            <w:tcMar>
-              <w:top w:type="dxa" w:w="60"/>
-              <w:left w:type="dxa" w:w="90"/>
-              <w:bottom w:type="dxa" w:w="60"/>
-              <w:right w:type="dxa" w:w="90"/>
-            </w:tcMar>
-          </w:tcPr>
-          <w:p>
-            <w:r>
-              <w:rPr>
-                <w:rFonts w:ascii="Calibri" w:cs="Calibri" w:eastAsia="Calibri" w:hAnsi="Calibri"/>
-                <w:b w:val="false"/>
-                <w:bCs w:val="false"/>
-                <w:sz w:val="19"/>
-                <w:szCs w:val="19"/>
-              </w:rPr>
-              <w:t xml:space="preserve">Nepal CPI, 2025–26 political shock, remittances, FITTA, coffee paradox, tourism, Laos licensing precedent</w:t>
-            </w:r>
-          </w:p>
-        </w:tc>
-      </w:tr>
-      <w:tr>
-        <w:trPr>
-          <w:cantSplit/>
-        </w:trPr>
-        <w:tc>
-          <w:tcPr>
-            <w:tcW w:type="dxa" w:w="2000"/>
-            <w:tcBorders>
-              <w:top w:val="single" w:color="999999" w:sz="4"/>
-              <w:left w:val="single" w:color="999999" w:sz="4"/>
-              <w:bottom w:val="single" w:color="999999" w:sz="4"/>
-              <w:right w:val="single" w:color="999999" w:sz="4"/>
-            </w:tcBorders>
-            <w:tcMar>
-              <w:top w:type="dxa" w:w="60"/>
-              <w:left w:type="dxa" w:w="90"/>
-              <w:bottom w:type="dxa" w:w="60"/>
-              <w:right w:type="dxa" w:w="90"/>
-            </w:tcMar>
-          </w:tcPr>
-          <w:p>
-            <w:r>
-              <w:rPr>
-                <w:rFonts w:ascii="Calibri" w:cs="Calibri" w:eastAsia="Calibri" w:hAnsi="Calibri"/>
-                <w:b w:val="false"/>
-                <w:bCs w:val="false"/>
-                <w:sz w:val="19"/>
-                <w:szCs w:val="19"/>
-              </w:rPr>
-              <w:t xml:space="preserve">Reference set</w:t>
-            </w:r>
-          </w:p>
-        </w:tc>
-        <w:tc>
-          <w:tcPr>
-            <w:tcW w:type="dxa" w:w="3500"/>
-            <w:tcBorders>
-              <w:top w:val="single" w:color="999999" w:sz="4"/>
-              <w:left w:val="single" w:color="999999" w:sz="4"/>
-              <w:bottom w:val="single" w:color="999999" w:sz="4"/>
-              <w:right w:val="single" w:color="999999" w:sz="4"/>
-            </w:tcBorders>
-            <w:tcMar>
-              <w:top w:type="dxa" w:w="60"/>
-              <w:left w:type="dxa" w:w="90"/>
-              <w:bottom w:type="dxa" w:w="60"/>
-              <w:right w:type="dxa" w:w="90"/>
-            </w:tcMar>
-          </w:tcPr>
-          <w:p>
-            <w:r>
-              <w:rPr>
-                <w:rFonts w:ascii="Calibri" w:cs="Calibri" w:eastAsia="Calibri" w:hAnsi="Calibri"/>
-                <w:b w:val="false"/>
-                <w:bCs w:val="false"/>
-                <w:sz w:val="19"/>
-                <w:szCs w:val="19"/>
-              </w:rPr>
-              <w:t xml:space="preserve">Barney, Dunning, Scott, Kostova, House, Teece</w:t>
-            </w:r>
-          </w:p>
-        </w:tc>
-        <w:tc>
-          <w:tcPr>
-            <w:tcW w:type="dxa" w:w="4138"/>
-            <w:tcBorders>
-              <w:top w:val="single" w:color="999999" w:sz="4"/>
-              <w:left w:val="single" w:color="999999" w:sz="4"/>
-              <w:bottom w:val="single" w:color="999999" w:sz="4"/>
-              <w:right w:val="single" w:color="999999" w:sz="4"/>
-            </w:tcBorders>
-            <w:tcMar>
-              <w:top w:type="dxa" w:w="60"/>
-              <w:left w:type="dxa" w:w="90"/>
-              <w:bottom w:type="dxa" w:w="60"/>
-              <w:right w:type="dxa" w:w="90"/>
-            </w:tcMar>
-          </w:tcPr>
-          <w:p>
-            <w:r>
-              <w:rPr>
-                <w:rFonts w:ascii="Calibri" w:cs="Calibri" w:eastAsia="Calibri" w:hAnsi="Calibri"/>
-                <w:b w:val="false"/>
-                <w:bCs w:val="false"/>
-                <w:sz w:val="19"/>
-                <w:szCs w:val="19"/>
-              </w:rPr>
-              <w:t xml:space="preserve">North, Peng et al., Rugman and Verbeke, Ghemawat, Kogut, Johanson and Vahlne, Zaheer, Teece, Hofstede et al., plus Nepal sources</w:t>
-            </w:r>
-          </w:p>
-        </w:tc>
-      </w:tr>
-      <w:tr>
-        <w:trPr>
-          <w:cantSplit/>
-        </w:trPr>
-        <w:tc>
-          <w:tcPr>
-            <w:tcW w:type="dxa" w:w="2000"/>
-            <w:tcBorders>
-              <w:top w:val="single" w:color="999999" w:sz="4"/>
-              <w:left w:val="single" w:color="999999" w:sz="4"/>
-              <w:bottom w:val="single" w:color="999999" w:sz="4"/>
-              <w:right w:val="single" w:color="999999" w:sz="4"/>
-            </w:tcBorders>
-            <w:tcMar>
-              <w:top w:type="dxa" w:w="60"/>
-              <w:left w:type="dxa" w:w="90"/>
-              <w:bottom w:type="dxa" w:w="60"/>
-              <w:right w:type="dxa" w:w="90"/>
-            </w:tcMar>
-          </w:tcPr>
-          <w:p>
-            <w:r>
-              <w:rPr>
-                <w:rFonts w:ascii="Calibri" w:cs="Calibri" w:eastAsia="Calibri" w:hAnsi="Calibri"/>
-                <w:b w:val="false"/>
-                <w:bCs w:val="false"/>
-                <w:sz w:val="19"/>
-                <w:szCs w:val="19"/>
-              </w:rPr>
-              <w:t xml:space="preserve">Visuals</w:t>
-            </w:r>
-          </w:p>
-        </w:tc>
-        <w:tc>
-          <w:tcPr>
-            <w:tcW w:type="dxa" w:w="3500"/>
-            <w:tcBorders>
-              <w:top w:val="single" w:color="999999" w:sz="4"/>
-              <w:left w:val="single" w:color="999999" w:sz="4"/>
-              <w:bottom w:val="single" w:color="999999" w:sz="4"/>
-              <w:right w:val="single" w:color="999999" w:sz="4"/>
-            </w:tcBorders>
-            <w:tcMar>
-              <w:top w:type="dxa" w:w="60"/>
-              <w:left w:type="dxa" w:w="90"/>
-              <w:bottom w:type="dxa" w:w="60"/>
-              <w:right w:type="dxa" w:w="90"/>
-            </w:tcMar>
-          </w:tcPr>
-          <w:p>
-            <w:r>
-              <w:rPr>
-                <w:rFonts w:ascii="Calibri" w:cs="Calibri" w:eastAsia="Calibri" w:hAnsi="Calibri"/>
-                <w:b w:val="false"/>
-                <w:bCs w:val="false"/>
-                <w:sz w:val="19"/>
-                <w:szCs w:val="19"/>
-              </w:rPr>
-              <w:t xml:space="preserve">Hofstede bar chart</w:t>
-            </w:r>
-          </w:p>
-        </w:tc>
-        <w:tc>
-          <w:tcPr>
-            <w:tcW w:type="dxa" w:w="4138"/>
-            <w:tcBorders>
-              <w:top w:val="single" w:color="999999" w:sz="4"/>
-              <w:left w:val="single" w:color="999999" w:sz="4"/>
-              <w:bottom w:val="single" w:color="999999" w:sz="4"/>
-              <w:right w:val="single" w:color="999999" w:sz="4"/>
-            </w:tcBorders>
-            <w:tcMar>
-              <w:top w:type="dxa" w:w="60"/>
-              <w:left w:type="dxa" w:w="90"/>
-              <w:bottom w:type="dxa" w:w="60"/>
-              <w:right w:type="dxa" w:w="90"/>
-            </w:tcMar>
-          </w:tcPr>
-          <w:p>
-            <w:r>
-              <w:rPr>
-                <w:rFonts w:ascii="Calibri" w:cs="Calibri" w:eastAsia="Calibri" w:hAnsi="Calibri"/>
-                <w:b w:val="false"/>
-                <w:bCs w:val="false"/>
-                <w:sz w:val="19"/>
-                <w:szCs w:val="19"/>
-              </w:rPr>
-              <w:t xml:space="preserve">Figure 1: Nepal coffee paradox chart; Appendix: stage-gate roadmap (Gantt) with trigger metrics</w:t>
-            </w:r>
-          </w:p>
-        </w:tc>
-      </w:tr>
-    </w:tbl>
-    <w:p>
-      <w:pPr>
-        <w:pStyle w:val="Heading1"/>
-        <w:spacing w:after="120" w:before="300"/>
-      </w:pPr>
-      <w:r>
-        <w:rPr>
-          <w:rFonts w:ascii="Calibri" w:cs="Calibri" w:eastAsia="Calibri" w:hAnsi="Calibri"/>
-          <w:b/>
-          <w:bCs/>
-          <w:color w:val="1F3864"/>
-          <w:sz w:val="30"/>
-          <w:szCs w:val="30"/>
-        </w:rPr>
-        <w:t xml:space="preserve">2. What the rubric rewards (and how this design answers it)</w:t>
+        <w:t xml:space="preserve">1. What the rubric rewards (and how this design answers it)</w:t>
       </w:r>
     </w:p>
     <w:tbl>
@@ -1812,7 +667,7 @@
           <w:sz w:val="30"/>
           <w:szCs w:val="30"/>
         </w:rPr>
-        <w:t xml:space="preserve">3. Country decision and verification</w:t>
+        <w:t xml:space="preserve">2. Country decision and verification</w:t>
       </w:r>
     </w:p>
     <w:p>
@@ -1921,7 +776,7 @@
           <w:sz w:val="30"/>
           <w:szCs w:val="30"/>
         </w:rPr>
-        <w:t xml:space="preserve">4. Thesis and argument architecture</w:t>
+        <w:t xml:space="preserve">3. Thesis and argument architecture</w:t>
       </w:r>
     </w:p>
     <w:p>
@@ -2798,7 +1653,7 @@
                 <w:sz w:val="19"/>
                 <w:szCs w:val="19"/>
               </w:rPr>
-              <w:t xml:space="preserve">Fair; the claim is that a segment (first-time and short-stay visitors, long-haul visitors, airport and hotel-linked trade) values familiarity. Test it with segment evidence (Section 7) and keep the pilot to two stores.</w:t>
+              <w:t xml:space="preserve">Fair; the claim is that a segment (first-time and short-stay visitors, long-haul visitors, airport and hotel-linked trade) values familiarity. Test it with segment evidence (Section 6) and keep the pilot to two stores.</w:t>
             </w:r>
           </w:p>
         </w:tc>
@@ -2881,7 +1736,7 @@
           <w:sz w:val="30"/>
           <w:szCs w:val="30"/>
         </w:rPr>
-        <w:t xml:space="preserve">5. Theory architecture (who does what, and its limit)</w:t>
+        <w:t xml:space="preserve">4. Theory architecture (who does what, and its limit)</w:t>
       </w:r>
     </w:p>
     <w:tbl>
@@ -3769,7 +2624,7 @@
           <w:sz w:val="30"/>
           <w:szCs w:val="30"/>
         </w:rPr>
-        <w:t xml:space="preserve">6. Section plan and word budget (960 + 40 buffer)</w:t>
+        <w:t xml:space="preserve">5. Section plan and word budget (960 + 40 buffer)</w:t>
       </w:r>
     </w:p>
     <w:tbl>
@@ -4648,7 +3503,7 @@
           <w:sz w:val="21"/>
           <w:szCs w:val="21"/>
         </w:rPr>
-        <w:t xml:space="preserve">Tourism perspective (see Section 7): the tourist is a ready-made customer who already knows the brand, which reduces the liability of foreignness (Zaheer, 1995) and lowers marketing cost. Critical limits: average spend is only about $33 a day (down from $40.84), well below regional levels; arrivals are seasonal and volatile (September 2025 fell 18.3% during the protests); and Indian visitors, the largest group, already have access to Starbucks at home (verify).</w:t>
+        <w:t xml:space="preserve">Tourism perspective (see Section 6): the tourist is a ready-made customer who already knows the brand, which reduces the liability of foreignness (Zaheer, 1995) and lowers marketing cost. Critical limits: average spend is only about $33 a day (down from $40.84), well below regional levels; arrivals are seasonal and volatile (September 2025 fell 18.3% during the protests); and Indian visitors, the largest group, already have access to Starbucks at home (verify).</w:t>
       </w:r>
     </w:p>
     <w:p>
@@ -5538,7 +4393,7 @@
           <w:sz w:val="30"/>
           <w:szCs w:val="30"/>
         </w:rPr>
-        <w:t xml:space="preserve">7. Tourism perspective (new integrated pillar)</w:t>
+        <w:t xml:space="preserve">6. Tourism perspective</w:t>
       </w:r>
     </w:p>
     <w:p>
@@ -6997,7 +5852,7 @@
           <w:sz w:val="30"/>
           <w:szCs w:val="30"/>
         </w:rPr>
-        <w:t xml:space="preserve">8. Visuals and appendices</w:t>
+        <w:t xml:space="preserve">7. Visuals and appendices</w:t>
       </w:r>
     </w:p>
     <w:tbl>
@@ -8325,7 +7180,7 @@
           <w:sz w:val="30"/>
           <w:szCs w:val="30"/>
         </w:rPr>
-        <w:t xml:space="preserve">9. Data pack</w:t>
+        <w:t xml:space="preserve">8. Data pack</w:t>
       </w:r>
     </w:p>
     <w:p>
@@ -10802,7 +9657,7 @@
           <w:sz w:val="30"/>
           <w:szCs w:val="30"/>
         </w:rPr>
-        <w:t xml:space="preserve">10. Planned reference set (all to be verified before use)</w:t>
+        <w:t xml:space="preserve">9. Planned reference set (all to be verified before use)</w:t>
       </w:r>
     </w:p>
     <w:p>
@@ -11192,7 +10047,7 @@
           <w:sz w:val="30"/>
           <w:szCs w:val="30"/>
         </w:rPr>
-        <w:t xml:space="preserve">11. Harsh-marker checklist</w:t>
+        <w:t xml:space="preserve">10. Harsh-marker checklist</w:t>
       </w:r>
     </w:p>
     <w:p>
@@ -11511,7 +10366,7 @@
           <w:sz w:val="30"/>
           <w:szCs w:val="30"/>
         </w:rPr>
-        <w:t xml:space="preserve">12. Compliance, working order and AI warning</w:t>
+        <w:t xml:space="preserve">11. Compliance, working order and AI warning</w:t>
       </w:r>
     </w:p>
     <w:p>
@@ -11706,7 +10561,7 @@
           <w:sz w:val="30"/>
           <w:szCs w:val="30"/>
         </w:rPr>
-        <w:t xml:space="preserve">13. Sources used for this blueprint</w:t>
+        <w:t xml:space="preserve">12. Sources used for this blueprint</w:t>
       </w:r>
     </w:p>
     <w:p>
@@ -11718,7 +10573,7 @@
         </w:numPr>
         <w:spacing w:after="40"/>
       </w:pPr>
-      <w:hyperlink w:history="1" r:id="rIdhlrm95mqgyifv7aueej_x">
+      <w:hyperlink w:history="1" r:id="rId7tu2u9auvdtebgq1kwgkx">
         <w:r>
           <w:rPr>
             <w:rStyle w:val="Hyperlink"/>
@@ -11739,7 +10594,7 @@
         </w:numPr>
         <w:spacing w:after="40"/>
       </w:pPr>
-      <w:hyperlink w:history="1" r:id="rIdmdqdche85y91voay8xeew">
+      <w:hyperlink w:history="1" r:id="rIdghhymuux1usanuylte6e4">
         <w:r>
           <w:rPr>
             <w:rStyle w:val="Hyperlink"/>
@@ -11760,7 +10615,7 @@
         </w:numPr>
         <w:spacing w:after="40"/>
       </w:pPr>
-      <w:hyperlink w:history="1" r:id="rIdsjcxnn8k5z99yqtmd-nee">
+      <w:hyperlink w:history="1" r:id="rIdny87tcj9peh8hrdynnzmf">
         <w:r>
           <w:rPr>
             <w:rStyle w:val="Hyperlink"/>
@@ -11781,7 +10636,7 @@
         </w:numPr>
         <w:spacing w:after="40"/>
       </w:pPr>
-      <w:hyperlink w:history="1" r:id="rId8aqh6vcppx1ohtmuvnzqa">
+      <w:hyperlink w:history="1" r:id="rIdxznlgazcoh6vcr_3rbnyw">
         <w:r>
           <w:rPr>
             <w:rStyle w:val="Hyperlink"/>
@@ -11802,7 +10657,7 @@
         </w:numPr>
         <w:spacing w:after="40"/>
       </w:pPr>
-      <w:hyperlink w:history="1" r:id="rId9_hg4a7xnokh8srm6pdo7">
+      <w:hyperlink w:history="1" r:id="rIdipyvobalsnktkpokwplb8">
         <w:r>
           <w:rPr>
             <w:rStyle w:val="Hyperlink"/>
@@ -11823,7 +10678,7 @@
         </w:numPr>
         <w:spacing w:after="40"/>
       </w:pPr>
-      <w:hyperlink w:history="1" r:id="rIdhjznuhsqrzbitsq0ewzsg">
+      <w:hyperlink w:history="1" r:id="rIddemmfakmkokvmaupbfqzw">
         <w:r>
           <w:rPr>
             <w:rStyle w:val="Hyperlink"/>
@@ -11844,7 +10699,7 @@
         </w:numPr>
         <w:spacing w:after="40"/>
       </w:pPr>
-      <w:hyperlink w:history="1" r:id="rIdehd3cfhoqv1wshjqi1gx7">
+      <w:hyperlink w:history="1" r:id="rIdd-1dz44ct71flurq-ogcc">
         <w:r>
           <w:rPr>
             <w:rStyle w:val="Hyperlink"/>
@@ -11865,7 +10720,7 @@
         </w:numPr>
         <w:spacing w:after="40"/>
       </w:pPr>
-      <w:hyperlink w:history="1" r:id="rIdgaomok-dvy3n16mvngerh">
+      <w:hyperlink w:history="1" r:id="rIdsui7dob3i0cuj4xcse4l2">
         <w:r>
           <w:rPr>
             <w:rStyle w:val="Hyperlink"/>
@@ -11886,7 +10741,7 @@
         </w:numPr>
         <w:spacing w:after="40"/>
       </w:pPr>
-      <w:hyperlink w:history="1" r:id="rIdnqlqvr2amzrvublabpivb">
+      <w:hyperlink w:history="1" r:id="rIdvqoqhczemo5mx_e7i7c1t">
         <w:r>
           <w:rPr>
             <w:rStyle w:val="Hyperlink"/>
@@ -11907,7 +10762,7 @@
         </w:numPr>
         <w:spacing w:after="40"/>
       </w:pPr>
-      <w:hyperlink w:history="1" r:id="rIdof1ojpmlo8ucozyovvaww">
+      <w:hyperlink w:history="1" r:id="rIdgkw46hkgg-zlfdo0wtt53">
         <w:r>
           <w:rPr>
             <w:rStyle w:val="Hyperlink"/>
@@ -11928,7 +10783,7 @@
         </w:numPr>
         <w:spacing w:after="40"/>
       </w:pPr>
-      <w:hyperlink w:history="1" r:id="rIdtztbcejpm9q1d4hj0r94t">
+      <w:hyperlink w:history="1" r:id="rId8az0beyra_gu1ocfa27lq">
         <w:r>
           <w:rPr>
             <w:rStyle w:val="Hyperlink"/>
@@ -11949,7 +10804,7 @@
         </w:numPr>
         <w:spacing w:after="40"/>
       </w:pPr>
-      <w:hyperlink w:history="1" r:id="rId646ib_tag6auaihrr6fjm">
+      <w:hyperlink w:history="1" r:id="rIduhpnm0dofecjp7-c0hagh">
         <w:r>
           <w:rPr>
             <w:rStyle w:val="Hyperlink"/>
@@ -11970,7 +10825,7 @@
         </w:numPr>
         <w:spacing w:after="40"/>
       </w:pPr>
-      <w:hyperlink w:history="1" r:id="rId095dwhc-9br_6vr7zdkob">
+      <w:hyperlink w:history="1" r:id="rIdjxmooyzpuuuyvxkkls4xj">
         <w:r>
           <w:rPr>
             <w:rStyle w:val="Hyperlink"/>
@@ -11991,7 +10846,7 @@
         </w:numPr>
         <w:spacing w:after="40"/>
       </w:pPr>
-      <w:hyperlink w:history="1" r:id="rIdoqrxqqfxkjkipsur1pqsa">
+      <w:hyperlink w:history="1" r:id="rIdrqnkohmx6_s9aoxzaovdj">
         <w:r>
           <w:rPr>
             <w:rStyle w:val="Hyperlink"/>
@@ -12012,7 +10867,7 @@
         </w:numPr>
         <w:spacing w:after="40"/>
       </w:pPr>
-      <w:hyperlink w:history="1" r:id="rIdtmzb353snrlhtnc2r9dv2">
+      <w:hyperlink w:history="1" r:id="rIduamqqo7azxiwl7adidre5">
         <w:r>
           <w:rPr>
             <w:rStyle w:val="Hyperlink"/>
@@ -12033,7 +10888,7 @@
         </w:numPr>
         <w:spacing w:after="40"/>
       </w:pPr>
-      <w:hyperlink w:history="1" r:id="rIdodeopcy-xd_pr_xigq36y">
+      <w:hyperlink w:history="1" r:id="rId63pdjpmpsp129wecqvxrm">
         <w:r>
           <w:rPr>
             <w:rStyle w:val="Hyperlink"/>
@@ -12054,7 +10909,7 @@
         </w:numPr>
         <w:spacing w:after="40"/>
       </w:pPr>
-      <w:hyperlink w:history="1" r:id="rIdbze6csssbbgus0dfchwq3">
+      <w:hyperlink w:history="1" r:id="rIdc5udk1xk9fsgg_s9aqtde">
         <w:r>
           <w:rPr>
             <w:rStyle w:val="Hyperlink"/>
@@ -12075,7 +10930,7 @@
         </w:numPr>
         <w:spacing w:after="40"/>
       </w:pPr>
-      <w:hyperlink w:history="1" r:id="rIdzqviof7augysewhipowib">
+      <w:hyperlink w:history="1" r:id="rId8py_vglikipygji1hc5vf">
         <w:r>
           <w:rPr>
             <w:rStyle w:val="Hyperlink"/>
@@ -12096,7 +10951,7 @@
         </w:numPr>
         <w:spacing w:after="40"/>
       </w:pPr>
-      <w:hyperlink w:history="1" r:id="rIdj9uwa8vbcq9x7a1m-dxbp">
+      <w:hyperlink w:history="1" r:id="rId-4lxsfkdevlhfjzbkf2ip">
         <w:r>
           <w:rPr>
             <w:rStyle w:val="Hyperlink"/>
@@ -12117,7 +10972,7 @@
         </w:numPr>
         <w:spacing w:after="40"/>
       </w:pPr>
-      <w:hyperlink w:history="1" r:id="rIdz-dvnpnrurbj4v6hs89oa">
+      <w:hyperlink w:history="1" r:id="rId-y-2ye2-bczbeezk9t_1n">
         <w:r>
           <w:rPr>
             <w:rStyle w:val="Hyperlink"/>

</xml_diff>